<commit_message>
CV Jeniffer Mieres: version final lista para postular
Integra el CV corregido por la postulante y sus respuestas al cuestionario:

- Ferreteria San Francisco: creacion del area desde cero, licencias medicas
  con Caja Los Andes, cargas familiares, reembolsos del seguro complementario
  y atencion en terreno en sucursal (vivienda y salud).
- Bmining: matriz de riesgo y salud en el trabajo con seguimiento por KPI,
  plan anual de capacitaciones y programa de medio ambiente. Termino
  corregido a febrero 2023.
- Fondo Esperanza: orientacion en vivienda articulando redes comunales.
- USACH: evaluacion en sistemas del Ministerio de Educacion y preseleccion.
- Diplomado USACH marcado como en curso; se agregan BUK, SAP y Talana,
  movilizacion propia y licencia clase B.
- Correccion ortografica y unificacion de estilo verbal en todo el documento.

Co-Authored-By: Claude Opus 5 <noreply@anthropic.com>
Claude-Session: https://claude.ai/code/session_01FQzQFNEQJbZhUnuA1Gqnqx
</commit_message>
<xml_diff>
--- a/cv-trabajador-social-uc/CV_Jeniffer_Mieres_Contreras_Trabajadora_Social_UC.docx
+++ b/cv-trabajador-social-uc/CV_Jeniffer_Mieres_Contreras_Trabajadora_Social_UC.docx
@@ -4,7 +4,7 @@
   <w:body>
     <w:p>
       <w:pPr>
-        <w:spacing w:before="0" w:after="20" w:line="252" w:lineRule="auto"/>
+        <w:spacing w:before="0" w:after="20" w:line="247" w:lineRule="auto"/>
       </w:pPr>
       <w:r>
         <w:rPr>
@@ -12,7 +12,7 @@
           <w:b/>
           <w:i w:val="0"/>
           <w:color w:val="1F355E"/>
-          <w:sz w:val="40"/>
+          <w:sz w:val="38"/>
           <w:spacing w:val="8"/>
         </w:rPr>
         <w:t>JENIFFER MIERES CONTRERAS</w:t>
@@ -20,7 +20,7 @@
     </w:p>
     <w:p>
       <w:pPr>
-        <w:spacing w:before="20" w:after="60" w:line="252" w:lineRule="auto"/>
+        <w:spacing w:before="20" w:after="50" w:line="247" w:lineRule="auto"/>
       </w:pPr>
       <w:r>
         <w:rPr>
@@ -28,14 +28,14 @@
           <w:b/>
           <w:i w:val="0"/>
           <w:color w:val="444444"/>
-          <w:sz w:val="22"/>
+          <w:sz w:val="21"/>
         </w:rPr>
         <w:t>Trabajadora Social  |  Bienestar Laboral, Calidad de Vida y Gestión de Beneficios</w:t>
       </w:r>
     </w:p>
     <w:p>
       <w:pPr>
-        <w:spacing w:before="0" w:after="40" w:line="252" w:lineRule="auto"/>
+        <w:spacing w:before="0" w:after="40" w:line="247" w:lineRule="auto"/>
         <w:pBdr>
           <w:bottom w:val="single" w:sz="6" w:space="4" w:color="C9CEDB"/>
         </w:pBdr>
@@ -46,7 +46,7 @@
           <w:b w:val="0"/>
           <w:i w:val="0"/>
           <w:color w:val="5A5A5A"/>
-          <w:sz w:val="19"/>
+          <w:sz w:val="18"/>
         </w:rPr>
         <w:t>+56 9 4903 1682  ·  jeniffer.mieres@gmail.com  ·  El Monte, Región Metropolitana</w:t>
       </w:r>
@@ -54,7 +54,7 @@
     <w:p>
       <w:pPr>
         <w:keepNext/>
-        <w:spacing w:before="200" w:after="90" w:line="252" w:lineRule="auto"/>
+        <w:spacing w:before="180" w:after="80" w:line="247" w:lineRule="auto"/>
         <w:pBdr>
           <w:bottom w:val="single" w:sz="6" w:space="2" w:color="1F355E"/>
         </w:pBdr>
@@ -65,10 +65,45 @@
           <w:b/>
           <w:i w:val="0"/>
           <w:color w:val="1F355E"/>
-          <w:sz w:val="21"/>
+          <w:sz w:val="20"/>
           <w:spacing w:val="30"/>
         </w:rPr>
         <w:t>PERFIL PROFESIONAL</w:t>
+      </w:r>
+    </w:p>
+    <w:p>
+      <w:pPr>
+        <w:spacing w:before="0" w:after="0" w:line="252" w:lineRule="auto"/>
+      </w:pPr>
+      <w:r>
+        <w:rPr>
+          <w:rFonts w:ascii="Calibri" w:hAnsi="Calibri" w:eastAsia="Calibri"/>
+          <w:b w:val="0"/>
+          <w:i w:val="0"/>
+          <w:color w:val="1A1A1A"/>
+          <w:sz w:val="19"/>
+        </w:rPr>
+        <w:t>Trabajadora Social titulada con distinción y más de 9 años de experiencia en bienestar laboral, gestión de beneficios y atención social directa, desarrollada en instituciones de educación superior y en empresa privada. Creé desde cero el Departamento de Bienestar Social de una organización con más de 200 colaboradores, administrando el Seguro Complementario de Salud, las licencias médicas y las cargas familiares de la dotación. Luego lideré la gestión de personas y bienestar en la consultora minera Bmining, a cargo de los programas de bienestar, convenios, plan anual de capacitación, clima laboral y de la matriz de riesgo y salud en el trabajo con seguimiento por KPI. Hoy me desempeño en la Universidad de Santiago de Chile, donde realizo evaluaciones socioeconómicas en los sistemas del Ministerio de Educación, gestiono beneficios ministeriales e internos y acompaño casos que requieren articular áreas internas con redes de apoyo. A la atención directa sumo una mirada de proceso: fui auditora interna del Sistema de Gestión Integrado (ISO 9001, 14001 y 45001). Cursando el Diplomado en Bienestar Organizacional y Estrategias de Diversidad e Inclusión (USACH) y certificada como agente Gatekeeper en prevención del suicidio.</w:t>
+      </w:r>
+    </w:p>
+    <w:p>
+      <w:pPr>
+        <w:keepNext/>
+        <w:spacing w:before="180" w:after="80" w:line="247" w:lineRule="auto"/>
+        <w:pBdr>
+          <w:bottom w:val="single" w:sz="6" w:space="2" w:color="1F355E"/>
+        </w:pBdr>
+      </w:pPr>
+      <w:r>
+        <w:rPr>
+          <w:rFonts w:ascii="Calibri" w:hAnsi="Calibri" w:eastAsia="Calibri"/>
+          <w:b/>
+          <w:i w:val="0"/>
+          <w:color w:val="1F355E"/>
+          <w:sz w:val="20"/>
+          <w:spacing w:val="30"/>
+        </w:rPr>
+        <w:t>ÁREAS DE EXPERTISE</w:t>
       </w:r>
     </w:p>
     <w:p>
@@ -81,15 +116,15 @@
           <w:b w:val="0"/>
           <w:i w:val="0"/>
           <w:color w:val="1A1A1A"/>
-          <w:sz w:val="20"/>
+          <w:sz w:val="18"/>
         </w:rPr>
-        <w:t>Trabajadora Social titulada con distinción y más de 9 años de experiencia continua en bienestar laboral, gestión de beneficios y atención social directa, desarrollada en instituciones de educación superior y en empresa privada. Actualmente en la Universidad de Santiago de Chile, donde realizo evaluaciones socioeconómicas, gestiono beneficios ministeriales e internos y acompaño casos que requieren articular áreas internas con redes de apoyo. Antes lideré la gestión de personas y bienestar en Bmining —programas, convenios, actividades y clima laboral— y encabecé el Departamento de Bienestar Social de una dotación superior a 200 colaboradores, incluida la administración del Seguro Complementario de Salud. A la atención directa sumo una mirada de proceso: fui auditora interna del Sistema de Gestión Integrado (ISO 9001, 14001 y 45001), lo que me permite implementar y evaluar programas con estándares verificables. Diplomada en Bienestar Organizacional y Estrategias de Diversidad e Inclusión (USACH) y certificada como agente Gatekeeper en prevención del suicidio.</w:t>
+        <w:t>Creación, implementación y evaluación de programas de bienestar  ·  Gestión de beneficios internos y externos  ·  Evaluación socioeconómica e informes sociales  ·  Seguro Complementario de Salud  ·  Licencias médicas y cargas familiares  ·  Convenios institucionales y gestión de proveedores  ·  Gestión y seguimiento de casos sociales  ·  Orientación en salud y vivienda  ·  Coordinación de actividades y eventos  ·  Diseño y facilitación de talleres y capacitaciones  ·  Articulación con redes de apoyo  ·  Diversidad e inclusión  ·  Calidad de servicio  ·  Normativa laboral y gestión documental</w:t>
       </w:r>
     </w:p>
     <w:p>
       <w:pPr>
         <w:keepNext/>
-        <w:spacing w:before="200" w:after="90" w:line="252" w:lineRule="auto"/>
+        <w:spacing w:before="180" w:after="80" w:line="247" w:lineRule="auto"/>
         <w:pBdr>
           <w:bottom w:val="single" w:sz="6" w:space="2" w:color="1F355E"/>
         </w:pBdr>
@@ -100,15 +135,63 @@
           <w:b/>
           <w:i w:val="0"/>
           <w:color w:val="1F355E"/>
-          <w:sz w:val="21"/>
+          <w:sz w:val="20"/>
           <w:spacing w:val="30"/>
         </w:rPr>
-        <w:t>ÁREAS DE EXPERTISE</w:t>
+        <w:t>EXPERIENCIA PROFESIONAL</w:t>
       </w:r>
     </w:p>
     <w:p>
       <w:pPr>
-        <w:spacing w:before="0" w:after="0" w:line="262" w:lineRule="auto"/>
+        <w:keepNext/>
+        <w:tabs>
+          <w:tab w:pos="10426" w:val="right"/>
+        </w:tabs>
+        <w:spacing w:before="130" w:after="0" w:line="247" w:lineRule="auto"/>
+      </w:pPr>
+      <w:r>
+        <w:rPr>
+          <w:rFonts w:ascii="Calibri" w:hAnsi="Calibri" w:eastAsia="Calibri"/>
+          <w:b/>
+          <w:i w:val="0"/>
+          <w:color w:val="1F355E"/>
+          <w:sz w:val="20"/>
+        </w:rPr>
+        <w:t>Universidad de Santiago de Chile</w:t>
+      </w:r>
+      <w:r>
+        <w:rPr>
+          <w:rFonts w:ascii="Calibri" w:hAnsi="Calibri" w:eastAsia="Calibri"/>
+          <w:b/>
+          <w:i w:val="0"/>
+          <w:color w:val="5A5A5A"/>
+          <w:sz w:val="18"/>
+        </w:rPr>
+        <w:tab/>
+        <w:t>Agosto 2023 – Actualidad</w:t>
+      </w:r>
+    </w:p>
+    <w:p>
+      <w:pPr>
+        <w:keepNext/>
+        <w:spacing w:before="20" w:after="50" w:line="247" w:lineRule="auto"/>
+      </w:pPr>
+      <w:r>
+        <w:rPr>
+          <w:rFonts w:ascii="Calibri" w:hAnsi="Calibri" w:eastAsia="Calibri"/>
+          <w:b w:val="0"/>
+          <w:i/>
+          <w:color w:val="444444"/>
+          <w:sz w:val="19"/>
+        </w:rPr>
+        <w:t>Trabajadora Social · Departamento de Beneficios Estudiantiles</w:t>
+      </w:r>
+    </w:p>
+    <w:p>
+      <w:pPr>
+        <w:pStyle w:val="ListBullet"/>
+        <w:spacing w:before="0" w:after="30" w:line="247" w:lineRule="auto"/>
+        <w:ind w:left="227" w:hanging="227"/>
       </w:pPr>
       <w:r>
         <w:rPr>
@@ -118,13 +201,881 @@
           <w:color w:val="1A1A1A"/>
           <w:sz w:val="19"/>
         </w:rPr>
-        <w:t>Diseño, implementación y evaluación de programas de bienestar  ·  Gestión de beneficios internos y externos  ·  Evaluación socioeconómica e informes sociales  ·  Seguro Complementario de Salud  ·  Convenios institucionales y gestión de proveedores  ·  Gestión y seguimiento de casos sociales  ·  Orientación y atención de usuarios  ·  Coordinación de actividades y eventos  ·  Diseño y facilitación de talleres y capacitaciones  ·  Articulación con redes de apoyo  ·  Diversidad e inclusión  ·  Calidad de servicio  ·  Normativa laboral y gestión documental</w:t>
+        <w:t xml:space="preserve">Realizo la </w:t>
+      </w:r>
+      <w:r>
+        <w:rPr>
+          <w:rFonts w:ascii="Calibri" w:hAnsi="Calibri" w:eastAsia="Calibri"/>
+          <w:b/>
+          <w:i w:val="0"/>
+          <w:color w:val="1A1A1A"/>
+          <w:sz w:val="19"/>
+        </w:rPr>
+        <w:t>evaluación socioeconómica</w:t>
+      </w:r>
+      <w:r>
+        <w:rPr>
+          <w:rFonts w:ascii="Calibri" w:hAnsi="Calibri" w:eastAsia="Calibri"/>
+          <w:b w:val="0"/>
+          <w:i w:val="0"/>
+          <w:color w:val="1A1A1A"/>
+          <w:sz w:val="19"/>
+        </w:rPr>
+        <w:t xml:space="preserve"> de cada caso, revisando antecedentes y acreditaciones en los sistemas del Ministerio de Educación para definir con autonomía qué apoyo corresponde.</w:t>
+      </w:r>
+    </w:p>
+    <w:p>
+      <w:pPr>
+        <w:pStyle w:val="ListBullet"/>
+        <w:spacing w:before="0" w:after="30" w:line="247" w:lineRule="auto"/>
+        <w:ind w:left="227" w:hanging="227"/>
+      </w:pPr>
+      <w:r>
+        <w:rPr>
+          <w:rFonts w:ascii="Calibri" w:hAnsi="Calibri" w:eastAsia="Calibri"/>
+          <w:b w:val="0"/>
+          <w:i w:val="0"/>
+          <w:color w:val="1A1A1A"/>
+          <w:sz w:val="19"/>
+        </w:rPr>
+        <w:t xml:space="preserve">Gestiono </w:t>
+      </w:r>
+      <w:r>
+        <w:rPr>
+          <w:rFonts w:ascii="Calibri" w:hAnsi="Calibri" w:eastAsia="Calibri"/>
+          <w:b/>
+          <w:i w:val="0"/>
+          <w:color w:val="1A1A1A"/>
+          <w:sz w:val="19"/>
+        </w:rPr>
+        <w:t>beneficios ministeriales e internos</w:t>
+      </w:r>
+      <w:r>
+        <w:rPr>
+          <w:rFonts w:ascii="Calibri" w:hAnsi="Calibri" w:eastAsia="Calibri"/>
+          <w:b w:val="0"/>
+          <w:i w:val="0"/>
+          <w:color w:val="1A1A1A"/>
+          <w:sz w:val="19"/>
+        </w:rPr>
+        <w:t xml:space="preserve"> de principio a fin: verificación de requisitos, preselección, seguimiento y registro documental que permite auditar el caso posteriormente.</w:t>
+      </w:r>
+    </w:p>
+    <w:p>
+      <w:pPr>
+        <w:pStyle w:val="ListBullet"/>
+        <w:spacing w:before="0" w:after="30" w:line="247" w:lineRule="auto"/>
+        <w:ind w:left="227" w:hanging="227"/>
+      </w:pPr>
+      <w:r>
+        <w:rPr>
+          <w:rFonts w:ascii="Calibri" w:hAnsi="Calibri" w:eastAsia="Calibri"/>
+          <w:b w:val="0"/>
+          <w:i w:val="0"/>
+          <w:color w:val="1A1A1A"/>
+          <w:sz w:val="19"/>
+        </w:rPr>
+        <w:t xml:space="preserve">Atiendo al estudiantado de manera permanente y entrego </w:t>
+      </w:r>
+      <w:r>
+        <w:rPr>
+          <w:rFonts w:ascii="Calibri" w:hAnsi="Calibri" w:eastAsia="Calibri"/>
+          <w:b/>
+          <w:i w:val="0"/>
+          <w:color w:val="1A1A1A"/>
+          <w:sz w:val="19"/>
+        </w:rPr>
+        <w:t>orientación social personalizada</w:t>
+      </w:r>
+      <w:r>
+        <w:rPr>
+          <w:rFonts w:ascii="Calibri" w:hAnsi="Calibri" w:eastAsia="Calibri"/>
+          <w:b w:val="0"/>
+          <w:i w:val="0"/>
+          <w:color w:val="1A1A1A"/>
+          <w:sz w:val="19"/>
+        </w:rPr>
+        <w:t>, acompañándolo durante todo el proceso de postulación.</w:t>
+      </w:r>
+    </w:p>
+    <w:p>
+      <w:pPr>
+        <w:pStyle w:val="ListBullet"/>
+        <w:spacing w:before="0" w:after="30" w:line="247" w:lineRule="auto"/>
+        <w:ind w:left="227" w:hanging="227"/>
+      </w:pPr>
+      <w:r>
+        <w:rPr>
+          <w:rFonts w:ascii="Calibri" w:hAnsi="Calibri" w:eastAsia="Calibri"/>
+          <w:b/>
+          <w:i w:val="0"/>
+          <w:color w:val="1A1A1A"/>
+          <w:sz w:val="19"/>
+        </w:rPr>
+        <w:t>Coordino casos complejos</w:t>
+      </w:r>
+      <w:r>
+        <w:rPr>
+          <w:rFonts w:ascii="Calibri" w:hAnsi="Calibri" w:eastAsia="Calibri"/>
+          <w:b w:val="0"/>
+          <w:i w:val="0"/>
+          <w:color w:val="1A1A1A"/>
+          <w:sz w:val="19"/>
+        </w:rPr>
+        <w:t xml:space="preserve"> con áreas internas de la universidad y con redes de apoyo externas cuando la necesidad excede el ámbito académico.</w:t>
+      </w:r>
+    </w:p>
+    <w:p>
+      <w:pPr>
+        <w:pStyle w:val="ListBullet"/>
+        <w:spacing w:before="0" w:after="30" w:line="247" w:lineRule="auto"/>
+        <w:ind w:left="227" w:hanging="227"/>
+      </w:pPr>
+      <w:r>
+        <w:rPr>
+          <w:rFonts w:ascii="Calibri" w:hAnsi="Calibri" w:eastAsia="Calibri"/>
+          <w:b w:val="0"/>
+          <w:i w:val="0"/>
+          <w:color w:val="1A1A1A"/>
+          <w:sz w:val="19"/>
+        </w:rPr>
+        <w:t xml:space="preserve">Elaboro </w:t>
+      </w:r>
+      <w:r>
+        <w:rPr>
+          <w:rFonts w:ascii="Calibri" w:hAnsi="Calibri" w:eastAsia="Calibri"/>
+          <w:b/>
+          <w:i w:val="0"/>
+          <w:color w:val="1A1A1A"/>
+          <w:sz w:val="19"/>
+        </w:rPr>
+        <w:t>informes sociales</w:t>
+      </w:r>
+      <w:r>
+        <w:rPr>
+          <w:rFonts w:ascii="Calibri" w:hAnsi="Calibri" w:eastAsia="Calibri"/>
+          <w:b w:val="0"/>
+          <w:i w:val="0"/>
+          <w:color w:val="1A1A1A"/>
+          <w:sz w:val="19"/>
+        </w:rPr>
+        <w:t xml:space="preserve"> y mantengo la trazabilidad administrativa de la cartera de casos a mi cargo.</w:t>
       </w:r>
     </w:p>
     <w:p>
       <w:pPr>
         <w:keepNext/>
-        <w:spacing w:before="200" w:after="90" w:line="252" w:lineRule="auto"/>
+        <w:tabs>
+          <w:tab w:pos="10426" w:val="right"/>
+        </w:tabs>
+        <w:spacing w:before="130" w:after="0" w:line="247" w:lineRule="auto"/>
+      </w:pPr>
+      <w:r>
+        <w:rPr>
+          <w:rFonts w:ascii="Calibri" w:hAnsi="Calibri" w:eastAsia="Calibri"/>
+          <w:b/>
+          <w:i w:val="0"/>
+          <w:color w:val="1F355E"/>
+          <w:sz w:val="20"/>
+        </w:rPr>
+        <w:t>Bmining · Desarrollo e Innovación para la Minería SpA</w:t>
+      </w:r>
+      <w:r>
+        <w:rPr>
+          <w:rFonts w:ascii="Calibri" w:hAnsi="Calibri" w:eastAsia="Calibri"/>
+          <w:b/>
+          <w:i w:val="0"/>
+          <w:color w:val="5A5A5A"/>
+          <w:sz w:val="18"/>
+        </w:rPr>
+        <w:tab/>
+        <w:t>Octubre 2018 – Febrero 2023</w:t>
+      </w:r>
+    </w:p>
+    <w:p>
+      <w:pPr>
+        <w:keepNext/>
+        <w:spacing w:before="20" w:after="50" w:line="247" w:lineRule="auto"/>
+      </w:pPr>
+      <w:r>
+        <w:rPr>
+          <w:rFonts w:ascii="Calibri" w:hAnsi="Calibri" w:eastAsia="Calibri"/>
+          <w:b w:val="0"/>
+          <w:i/>
+          <w:color w:val="444444"/>
+          <w:sz w:val="19"/>
+        </w:rPr>
+        <w:t>Líder en Gestión de Personas · Consultora para la industria minera</w:t>
+      </w:r>
+    </w:p>
+    <w:p>
+      <w:pPr>
+        <w:pStyle w:val="ListBullet"/>
+        <w:spacing w:before="0" w:after="30" w:line="247" w:lineRule="auto"/>
+        <w:ind w:left="227" w:hanging="227"/>
+      </w:pPr>
+      <w:r>
+        <w:rPr>
+          <w:rFonts w:ascii="Calibri" w:hAnsi="Calibri" w:eastAsia="Calibri"/>
+          <w:b w:val="0"/>
+          <w:i w:val="0"/>
+          <w:color w:val="1A1A1A"/>
+          <w:sz w:val="19"/>
+        </w:rPr>
+        <w:t xml:space="preserve">Estuve a cargo de los </w:t>
+      </w:r>
+      <w:r>
+        <w:rPr>
+          <w:rFonts w:ascii="Calibri" w:hAnsi="Calibri" w:eastAsia="Calibri"/>
+          <w:b/>
+          <w:i w:val="0"/>
+          <w:color w:val="1A1A1A"/>
+          <w:sz w:val="19"/>
+        </w:rPr>
+        <w:t>programas de bienestar y beneficios</w:t>
+      </w:r>
+      <w:r>
+        <w:rPr>
+          <w:rFonts w:ascii="Calibri" w:hAnsi="Calibri" w:eastAsia="Calibri"/>
+          <w:b w:val="0"/>
+          <w:i w:val="0"/>
+          <w:color w:val="1A1A1A"/>
+          <w:sz w:val="19"/>
+        </w:rPr>
+        <w:t xml:space="preserve"> de los colaboradores, desde la definición de la oferta hasta su implementación y seguimiento, con foco en el clima laboral y en el día a día de la empresa.</w:t>
+      </w:r>
+    </w:p>
+    <w:p>
+      <w:pPr>
+        <w:pStyle w:val="ListBullet"/>
+        <w:spacing w:before="0" w:after="30" w:line="247" w:lineRule="auto"/>
+        <w:ind w:left="227" w:hanging="227"/>
+      </w:pPr>
+      <w:r>
+        <w:rPr>
+          <w:rFonts w:ascii="Calibri" w:hAnsi="Calibri" w:eastAsia="Calibri"/>
+          <w:b w:val="0"/>
+          <w:i w:val="0"/>
+          <w:color w:val="1A1A1A"/>
+          <w:sz w:val="19"/>
+        </w:rPr>
+        <w:t xml:space="preserve">Gestioné </w:t>
+      </w:r>
+      <w:r>
+        <w:rPr>
+          <w:rFonts w:ascii="Calibri" w:hAnsi="Calibri" w:eastAsia="Calibri"/>
+          <w:b/>
+          <w:i w:val="0"/>
+          <w:color w:val="1A1A1A"/>
+          <w:sz w:val="19"/>
+        </w:rPr>
+        <w:t>convenios y beneficios orientados a la calidad de vida laboral</w:t>
+      </w:r>
+      <w:r>
+        <w:rPr>
+          <w:rFonts w:ascii="Calibri" w:hAnsi="Calibri" w:eastAsia="Calibri"/>
+          <w:b w:val="0"/>
+          <w:i w:val="0"/>
+          <w:color w:val="1A1A1A"/>
+          <w:sz w:val="19"/>
+        </w:rPr>
+        <w:t>, administrando la relación con instituciones y proveedores externos.</w:t>
+      </w:r>
+    </w:p>
+    <w:p>
+      <w:pPr>
+        <w:pStyle w:val="ListBullet"/>
+        <w:spacing w:before="0" w:after="30" w:line="247" w:lineRule="auto"/>
+        <w:ind w:left="227" w:hanging="227"/>
+      </w:pPr>
+      <w:r>
+        <w:rPr>
+          <w:rFonts w:ascii="Calibri" w:hAnsi="Calibri" w:eastAsia="Calibri"/>
+          <w:b w:val="0"/>
+          <w:i w:val="0"/>
+          <w:color w:val="1A1A1A"/>
+          <w:sz w:val="19"/>
+        </w:rPr>
+        <w:t xml:space="preserve">Estuve a cargo del área de Recursos Humanos en </w:t>
+      </w:r>
+      <w:r>
+        <w:rPr>
+          <w:rFonts w:ascii="Calibri" w:hAnsi="Calibri" w:eastAsia="Calibri"/>
+          <w:b/>
+          <w:i w:val="0"/>
+          <w:color w:val="1A1A1A"/>
+          <w:sz w:val="19"/>
+        </w:rPr>
+        <w:t>selección e inducción</w:t>
+      </w:r>
+      <w:r>
+        <w:rPr>
+          <w:rFonts w:ascii="Calibri" w:hAnsi="Calibri" w:eastAsia="Calibri"/>
+          <w:b w:val="0"/>
+          <w:i w:val="0"/>
+          <w:color w:val="1A1A1A"/>
+          <w:sz w:val="19"/>
+        </w:rPr>
+        <w:t>, y lideré el plan anual de capacitaciones internas.</w:t>
+      </w:r>
+    </w:p>
+    <w:p>
+      <w:pPr>
+        <w:pStyle w:val="ListBullet"/>
+        <w:spacing w:before="0" w:after="30" w:line="247" w:lineRule="auto"/>
+        <w:ind w:left="227" w:hanging="227"/>
+      </w:pPr>
+      <w:r>
+        <w:rPr>
+          <w:rFonts w:ascii="Calibri" w:hAnsi="Calibri" w:eastAsia="Calibri"/>
+          <w:b w:val="0"/>
+          <w:i w:val="0"/>
+          <w:color w:val="1A1A1A"/>
+          <w:sz w:val="19"/>
+        </w:rPr>
+        <w:t xml:space="preserve">Tuve a cargo la </w:t>
+      </w:r>
+      <w:r>
+        <w:rPr>
+          <w:rFonts w:ascii="Calibri" w:hAnsi="Calibri" w:eastAsia="Calibri"/>
+          <w:b/>
+          <w:i w:val="0"/>
+          <w:color w:val="1A1A1A"/>
+          <w:sz w:val="19"/>
+        </w:rPr>
+        <w:t>matriz de riesgo y salud en el trabajo</w:t>
+      </w:r>
+      <w:r>
+        <w:rPr>
+          <w:rFonts w:ascii="Calibri" w:hAnsi="Calibri" w:eastAsia="Calibri"/>
+          <w:b w:val="0"/>
+          <w:i w:val="0"/>
+          <w:color w:val="1A1A1A"/>
+          <w:sz w:val="19"/>
+        </w:rPr>
+        <w:t xml:space="preserve"> junto al prevencionista externo, con seguimiento por KPI para dar cumplimiento a la certificación.</w:t>
+      </w:r>
+    </w:p>
+    <w:p>
+      <w:pPr>
+        <w:pStyle w:val="ListBullet"/>
+        <w:spacing w:before="0" w:after="30" w:line="247" w:lineRule="auto"/>
+        <w:ind w:left="227" w:hanging="227"/>
+      </w:pPr>
+      <w:r>
+        <w:rPr>
+          <w:rFonts w:ascii="Calibri" w:hAnsi="Calibri" w:eastAsia="Calibri"/>
+          <w:b w:val="0"/>
+          <w:i w:val="0"/>
+          <w:color w:val="1A1A1A"/>
+          <w:sz w:val="19"/>
+        </w:rPr>
+        <w:t xml:space="preserve">Impulsé el </w:t>
+      </w:r>
+      <w:r>
+        <w:rPr>
+          <w:rFonts w:ascii="Calibri" w:hAnsi="Calibri" w:eastAsia="Calibri"/>
+          <w:b/>
+          <w:i w:val="0"/>
+          <w:color w:val="1A1A1A"/>
+          <w:sz w:val="19"/>
+        </w:rPr>
+        <w:t>programa de cuidado del medio ambiente</w:t>
+      </w:r>
+      <w:r>
+        <w:rPr>
+          <w:rFonts w:ascii="Calibri" w:hAnsi="Calibri" w:eastAsia="Calibri"/>
+          <w:b w:val="0"/>
+          <w:i w:val="0"/>
+          <w:color w:val="1A1A1A"/>
+          <w:sz w:val="19"/>
+        </w:rPr>
+        <w:t xml:space="preserve"> con actividades semanales y seguimiento, con participación de toda la organización desde la gerencia general en adelante.</w:t>
+      </w:r>
+    </w:p>
+    <w:p>
+      <w:pPr>
+        <w:pStyle w:val="ListBullet"/>
+        <w:spacing w:before="0" w:after="30" w:line="247" w:lineRule="auto"/>
+        <w:ind w:left="227" w:hanging="227"/>
+      </w:pPr>
+      <w:r>
+        <w:rPr>
+          <w:rFonts w:ascii="Calibri" w:hAnsi="Calibri" w:eastAsia="Calibri"/>
+          <w:b w:val="0"/>
+          <w:i w:val="0"/>
+          <w:color w:val="1A1A1A"/>
+          <w:sz w:val="19"/>
+        </w:rPr>
+        <w:t xml:space="preserve">Organicé </w:t>
+      </w:r>
+      <w:r>
+        <w:rPr>
+          <w:rFonts w:ascii="Calibri" w:hAnsi="Calibri" w:eastAsia="Calibri"/>
+          <w:b/>
+          <w:i w:val="0"/>
+          <w:color w:val="1A1A1A"/>
+          <w:sz w:val="19"/>
+        </w:rPr>
+        <w:t>actividades corporativas de bienestar e integración</w:t>
+      </w:r>
+      <w:r>
+        <w:rPr>
+          <w:rFonts w:ascii="Calibri" w:hAnsi="Calibri" w:eastAsia="Calibri"/>
+          <w:b w:val="0"/>
+          <w:i w:val="0"/>
+          <w:color w:val="1A1A1A"/>
+          <w:sz w:val="19"/>
+        </w:rPr>
+        <w:t>, articulando a las distintas áreas para asegurar convocatoria y buena ejecución.</w:t>
+      </w:r>
+    </w:p>
+    <w:p>
+      <w:pPr>
+        <w:pStyle w:val="ListBullet"/>
+        <w:spacing w:before="0" w:after="30" w:line="247" w:lineRule="auto"/>
+        <w:ind w:left="227" w:hanging="227"/>
+      </w:pPr>
+      <w:r>
+        <w:rPr>
+          <w:rFonts w:ascii="Calibri" w:hAnsi="Calibri" w:eastAsia="Calibri"/>
+          <w:b w:val="0"/>
+          <w:i w:val="0"/>
+          <w:color w:val="1A1A1A"/>
+          <w:sz w:val="19"/>
+        </w:rPr>
+        <w:t xml:space="preserve">Asumí durante un año el </w:t>
+      </w:r>
+      <w:r>
+        <w:rPr>
+          <w:rFonts w:ascii="Calibri" w:hAnsi="Calibri" w:eastAsia="Calibri"/>
+          <w:b/>
+          <w:i w:val="0"/>
+          <w:color w:val="1A1A1A"/>
+          <w:sz w:val="19"/>
+        </w:rPr>
+        <w:t>Sistema de Gestión Integrado como auditora interna</w:t>
+      </w:r>
+      <w:r>
+        <w:rPr>
+          <w:rFonts w:ascii="Calibri" w:hAnsi="Calibri" w:eastAsia="Calibri"/>
+          <w:b w:val="0"/>
+          <w:i w:val="0"/>
+          <w:color w:val="1A1A1A"/>
+          <w:sz w:val="19"/>
+        </w:rPr>
+        <w:t xml:space="preserve"> en las certificaciones ISO 9001:2015 (Calidad), ISO 14001:2015 (Medio Ambiente) e ISO 45001:2018 (Seguridad y Salud en el Trabajo).</w:t>
+      </w:r>
+    </w:p>
+    <w:p>
+      <w:pPr>
+        <w:keepNext/>
+        <w:tabs>
+          <w:tab w:pos="10426" w:val="right"/>
+        </w:tabs>
+        <w:spacing w:before="130" w:after="0" w:line="247" w:lineRule="auto"/>
+      </w:pPr>
+      <w:r>
+        <w:rPr>
+          <w:rFonts w:ascii="Calibri" w:hAnsi="Calibri" w:eastAsia="Calibri"/>
+          <w:b/>
+          <w:i w:val="0"/>
+          <w:color w:val="1F355E"/>
+          <w:sz w:val="20"/>
+        </w:rPr>
+        <w:t>Fundación Fondo Esperanza</w:t>
+      </w:r>
+      <w:r>
+        <w:rPr>
+          <w:rFonts w:ascii="Calibri" w:hAnsi="Calibri" w:eastAsia="Calibri"/>
+          <w:b/>
+          <w:i w:val="0"/>
+          <w:color w:val="5A5A5A"/>
+          <w:sz w:val="18"/>
+        </w:rPr>
+        <w:tab/>
+        <w:t>Octubre 2017 – Septiembre 2018</w:t>
+      </w:r>
+    </w:p>
+    <w:p>
+      <w:pPr>
+        <w:keepNext/>
+        <w:spacing w:before="20" w:after="50" w:line="247" w:lineRule="auto"/>
+      </w:pPr>
+      <w:r>
+        <w:rPr>
+          <w:rFonts w:ascii="Calibri" w:hAnsi="Calibri" w:eastAsia="Calibri"/>
+          <w:b w:val="0"/>
+          <w:i/>
+          <w:color w:val="444444"/>
+          <w:sz w:val="19"/>
+        </w:rPr>
+        <w:t>Monitora · Grupo Emprendedores</w:t>
+      </w:r>
+    </w:p>
+    <w:p>
+      <w:pPr>
+        <w:pStyle w:val="ListBullet"/>
+        <w:spacing w:before="0" w:after="30" w:line="247" w:lineRule="auto"/>
+        <w:ind w:left="227" w:hanging="227"/>
+      </w:pPr>
+      <w:r>
+        <w:rPr>
+          <w:rFonts w:ascii="Calibri" w:hAnsi="Calibri" w:eastAsia="Calibri"/>
+          <w:b w:val="0"/>
+          <w:i w:val="0"/>
+          <w:color w:val="1A1A1A"/>
+          <w:sz w:val="19"/>
+        </w:rPr>
+        <w:t xml:space="preserve">Diseñé y dicté </w:t>
+      </w:r>
+      <w:r>
+        <w:rPr>
+          <w:rFonts w:ascii="Calibri" w:hAnsi="Calibri" w:eastAsia="Calibri"/>
+          <w:b/>
+          <w:i w:val="0"/>
+          <w:color w:val="1A1A1A"/>
+          <w:sz w:val="19"/>
+        </w:rPr>
+        <w:t>capacitaciones</w:t>
+      </w:r>
+      <w:r>
+        <w:rPr>
+          <w:rFonts w:ascii="Calibri" w:hAnsi="Calibri" w:eastAsia="Calibri"/>
+          <w:b w:val="0"/>
+          <w:i w:val="0"/>
+          <w:color w:val="1A1A1A"/>
+          <w:sz w:val="19"/>
+        </w:rPr>
+        <w:t xml:space="preserve"> para emprendedores que estaban partiendo o buscando hacer crecer su negocio, con metodologías prácticas y grupales.</w:t>
+      </w:r>
+    </w:p>
+    <w:p>
+      <w:pPr>
+        <w:pStyle w:val="ListBullet"/>
+        <w:spacing w:before="0" w:after="30" w:line="247" w:lineRule="auto"/>
+        <w:ind w:left="227" w:hanging="227"/>
+      </w:pPr>
+      <w:r>
+        <w:rPr>
+          <w:rFonts w:ascii="Calibri" w:hAnsi="Calibri" w:eastAsia="Calibri"/>
+          <w:b/>
+          <w:i w:val="0"/>
+          <w:color w:val="1A1A1A"/>
+          <w:sz w:val="19"/>
+        </w:rPr>
+        <w:t>Acompañé la gestión de sus proyectos</w:t>
+      </w:r>
+      <w:r>
+        <w:rPr>
+          <w:rFonts w:ascii="Calibri" w:hAnsi="Calibri" w:eastAsia="Calibri"/>
+          <w:b w:val="0"/>
+          <w:i w:val="0"/>
+          <w:color w:val="1A1A1A"/>
+          <w:sz w:val="19"/>
+        </w:rPr>
+        <w:t>, revisando con cada participante qué reforzar para alcanzar sus objetivos.</w:t>
+      </w:r>
+    </w:p>
+    <w:p>
+      <w:pPr>
+        <w:pStyle w:val="ListBullet"/>
+        <w:spacing w:before="0" w:after="30" w:line="247" w:lineRule="auto"/>
+        <w:ind w:left="227" w:hanging="227"/>
+      </w:pPr>
+      <w:r>
+        <w:rPr>
+          <w:rFonts w:ascii="Calibri" w:hAnsi="Calibri" w:eastAsia="Calibri"/>
+          <w:b w:val="0"/>
+          <w:i w:val="0"/>
+          <w:color w:val="1A1A1A"/>
+          <w:sz w:val="19"/>
+        </w:rPr>
+        <w:t xml:space="preserve">Orienté a los emprendedores en materia de </w:t>
+      </w:r>
+      <w:r>
+        <w:rPr>
+          <w:rFonts w:ascii="Calibri" w:hAnsi="Calibri" w:eastAsia="Calibri"/>
+          <w:b/>
+          <w:i w:val="0"/>
+          <w:color w:val="1A1A1A"/>
+          <w:sz w:val="19"/>
+        </w:rPr>
+        <w:t>vivienda</w:t>
+      </w:r>
+      <w:r>
+        <w:rPr>
+          <w:rFonts w:ascii="Calibri" w:hAnsi="Calibri" w:eastAsia="Calibri"/>
+          <w:b w:val="0"/>
+          <w:i w:val="0"/>
+          <w:color w:val="1A1A1A"/>
+          <w:sz w:val="19"/>
+        </w:rPr>
+        <w:t>, articulando con las redes de la comuna, y los vinculé con recursos disponibles que muchas veces no sabían que tenían a su alcance.</w:t>
+      </w:r>
+    </w:p>
+    <w:p>
+      <w:pPr>
+        <w:keepNext/>
+        <w:tabs>
+          <w:tab w:pos="10426" w:val="right"/>
+        </w:tabs>
+        <w:spacing w:before="130" w:after="0" w:line="247" w:lineRule="auto"/>
+      </w:pPr>
+      <w:r>
+        <w:rPr>
+          <w:rFonts w:ascii="Calibri" w:hAnsi="Calibri" w:eastAsia="Calibri"/>
+          <w:b/>
+          <w:i w:val="0"/>
+          <w:color w:val="1F355E"/>
+          <w:sz w:val="20"/>
+        </w:rPr>
+        <w:t>Ferretería San Francisco</w:t>
+      </w:r>
+      <w:r>
+        <w:rPr>
+          <w:rFonts w:ascii="Calibri" w:hAnsi="Calibri" w:eastAsia="Calibri"/>
+          <w:b/>
+          <w:i w:val="0"/>
+          <w:color w:val="5A5A5A"/>
+          <w:sz w:val="18"/>
+        </w:rPr>
+        <w:tab/>
+        <w:t>Diciembre 2016 – Septiembre 2017</w:t>
+      </w:r>
+    </w:p>
+    <w:p>
+      <w:pPr>
+        <w:keepNext/>
+        <w:spacing w:before="20" w:after="50" w:line="247" w:lineRule="auto"/>
+      </w:pPr>
+      <w:r>
+        <w:rPr>
+          <w:rFonts w:ascii="Calibri" w:hAnsi="Calibri" w:eastAsia="Calibri"/>
+          <w:b w:val="0"/>
+          <w:i/>
+          <w:color w:val="444444"/>
+          <w:sz w:val="19"/>
+        </w:rPr>
+        <w:t>Encargada · Departamento de Bienestar Social</w:t>
+      </w:r>
+    </w:p>
+    <w:p>
+      <w:pPr>
+        <w:pStyle w:val="ListBullet"/>
+        <w:spacing w:before="0" w:after="30" w:line="247" w:lineRule="auto"/>
+        <w:ind w:left="227" w:hanging="227"/>
+      </w:pPr>
+      <w:r>
+        <w:rPr>
+          <w:rFonts w:ascii="Calibri" w:hAnsi="Calibri" w:eastAsia="Calibri"/>
+          <w:b/>
+          <w:i w:val="0"/>
+          <w:color w:val="1A1A1A"/>
+          <w:sz w:val="19"/>
+        </w:rPr>
+        <w:t>Creé desde cero el área de Bienestar Social</w:t>
+      </w:r>
+      <w:r>
+        <w:rPr>
+          <w:rFonts w:ascii="Calibri" w:hAnsi="Calibri" w:eastAsia="Calibri"/>
+          <w:b w:val="0"/>
+          <w:i w:val="0"/>
+          <w:color w:val="1A1A1A"/>
+          <w:sz w:val="19"/>
+        </w:rPr>
+        <w:t xml:space="preserve"> para una dotación de más de 200 colaboradores, definiendo la planificación de actividades y beneficios.</w:t>
+      </w:r>
+    </w:p>
+    <w:p>
+      <w:pPr>
+        <w:pStyle w:val="ListBullet"/>
+        <w:spacing w:before="0" w:after="30" w:line="247" w:lineRule="auto"/>
+        <w:ind w:left="227" w:hanging="227"/>
+      </w:pPr>
+      <w:r>
+        <w:rPr>
+          <w:rFonts w:ascii="Calibri" w:hAnsi="Calibri" w:eastAsia="Calibri"/>
+          <w:b w:val="0"/>
+          <w:i w:val="0"/>
+          <w:color w:val="1A1A1A"/>
+          <w:sz w:val="19"/>
+        </w:rPr>
+        <w:t xml:space="preserve">Administré el </w:t>
+      </w:r>
+      <w:r>
+        <w:rPr>
+          <w:rFonts w:ascii="Calibri" w:hAnsi="Calibri" w:eastAsia="Calibri"/>
+          <w:b/>
+          <w:i w:val="0"/>
+          <w:color w:val="1A1A1A"/>
+          <w:sz w:val="19"/>
+        </w:rPr>
+        <w:t>Seguro Complementario de Salud</w:t>
+      </w:r>
+      <w:r>
+        <w:rPr>
+          <w:rFonts w:ascii="Calibri" w:hAnsi="Calibri" w:eastAsia="Calibri"/>
+          <w:b w:val="0"/>
+          <w:i w:val="0"/>
+          <w:color w:val="1A1A1A"/>
+          <w:sz w:val="19"/>
+        </w:rPr>
+        <w:t xml:space="preserve"> de la dotación, apoyando a los trabajadores en el acceso, uso y tramitación de reembolsos.</w:t>
+      </w:r>
+    </w:p>
+    <w:p>
+      <w:pPr>
+        <w:pStyle w:val="ListBullet"/>
+        <w:spacing w:before="0" w:after="30" w:line="247" w:lineRule="auto"/>
+        <w:ind w:left="227" w:hanging="227"/>
+      </w:pPr>
+      <w:r>
+        <w:rPr>
+          <w:rFonts w:ascii="Calibri" w:hAnsi="Calibri" w:eastAsia="Calibri"/>
+          <w:b w:val="0"/>
+          <w:i w:val="0"/>
+          <w:color w:val="1A1A1A"/>
+          <w:sz w:val="19"/>
+        </w:rPr>
+        <w:t xml:space="preserve">Gestioné </w:t>
+      </w:r>
+      <w:r>
+        <w:rPr>
+          <w:rFonts w:ascii="Calibri" w:hAnsi="Calibri" w:eastAsia="Calibri"/>
+          <w:b/>
+          <w:i w:val="0"/>
+          <w:color w:val="1A1A1A"/>
+          <w:sz w:val="19"/>
+        </w:rPr>
+        <w:t>licencias médicas ante la Caja de Compensación Los Andes</w:t>
+      </w:r>
+      <w:r>
+        <w:rPr>
+          <w:rFonts w:ascii="Calibri" w:hAnsi="Calibri" w:eastAsia="Calibri"/>
+          <w:b w:val="0"/>
+          <w:i w:val="0"/>
+          <w:color w:val="1A1A1A"/>
+          <w:sz w:val="19"/>
+        </w:rPr>
+        <w:t xml:space="preserve"> y la incorporación de cargas familiares de los trabajadores.</w:t>
+      </w:r>
+    </w:p>
+    <w:p>
+      <w:pPr>
+        <w:pStyle w:val="ListBullet"/>
+        <w:spacing w:before="0" w:after="30" w:line="247" w:lineRule="auto"/>
+        <w:ind w:left="227" w:hanging="227"/>
+      </w:pPr>
+      <w:r>
+        <w:rPr>
+          <w:rFonts w:ascii="Calibri" w:hAnsi="Calibri" w:eastAsia="Calibri"/>
+          <w:b w:val="0"/>
+          <w:i w:val="0"/>
+          <w:color w:val="1A1A1A"/>
+          <w:sz w:val="19"/>
+        </w:rPr>
+        <w:t xml:space="preserve">Realicé </w:t>
+      </w:r>
+      <w:r>
+        <w:rPr>
+          <w:rFonts w:ascii="Calibri" w:hAnsi="Calibri" w:eastAsia="Calibri"/>
+          <w:b/>
+          <w:i w:val="0"/>
+          <w:color w:val="1A1A1A"/>
+          <w:sz w:val="19"/>
+        </w:rPr>
+        <w:t>visitas semanales a la segunda sucursal</w:t>
+      </w:r>
+      <w:r>
+        <w:rPr>
+          <w:rFonts w:ascii="Calibri" w:hAnsi="Calibri" w:eastAsia="Calibri"/>
+          <w:b w:val="0"/>
+          <w:i w:val="0"/>
+          <w:color w:val="1A1A1A"/>
+          <w:sz w:val="19"/>
+        </w:rPr>
+        <w:t>, atendiendo en terreno las necesidades de beneficios internos y externos, principalmente en vivienda y salud.</w:t>
+      </w:r>
+    </w:p>
+    <w:p>
+      <w:pPr>
+        <w:pStyle w:val="ListBullet"/>
+        <w:spacing w:before="0" w:after="30" w:line="247" w:lineRule="auto"/>
+        <w:ind w:left="227" w:hanging="227"/>
+      </w:pPr>
+      <w:r>
+        <w:rPr>
+          <w:rFonts w:ascii="Calibri" w:hAnsi="Calibri" w:eastAsia="Calibri"/>
+          <w:b w:val="0"/>
+          <w:i w:val="0"/>
+          <w:color w:val="1A1A1A"/>
+          <w:sz w:val="19"/>
+        </w:rPr>
+        <w:t xml:space="preserve">Gestioné </w:t>
+      </w:r>
+      <w:r>
+        <w:rPr>
+          <w:rFonts w:ascii="Calibri" w:hAnsi="Calibri" w:eastAsia="Calibri"/>
+          <w:b/>
+          <w:i w:val="0"/>
+          <w:color w:val="1A1A1A"/>
+          <w:sz w:val="19"/>
+        </w:rPr>
+        <w:t>convenios con instituciones externas</w:t>
+      </w:r>
+      <w:r>
+        <w:rPr>
+          <w:rFonts w:ascii="Calibri" w:hAnsi="Calibri" w:eastAsia="Calibri"/>
+          <w:b w:val="0"/>
+          <w:i w:val="0"/>
+          <w:color w:val="1A1A1A"/>
+          <w:sz w:val="19"/>
+        </w:rPr>
+        <w:t xml:space="preserve"> para mejorar la calidad de vida en el trabajo.</w:t>
+      </w:r>
+    </w:p>
+    <w:p>
+      <w:pPr>
+        <w:pStyle w:val="ListBullet"/>
+        <w:spacing w:before="0" w:after="30" w:line="247" w:lineRule="auto"/>
+        <w:ind w:left="227" w:hanging="227"/>
+      </w:pPr>
+      <w:r>
+        <w:rPr>
+          <w:rFonts w:ascii="Calibri" w:hAnsi="Calibri" w:eastAsia="Calibri"/>
+          <w:b w:val="0"/>
+          <w:i w:val="0"/>
+          <w:color w:val="1A1A1A"/>
+          <w:sz w:val="19"/>
+        </w:rPr>
+        <w:t xml:space="preserve">Administré vacaciones, carpetas personales y documentación laboral, y apoyé los </w:t>
+      </w:r>
+      <w:r>
+        <w:rPr>
+          <w:rFonts w:ascii="Calibri" w:hAnsi="Calibri" w:eastAsia="Calibri"/>
+          <w:b/>
+          <w:i w:val="0"/>
+          <w:color w:val="1A1A1A"/>
+          <w:sz w:val="19"/>
+        </w:rPr>
+        <w:t>procesos administrativos de Recursos Humanos</w:t>
+      </w:r>
+      <w:r>
+        <w:rPr>
+          <w:rFonts w:ascii="Calibri" w:hAnsi="Calibri" w:eastAsia="Calibri"/>
+          <w:b w:val="0"/>
+          <w:i w:val="0"/>
+          <w:color w:val="1A1A1A"/>
+          <w:sz w:val="19"/>
+        </w:rPr>
+        <w:t>.</w:t>
+      </w:r>
+    </w:p>
+    <w:p>
+      <w:pPr>
+        <w:keepNext/>
+        <w:spacing w:before="180" w:after="80" w:line="247" w:lineRule="auto"/>
         <w:pBdr>
           <w:bottom w:val="single" w:sz="6" w:space="2" w:color="1F355E"/>
         </w:pBdr>
@@ -135,29 +1086,29 @@
           <w:b/>
           <w:i w:val="0"/>
           <w:color w:val="1F355E"/>
-          <w:sz w:val="21"/>
+          <w:sz w:val="20"/>
           <w:spacing w:val="30"/>
         </w:rPr>
-        <w:t>EXPERIENCIA PROFESIONAL</w:t>
+        <w:t>FORMACIÓN ACADÉMICA</w:t>
       </w:r>
     </w:p>
     <w:p>
       <w:pPr>
         <w:keepNext/>
         <w:tabs>
-          <w:tab w:pos="10312" w:val="right"/>
+          <w:tab w:pos="10426" w:val="right"/>
         </w:tabs>
-        <w:spacing w:before="150" w:after="0" w:line="252" w:lineRule="auto"/>
+        <w:spacing w:before="60" w:after="0" w:line="247" w:lineRule="auto"/>
       </w:pPr>
       <w:r>
         <w:rPr>
           <w:rFonts w:ascii="Calibri" w:hAnsi="Calibri" w:eastAsia="Calibri"/>
           <w:b/>
           <w:i w:val="0"/>
-          <w:color w:val="1F355E"/>
-          <w:sz w:val="21"/>
+          <w:color w:val="1A1A1A"/>
+          <w:sz w:val="19"/>
         </w:rPr>
-        <w:t>Universidad de Santiago de Chile</w:t>
+        <w:t>Diplomado en Bienestar Organizacional y Estrategias de Diversidad e Inclusión</w:t>
       </w:r>
       <w:r>
         <w:rPr>
@@ -165,16 +1116,15 @@
           <w:b/>
           <w:i w:val="0"/>
           <w:color w:val="5A5A5A"/>
-          <w:sz w:val="19"/>
+          <w:sz w:val="18"/>
         </w:rPr>
         <w:tab/>
-        <w:t>Agosto 2023 – Presente</w:t>
+        <w:t>En curso</w:t>
       </w:r>
     </w:p>
     <w:p>
       <w:pPr>
-        <w:keepNext/>
-        <w:spacing w:before="20" w:after="60" w:line="252" w:lineRule="auto"/>
+        <w:spacing w:before="10" w:after="0" w:line="247" w:lineRule="auto"/>
       </w:pPr>
       <w:r>
         <w:rPr>
@@ -182,127 +1132,18 @@
           <w:b w:val="0"/>
           <w:i/>
           <w:color w:val="444444"/>
-          <w:sz w:val="20"/>
+          <w:sz w:val="18"/>
         </w:rPr>
-        <w:t>Trabajadora Social · Departamento de Beneficios Estudiantiles</w:t>
+        <w:t>Universidad de Santiago de Chile</w:t>
       </w:r>
     </w:p>
     <w:p>
       <w:pPr>
-        <w:pStyle w:val="ListBullet"/>
-        <w:spacing w:before="0" w:after="40" w:line="252" w:lineRule="auto"/>
-        <w:ind w:left="238" w:hanging="238"/>
-      </w:pPr>
-      <w:r>
-        <w:rPr>
-          <w:rFonts w:ascii="Calibri" w:hAnsi="Calibri" w:eastAsia="Calibri"/>
-          <w:b w:val="0"/>
-          <w:i w:val="0"/>
-          <w:color w:val="1A1A1A"/>
-          <w:sz w:val="20"/>
-        </w:rPr>
-        <w:t xml:space="preserve">Realizo la </w:t>
-      </w:r>
-      <w:r>
-        <w:rPr>
-          <w:rFonts w:ascii="Calibri" w:hAnsi="Calibri" w:eastAsia="Calibri"/>
-          <w:b/>
-          <w:i w:val="0"/>
-          <w:color w:val="1A1A1A"/>
-          <w:sz w:val="20"/>
-        </w:rPr>
-        <w:t>evaluación socioeconómica</w:t>
-      </w:r>
-      <w:r>
-        <w:rPr>
-          <w:rFonts w:ascii="Calibri" w:hAnsi="Calibri" w:eastAsia="Calibri"/>
-          <w:b w:val="0"/>
-          <w:i w:val="0"/>
-          <w:color w:val="1A1A1A"/>
-          <w:sz w:val="20"/>
-        </w:rPr>
-        <w:t xml:space="preserve"> de cada caso —revisión de antecedentes y acreditaciones— para definir con autonomía qué apoyo corresponde, aplicando la normativa vigente.</w:t>
-      </w:r>
-    </w:p>
-    <w:p>
-      <w:pPr>
-        <w:pStyle w:val="ListBullet"/>
-        <w:spacing w:before="0" w:after="40" w:line="252" w:lineRule="auto"/>
-        <w:ind w:left="238" w:hanging="238"/>
-      </w:pPr>
-      <w:r>
-        <w:rPr>
-          <w:rFonts w:ascii="Calibri" w:hAnsi="Calibri" w:eastAsia="Calibri"/>
-          <w:b w:val="0"/>
-          <w:i w:val="0"/>
-          <w:color w:val="1A1A1A"/>
-          <w:sz w:val="20"/>
-        </w:rPr>
-        <w:t xml:space="preserve">Gestiono </w:t>
-      </w:r>
-      <w:r>
-        <w:rPr>
-          <w:rFonts w:ascii="Calibri" w:hAnsi="Calibri" w:eastAsia="Calibri"/>
-          <w:b/>
-          <w:i w:val="0"/>
-          <w:color w:val="1A1A1A"/>
-          <w:sz w:val="20"/>
-        </w:rPr>
-        <w:t>beneficios ministeriales e internos</w:t>
-      </w:r>
-      <w:r>
-        <w:rPr>
-          <w:rFonts w:ascii="Calibri" w:hAnsi="Calibri" w:eastAsia="Calibri"/>
-          <w:b w:val="0"/>
-          <w:i w:val="0"/>
-          <w:color w:val="1A1A1A"/>
-          <w:sz w:val="20"/>
-        </w:rPr>
-        <w:t xml:space="preserve"> de principio a fin: verificación de requisitos, asignación, seguimiento y registro documental que permite auditar el caso posteriormente.</w:t>
-      </w:r>
-    </w:p>
-    <w:p>
-      <w:pPr>
-        <w:pStyle w:val="ListBullet"/>
-        <w:spacing w:before="0" w:after="40" w:line="252" w:lineRule="auto"/>
-        <w:ind w:left="238" w:hanging="238"/>
-      </w:pPr>
-      <w:r>
-        <w:rPr>
-          <w:rFonts w:ascii="Calibri" w:hAnsi="Calibri" w:eastAsia="Calibri"/>
-          <w:b w:val="0"/>
-          <w:i w:val="0"/>
-          <w:color w:val="1A1A1A"/>
-          <w:sz w:val="20"/>
-        </w:rPr>
-        <w:t xml:space="preserve">Atiendo público de manera permanente y entrego </w:t>
-      </w:r>
-      <w:r>
-        <w:rPr>
-          <w:rFonts w:ascii="Calibri" w:hAnsi="Calibri" w:eastAsia="Calibri"/>
-          <w:b/>
-          <w:i w:val="0"/>
-          <w:color w:val="1A1A1A"/>
-          <w:sz w:val="20"/>
-        </w:rPr>
-        <w:t>orientación social personalizada</w:t>
-      </w:r>
-      <w:r>
-        <w:rPr>
-          <w:rFonts w:ascii="Calibri" w:hAnsi="Calibri" w:eastAsia="Calibri"/>
-          <w:b w:val="0"/>
-          <w:i w:val="0"/>
-          <w:color w:val="1A1A1A"/>
-          <w:sz w:val="20"/>
-        </w:rPr>
-        <w:t>, acompañando al usuario durante todo el proceso de postulación.</w:t>
-      </w:r>
-    </w:p>
-    <w:p>
-      <w:pPr>
-        <w:pStyle w:val="ListBullet"/>
-        <w:spacing w:before="0" w:after="40" w:line="252" w:lineRule="auto"/>
-        <w:ind w:left="238" w:hanging="238"/>
+        <w:keepNext/>
+        <w:tabs>
+          <w:tab w:pos="10426" w:val="right"/>
+        </w:tabs>
+        <w:spacing w:before="60" w:after="0" w:line="247" w:lineRule="auto"/>
       </w:pPr>
       <w:r>
         <w:rPr>
@@ -310,75 +1151,9 @@
           <w:b/>
           <w:i w:val="0"/>
           <w:color w:val="1A1A1A"/>
-          <w:sz w:val="20"/>
+          <w:sz w:val="19"/>
         </w:rPr>
-        <w:t>Coordino casos complejos</w:t>
-      </w:r>
-      <w:r>
-        <w:rPr>
-          <w:rFonts w:ascii="Calibri" w:hAnsi="Calibri" w:eastAsia="Calibri"/>
-          <w:b w:val="0"/>
-          <w:i w:val="0"/>
-          <w:color w:val="1A1A1A"/>
-          <w:sz w:val="20"/>
-        </w:rPr>
-        <w:t xml:space="preserve"> con áreas internas de la universidad y con redes de apoyo externas cuando la necesidad excede el ámbito académico.</w:t>
-      </w:r>
-    </w:p>
-    <w:p>
-      <w:pPr>
-        <w:pStyle w:val="ListBullet"/>
-        <w:spacing w:before="0" w:after="40" w:line="252" w:lineRule="auto"/>
-        <w:ind w:left="238" w:hanging="238"/>
-      </w:pPr>
-      <w:r>
-        <w:rPr>
-          <w:rFonts w:ascii="Calibri" w:hAnsi="Calibri" w:eastAsia="Calibri"/>
-          <w:b w:val="0"/>
-          <w:i w:val="0"/>
-          <w:color w:val="1A1A1A"/>
-          <w:sz w:val="20"/>
-        </w:rPr>
-        <w:t xml:space="preserve">Elaboro </w:t>
-      </w:r>
-      <w:r>
-        <w:rPr>
-          <w:rFonts w:ascii="Calibri" w:hAnsi="Calibri" w:eastAsia="Calibri"/>
-          <w:b/>
-          <w:i w:val="0"/>
-          <w:color w:val="1A1A1A"/>
-          <w:sz w:val="20"/>
-        </w:rPr>
-        <w:t>informes sociales</w:t>
-      </w:r>
-      <w:r>
-        <w:rPr>
-          <w:rFonts w:ascii="Calibri" w:hAnsi="Calibri" w:eastAsia="Calibri"/>
-          <w:b w:val="0"/>
-          <w:i w:val="0"/>
-          <w:color w:val="1A1A1A"/>
-          <w:sz w:val="20"/>
-        </w:rPr>
-        <w:t xml:space="preserve"> y mantengo la trazabilidad administrativa de la cartera de casos a mi cargo.</w:t>
-      </w:r>
-    </w:p>
-    <w:p>
-      <w:pPr>
-        <w:keepNext/>
-        <w:tabs>
-          <w:tab w:pos="10312" w:val="right"/>
-        </w:tabs>
-        <w:spacing w:before="150" w:after="0" w:line="252" w:lineRule="auto"/>
-      </w:pPr>
-      <w:r>
-        <w:rPr>
-          <w:rFonts w:ascii="Calibri" w:hAnsi="Calibri" w:eastAsia="Calibri"/>
-          <w:b/>
-          <w:i w:val="0"/>
-          <w:color w:val="1F355E"/>
-          <w:sz w:val="21"/>
-        </w:rPr>
-        <w:t>Bmining · Desarrollo e Innovación para la Minería SpA</w:t>
+        <w:t>Postítulo en Trabajo Social en Niñez, Adolescencia y Familia en el Contexto Judicial</w:t>
       </w:r>
       <w:r>
         <w:rPr>
@@ -386,16 +1161,15 @@
           <w:b/>
           <w:i w:val="0"/>
           <w:color w:val="5A5A5A"/>
-          <w:sz w:val="19"/>
+          <w:sz w:val="18"/>
         </w:rPr>
         <w:tab/>
-        <w:t>Octubre 2018 – Abril 2023</w:t>
+        <w:t>2016</w:t>
       </w:r>
     </w:p>
     <w:p>
       <w:pPr>
-        <w:keepNext/>
-        <w:spacing w:before="20" w:after="60" w:line="252" w:lineRule="auto"/>
+        <w:spacing w:before="10" w:after="0" w:line="247" w:lineRule="auto"/>
       </w:pPr>
       <w:r>
         <w:rPr>
@@ -403,250 +1177,28 @@
           <w:b w:val="0"/>
           <w:i/>
           <w:color w:val="444444"/>
-          <w:sz w:val="20"/>
+          <w:sz w:val="18"/>
         </w:rPr>
-        <w:t>Líder en Gestión de Personas</w:t>
+        <w:t>Universidad Andrés Bello</w:t>
       </w:r>
     </w:p>
     <w:p>
       <w:pPr>
-        <w:pStyle w:val="ListBullet"/>
-        <w:spacing w:before="0" w:after="40" w:line="252" w:lineRule="auto"/>
-        <w:ind w:left="238" w:hanging="238"/>
+        <w:keepNext/>
+        <w:tabs>
+          <w:tab w:pos="10426" w:val="right"/>
+        </w:tabs>
+        <w:spacing w:before="60" w:after="0" w:line="247" w:lineRule="auto"/>
       </w:pPr>
-      <w:r>
-        <w:rPr>
-          <w:rFonts w:ascii="Calibri" w:hAnsi="Calibri" w:eastAsia="Calibri"/>
-          <w:b w:val="0"/>
-          <w:i w:val="0"/>
-          <w:color w:val="1A1A1A"/>
-          <w:sz w:val="20"/>
-        </w:rPr>
-        <w:t xml:space="preserve">Estuve a cargo de los </w:t>
-      </w:r>
       <w:r>
         <w:rPr>
           <w:rFonts w:ascii="Calibri" w:hAnsi="Calibri" w:eastAsia="Calibri"/>
           <w:b/>
           <w:i w:val="0"/>
           <w:color w:val="1A1A1A"/>
-          <w:sz w:val="20"/>
+          <w:sz w:val="19"/>
         </w:rPr>
-        <w:t>programas de bienestar y beneficios</w:t>
-      </w:r>
-      <w:r>
-        <w:rPr>
-          <w:rFonts w:ascii="Calibri" w:hAnsi="Calibri" w:eastAsia="Calibri"/>
-          <w:b w:val="0"/>
-          <w:i w:val="0"/>
-          <w:color w:val="1A1A1A"/>
-          <w:sz w:val="20"/>
-        </w:rPr>
-        <w:t xml:space="preserve"> de los colaboradores, desde la definición de la oferta hasta su implementación y seguimiento, con foco en el clima laboral y en el día a día de la empresa.</w:t>
-      </w:r>
-    </w:p>
-    <w:p>
-      <w:pPr>
-        <w:pStyle w:val="ListBullet"/>
-        <w:spacing w:before="0" w:after="40" w:line="252" w:lineRule="auto"/>
-        <w:ind w:left="238" w:hanging="238"/>
-      </w:pPr>
-      <w:r>
-        <w:rPr>
-          <w:rFonts w:ascii="Calibri" w:hAnsi="Calibri" w:eastAsia="Calibri"/>
-          <w:b w:val="0"/>
-          <w:i w:val="0"/>
-          <w:color w:val="1A1A1A"/>
-          <w:sz w:val="20"/>
-        </w:rPr>
-        <w:t xml:space="preserve">Gestioné </w:t>
-      </w:r>
-      <w:r>
-        <w:rPr>
-          <w:rFonts w:ascii="Calibri" w:hAnsi="Calibri" w:eastAsia="Calibri"/>
-          <w:b/>
-          <w:i w:val="0"/>
-          <w:color w:val="1A1A1A"/>
-          <w:sz w:val="20"/>
-        </w:rPr>
-        <w:t>convenios y beneficios orientados a la calidad de vida laboral</w:t>
-      </w:r>
-      <w:r>
-        <w:rPr>
-          <w:rFonts w:ascii="Calibri" w:hAnsi="Calibri" w:eastAsia="Calibri"/>
-          <w:b w:val="0"/>
-          <w:i w:val="0"/>
-          <w:color w:val="1A1A1A"/>
-          <w:sz w:val="20"/>
-        </w:rPr>
-        <w:t>, administrando la relación con instituciones y proveedores externos.</w:t>
-      </w:r>
-    </w:p>
-    <w:p>
-      <w:pPr>
-        <w:pStyle w:val="ListBullet"/>
-        <w:spacing w:before="0" w:after="40" w:line="252" w:lineRule="auto"/>
-        <w:ind w:left="238" w:hanging="238"/>
-      </w:pPr>
-      <w:r>
-        <w:rPr>
-          <w:rFonts w:ascii="Calibri" w:hAnsi="Calibri" w:eastAsia="Calibri"/>
-          <w:b w:val="0"/>
-          <w:i w:val="0"/>
-          <w:color w:val="1A1A1A"/>
-          <w:sz w:val="20"/>
-        </w:rPr>
-        <w:t xml:space="preserve">Organicé </w:t>
-      </w:r>
-      <w:r>
-        <w:rPr>
-          <w:rFonts w:ascii="Calibri" w:hAnsi="Calibri" w:eastAsia="Calibri"/>
-          <w:b/>
-          <w:i w:val="0"/>
-          <w:color w:val="1A1A1A"/>
-          <w:sz w:val="20"/>
-        </w:rPr>
-        <w:t>actividades corporativas de bienestar e integración</w:t>
-      </w:r>
-      <w:r>
-        <w:rPr>
-          <w:rFonts w:ascii="Calibri" w:hAnsi="Calibri" w:eastAsia="Calibri"/>
-          <w:b w:val="0"/>
-          <w:i w:val="0"/>
-          <w:color w:val="1A1A1A"/>
-          <w:sz w:val="20"/>
-        </w:rPr>
-        <w:t>, articulando a las distintas áreas para asegurar convocatoria y buena ejecución.</w:t>
-      </w:r>
-    </w:p>
-    <w:p>
-      <w:pPr>
-        <w:pStyle w:val="ListBullet"/>
-        <w:spacing w:before="0" w:after="40" w:line="252" w:lineRule="auto"/>
-        <w:ind w:left="238" w:hanging="238"/>
-      </w:pPr>
-      <w:r>
-        <w:rPr>
-          <w:rFonts w:ascii="Calibri" w:hAnsi="Calibri" w:eastAsia="Calibri"/>
-          <w:b w:val="0"/>
-          <w:i w:val="0"/>
-          <w:color w:val="1A1A1A"/>
-          <w:sz w:val="20"/>
-        </w:rPr>
-        <w:t xml:space="preserve">Fui </w:t>
-      </w:r>
-      <w:r>
-        <w:rPr>
-          <w:rFonts w:ascii="Calibri" w:hAnsi="Calibri" w:eastAsia="Calibri"/>
-          <w:b/>
-          <w:i w:val="0"/>
-          <w:color w:val="1A1A1A"/>
-          <w:sz w:val="20"/>
-        </w:rPr>
-        <w:t>contraparte directa de los trabajadores</w:t>
-      </w:r>
-      <w:r>
-        <w:rPr>
-          <w:rFonts w:ascii="Calibri" w:hAnsi="Calibri" w:eastAsia="Calibri"/>
-          <w:b w:val="0"/>
-          <w:i w:val="0"/>
-          <w:color w:val="1A1A1A"/>
-          <w:sz w:val="20"/>
-        </w:rPr>
-        <w:t>: levantaba cada necesidad y le buscaba solución con las jefaturas o derivando a la red que correspondía.</w:t>
-      </w:r>
-    </w:p>
-    <w:p>
-      <w:pPr>
-        <w:pStyle w:val="ListBullet"/>
-        <w:spacing w:before="0" w:after="40" w:line="252" w:lineRule="auto"/>
-        <w:ind w:left="238" w:hanging="238"/>
-      </w:pPr>
-      <w:r>
-        <w:rPr>
-          <w:rFonts w:ascii="Calibri" w:hAnsi="Calibri" w:eastAsia="Calibri"/>
-          <w:b w:val="0"/>
-          <w:i w:val="0"/>
-          <w:color w:val="1A1A1A"/>
-          <w:sz w:val="20"/>
-        </w:rPr>
-        <w:t xml:space="preserve">Apoyé a Recursos Humanos en </w:t>
-      </w:r>
-      <w:r>
-        <w:rPr>
-          <w:rFonts w:ascii="Calibri" w:hAnsi="Calibri" w:eastAsia="Calibri"/>
-          <w:b/>
-          <w:i w:val="0"/>
-          <w:color w:val="1A1A1A"/>
-          <w:sz w:val="20"/>
-        </w:rPr>
-        <w:t>selección e inducción</w:t>
-      </w:r>
-      <w:r>
-        <w:rPr>
-          <w:rFonts w:ascii="Calibri" w:hAnsi="Calibri" w:eastAsia="Calibri"/>
-          <w:b w:val="0"/>
-          <w:i w:val="0"/>
-          <w:color w:val="1A1A1A"/>
-          <w:sz w:val="20"/>
-        </w:rPr>
-        <w:t xml:space="preserve"> y participé en las capacitaciones internas.</w:t>
-      </w:r>
-    </w:p>
-    <w:p>
-      <w:pPr>
-        <w:pStyle w:val="ListBullet"/>
-        <w:spacing w:before="0" w:after="40" w:line="252" w:lineRule="auto"/>
-        <w:ind w:left="238" w:hanging="238"/>
-      </w:pPr>
-      <w:r>
-        <w:rPr>
-          <w:rFonts w:ascii="Calibri" w:hAnsi="Calibri" w:eastAsia="Calibri"/>
-          <w:b w:val="0"/>
-          <w:i w:val="0"/>
-          <w:color w:val="1A1A1A"/>
-          <w:sz w:val="20"/>
-        </w:rPr>
-        <w:t xml:space="preserve">Asumí durante un año el </w:t>
-      </w:r>
-      <w:r>
-        <w:rPr>
-          <w:rFonts w:ascii="Calibri" w:hAnsi="Calibri" w:eastAsia="Calibri"/>
-          <w:b/>
-          <w:i w:val="0"/>
-          <w:color w:val="1A1A1A"/>
-          <w:sz w:val="20"/>
-        </w:rPr>
-        <w:t>Sistema de Gestión Integrado como auditora interna</w:t>
-      </w:r>
-      <w:r>
-        <w:rPr>
-          <w:rFonts w:ascii="Calibri" w:hAnsi="Calibri" w:eastAsia="Calibri"/>
-          <w:b w:val="0"/>
-          <w:i w:val="0"/>
-          <w:color w:val="1A1A1A"/>
-          <w:sz w:val="20"/>
-        </w:rPr>
-        <w:t xml:space="preserve"> en las certificaciones ISO 9001:2015 (Calidad), ISO 14001:2015 (Medio Ambiente) e ISO 45001:2018 (Seguridad y Salud en el Trabajo).</w:t>
-      </w:r>
-    </w:p>
-    <w:p>
-      <w:pPr>
-        <w:keepNext/>
-        <w:tabs>
-          <w:tab w:pos="10312" w:val="right"/>
-        </w:tabs>
-        <w:spacing w:before="150" w:after="0" w:line="252" w:lineRule="auto"/>
-      </w:pPr>
-      <w:r>
-        <w:rPr>
-          <w:rFonts w:ascii="Calibri" w:hAnsi="Calibri" w:eastAsia="Calibri"/>
-          <w:b/>
-          <w:i w:val="0"/>
-          <w:color w:val="1F355E"/>
-          <w:sz w:val="21"/>
-        </w:rPr>
-        <w:t>Fundación Fondo Esperanza</w:t>
+        <w:t>Trabajadora Social · Título profesional con distinción</w:t>
       </w:r>
       <w:r>
         <w:rPr>
@@ -654,16 +1206,15 @@
           <w:b/>
           <w:i w:val="0"/>
           <w:color w:val="5A5A5A"/>
-          <w:sz w:val="19"/>
+          <w:sz w:val="18"/>
         </w:rPr>
         <w:tab/>
-        <w:t>Octubre 2017 – Septiembre 2018</w:t>
+        <w:t>2012</w:t>
       </w:r>
     </w:p>
     <w:p>
       <w:pPr>
-        <w:keepNext/>
-        <w:spacing w:before="20" w:after="60" w:line="252" w:lineRule="auto"/>
+        <w:spacing w:before="10" w:after="0" w:line="247" w:lineRule="auto"/>
       </w:pPr>
       <w:r>
         <w:rPr>
@@ -671,310 +1222,15 @@
           <w:b w:val="0"/>
           <w:i/>
           <w:color w:val="444444"/>
-          <w:sz w:val="20"/>
+          <w:sz w:val="18"/>
         </w:rPr>
-        <w:t>Monitora · Grupo Emprendedores</w:t>
-      </w:r>
-    </w:p>
-    <w:p>
-      <w:pPr>
-        <w:pStyle w:val="ListBullet"/>
-        <w:spacing w:before="0" w:after="40" w:line="252" w:lineRule="auto"/>
-        <w:ind w:left="238" w:hanging="238"/>
-      </w:pPr>
-      <w:r>
-        <w:rPr>
-          <w:rFonts w:ascii="Calibri" w:hAnsi="Calibri" w:eastAsia="Calibri"/>
-          <w:b w:val="0"/>
-          <w:i w:val="0"/>
-          <w:color w:val="1A1A1A"/>
-          <w:sz w:val="20"/>
-        </w:rPr>
-        <w:t xml:space="preserve">Diseñé y dicté </w:t>
-      </w:r>
-      <w:r>
-        <w:rPr>
-          <w:rFonts w:ascii="Calibri" w:hAnsi="Calibri" w:eastAsia="Calibri"/>
-          <w:b/>
-          <w:i w:val="0"/>
-          <w:color w:val="1A1A1A"/>
-          <w:sz w:val="20"/>
-        </w:rPr>
-        <w:t>capacitaciones</w:t>
-      </w:r>
-      <w:r>
-        <w:rPr>
-          <w:rFonts w:ascii="Calibri" w:hAnsi="Calibri" w:eastAsia="Calibri"/>
-          <w:b w:val="0"/>
-          <w:i w:val="0"/>
-          <w:color w:val="1A1A1A"/>
-          <w:sz w:val="20"/>
-        </w:rPr>
-        <w:t xml:space="preserve"> para emprendedores que estaban partiendo o buscando hacer crecer su negocio, con metodologías prácticas y grupales.</w:t>
-      </w:r>
-    </w:p>
-    <w:p>
-      <w:pPr>
-        <w:pStyle w:val="ListBullet"/>
-        <w:spacing w:before="0" w:after="40" w:line="252" w:lineRule="auto"/>
-        <w:ind w:left="238" w:hanging="238"/>
-      </w:pPr>
-      <w:r>
-        <w:rPr>
-          <w:rFonts w:ascii="Calibri" w:hAnsi="Calibri" w:eastAsia="Calibri"/>
-          <w:b/>
-          <w:i w:val="0"/>
-          <w:color w:val="1A1A1A"/>
-          <w:sz w:val="20"/>
-        </w:rPr>
-        <w:t>Acompañé la gestión de sus proyectos</w:t>
-      </w:r>
-      <w:r>
-        <w:rPr>
-          <w:rFonts w:ascii="Calibri" w:hAnsi="Calibri" w:eastAsia="Calibri"/>
-          <w:b w:val="0"/>
-          <w:i w:val="0"/>
-          <w:color w:val="1A1A1A"/>
-          <w:sz w:val="20"/>
-        </w:rPr>
-        <w:t>, revisando con cada participante qué reforzar para alcanzar sus objetivos.</w:t>
-      </w:r>
-    </w:p>
-    <w:p>
-      <w:pPr>
-        <w:pStyle w:val="ListBullet"/>
-        <w:spacing w:before="0" w:after="40" w:line="252" w:lineRule="auto"/>
-        <w:ind w:left="238" w:hanging="238"/>
-      </w:pPr>
-      <w:r>
-        <w:rPr>
-          <w:rFonts w:ascii="Calibri" w:hAnsi="Calibri" w:eastAsia="Calibri"/>
-          <w:b w:val="0"/>
-          <w:i w:val="0"/>
-          <w:color w:val="1A1A1A"/>
-          <w:sz w:val="20"/>
-        </w:rPr>
-        <w:t xml:space="preserve">Los </w:t>
-      </w:r>
-      <w:r>
-        <w:rPr>
-          <w:rFonts w:ascii="Calibri" w:hAnsi="Calibri" w:eastAsia="Calibri"/>
-          <w:b/>
-          <w:i w:val="0"/>
-          <w:color w:val="1A1A1A"/>
-          <w:sz w:val="20"/>
-        </w:rPr>
-        <w:t>vinculé con redes y recursos</w:t>
-      </w:r>
-      <w:r>
-        <w:rPr>
-          <w:rFonts w:ascii="Calibri" w:hAnsi="Calibri" w:eastAsia="Calibri"/>
-          <w:b w:val="0"/>
-          <w:i w:val="0"/>
-          <w:color w:val="1A1A1A"/>
-          <w:sz w:val="20"/>
-        </w:rPr>
-        <w:t xml:space="preserve"> disponibles que muchas veces no sabían que tenían a su alcance.</w:t>
+        <w:t>Instituto Profesional AIEP</w:t>
       </w:r>
     </w:p>
     <w:p>
       <w:pPr>
         <w:keepNext/>
-        <w:tabs>
-          <w:tab w:pos="10312" w:val="right"/>
-        </w:tabs>
-        <w:spacing w:before="150" w:after="0" w:line="252" w:lineRule="auto"/>
-      </w:pPr>
-      <w:r>
-        <w:rPr>
-          <w:rFonts w:ascii="Calibri" w:hAnsi="Calibri" w:eastAsia="Calibri"/>
-          <w:b/>
-          <w:i w:val="0"/>
-          <w:color w:val="1F355E"/>
-          <w:sz w:val="21"/>
-        </w:rPr>
-        <w:t>Ferretería San Francisco</w:t>
-      </w:r>
-      <w:r>
-        <w:rPr>
-          <w:rFonts w:ascii="Calibri" w:hAnsi="Calibri" w:eastAsia="Calibri"/>
-          <w:b/>
-          <w:i w:val="0"/>
-          <w:color w:val="5A5A5A"/>
-          <w:sz w:val="19"/>
-        </w:rPr>
-        <w:tab/>
-        <w:t>Diciembre 2016 – Septiembre 2017</w:t>
-      </w:r>
-    </w:p>
-    <w:p>
-      <w:pPr>
-        <w:keepNext/>
-        <w:spacing w:before="20" w:after="60" w:line="252" w:lineRule="auto"/>
-      </w:pPr>
-      <w:r>
-        <w:rPr>
-          <w:rFonts w:ascii="Calibri" w:hAnsi="Calibri" w:eastAsia="Calibri"/>
-          <w:b w:val="0"/>
-          <w:i/>
-          <w:color w:val="444444"/>
-          <w:sz w:val="20"/>
-        </w:rPr>
-        <w:t>Encargada · Departamento de Bienestar Social</w:t>
-      </w:r>
-    </w:p>
-    <w:p>
-      <w:pPr>
-        <w:pStyle w:val="ListBullet"/>
-        <w:spacing w:before="0" w:after="40" w:line="252" w:lineRule="auto"/>
-        <w:ind w:left="238" w:hanging="238"/>
-      </w:pPr>
-      <w:r>
-        <w:rPr>
-          <w:rFonts w:ascii="Calibri" w:hAnsi="Calibri" w:eastAsia="Calibri"/>
-          <w:b w:val="0"/>
-          <w:i w:val="0"/>
-          <w:color w:val="1A1A1A"/>
-          <w:sz w:val="20"/>
-        </w:rPr>
-        <w:t xml:space="preserve">Encabecé el </w:t>
-      </w:r>
-      <w:r>
-        <w:rPr>
-          <w:rFonts w:ascii="Calibri" w:hAnsi="Calibri" w:eastAsia="Calibri"/>
-          <w:b/>
-          <w:i w:val="0"/>
-          <w:color w:val="1A1A1A"/>
-          <w:sz w:val="20"/>
-        </w:rPr>
-        <w:t>área de bienestar social para una dotación superior a 200 colaboradores</w:t>
-      </w:r>
-      <w:r>
-        <w:rPr>
-          <w:rFonts w:ascii="Calibri" w:hAnsi="Calibri" w:eastAsia="Calibri"/>
-          <w:b w:val="0"/>
-          <w:i w:val="0"/>
-          <w:color w:val="1A1A1A"/>
-          <w:sz w:val="20"/>
-        </w:rPr>
-        <w:t>, planificando actividades y beneficios para los trabajadores.</w:t>
-      </w:r>
-    </w:p>
-    <w:p>
-      <w:pPr>
-        <w:pStyle w:val="ListBullet"/>
-        <w:spacing w:before="0" w:after="40" w:line="252" w:lineRule="auto"/>
-        <w:ind w:left="238" w:hanging="238"/>
-      </w:pPr>
-      <w:r>
-        <w:rPr>
-          <w:rFonts w:ascii="Calibri" w:hAnsi="Calibri" w:eastAsia="Calibri"/>
-          <w:b w:val="0"/>
-          <w:i w:val="0"/>
-          <w:color w:val="1A1A1A"/>
-          <w:sz w:val="20"/>
-        </w:rPr>
-        <w:t xml:space="preserve">Administré el </w:t>
-      </w:r>
-      <w:r>
-        <w:rPr>
-          <w:rFonts w:ascii="Calibri" w:hAnsi="Calibri" w:eastAsia="Calibri"/>
-          <w:b/>
-          <w:i w:val="0"/>
-          <w:color w:val="1A1A1A"/>
-          <w:sz w:val="20"/>
-        </w:rPr>
-        <w:t>Seguro Complementario de Salud</w:t>
-      </w:r>
-      <w:r>
-        <w:rPr>
-          <w:rFonts w:ascii="Calibri" w:hAnsi="Calibri" w:eastAsia="Calibri"/>
-          <w:b w:val="0"/>
-          <w:i w:val="0"/>
-          <w:color w:val="1A1A1A"/>
-          <w:sz w:val="20"/>
-        </w:rPr>
-        <w:t xml:space="preserve"> de la dotación, apoyando a los trabajadores en el acceso y uso del beneficio.</w:t>
-      </w:r>
-    </w:p>
-    <w:p>
-      <w:pPr>
-        <w:pStyle w:val="ListBullet"/>
-        <w:spacing w:before="0" w:after="40" w:line="252" w:lineRule="auto"/>
-        <w:ind w:left="238" w:hanging="238"/>
-      </w:pPr>
-      <w:r>
-        <w:rPr>
-          <w:rFonts w:ascii="Calibri" w:hAnsi="Calibri" w:eastAsia="Calibri"/>
-          <w:b w:val="0"/>
-          <w:i w:val="0"/>
-          <w:color w:val="1A1A1A"/>
-          <w:sz w:val="20"/>
-        </w:rPr>
-        <w:t xml:space="preserve">Gestioné </w:t>
-      </w:r>
-      <w:r>
-        <w:rPr>
-          <w:rFonts w:ascii="Calibri" w:hAnsi="Calibri" w:eastAsia="Calibri"/>
-          <w:b/>
-          <w:i w:val="0"/>
-          <w:color w:val="1A1A1A"/>
-          <w:sz w:val="20"/>
-        </w:rPr>
-        <w:t>convenios con instituciones externas</w:t>
-      </w:r>
-      <w:r>
-        <w:rPr>
-          <w:rFonts w:ascii="Calibri" w:hAnsi="Calibri" w:eastAsia="Calibri"/>
-          <w:b w:val="0"/>
-          <w:i w:val="0"/>
-          <w:color w:val="1A1A1A"/>
-          <w:sz w:val="20"/>
-        </w:rPr>
-        <w:t xml:space="preserve"> para mejorar la calidad de vida en el trabajo.</w:t>
-      </w:r>
-    </w:p>
-    <w:p>
-      <w:pPr>
-        <w:pStyle w:val="ListBullet"/>
-        <w:spacing w:before="0" w:after="40" w:line="252" w:lineRule="auto"/>
-        <w:ind w:left="238" w:hanging="238"/>
-      </w:pPr>
-      <w:r>
-        <w:rPr>
-          <w:rFonts w:ascii="Calibri" w:hAnsi="Calibri" w:eastAsia="Calibri"/>
-          <w:b w:val="0"/>
-          <w:i w:val="0"/>
-          <w:color w:val="1A1A1A"/>
-          <w:sz w:val="20"/>
-        </w:rPr>
-        <w:t xml:space="preserve">Administré vacaciones, carpetas personales y documentación laboral, y apoyé los </w:t>
-      </w:r>
-      <w:r>
-        <w:rPr>
-          <w:rFonts w:ascii="Calibri" w:hAnsi="Calibri" w:eastAsia="Calibri"/>
-          <w:b/>
-          <w:i w:val="0"/>
-          <w:color w:val="1A1A1A"/>
-          <w:sz w:val="20"/>
-        </w:rPr>
-        <w:t>procesos administrativos de Recursos Humanos</w:t>
-      </w:r>
-      <w:r>
-        <w:rPr>
-          <w:rFonts w:ascii="Calibri" w:hAnsi="Calibri" w:eastAsia="Calibri"/>
-          <w:b w:val="0"/>
-          <w:i w:val="0"/>
-          <w:color w:val="1A1A1A"/>
-          <w:sz w:val="20"/>
-        </w:rPr>
-        <w:t>.</w:t>
-      </w:r>
-    </w:p>
-    <w:p>
-      <w:pPr>
-        <w:keepNext/>
-        <w:spacing w:before="200" w:after="90" w:line="252" w:lineRule="auto"/>
+        <w:spacing w:before="180" w:after="80" w:line="247" w:lineRule="auto"/>
         <w:pBdr>
           <w:bottom w:val="single" w:sz="6" w:space="2" w:color="1F355E"/>
         </w:pBdr>
@@ -985,19 +1241,17 @@
           <w:b/>
           <w:i w:val="0"/>
           <w:color w:val="1F355E"/>
-          <w:sz w:val="21"/>
+          <w:sz w:val="20"/>
           <w:spacing w:val="30"/>
         </w:rPr>
-        <w:t>FORMACIÓN ACADÉMICA</w:t>
+        <w:t>CURSOS Y CERTIFICACIONES</w:t>
       </w:r>
     </w:p>
     <w:p>
       <w:pPr>
-        <w:keepNext/>
-        <w:tabs>
-          <w:tab w:pos="10312" w:val="right"/>
-        </w:tabs>
-        <w:spacing w:before="70" w:after="0" w:line="252" w:lineRule="auto"/>
+        <w:pStyle w:val="ListBullet"/>
+        <w:spacing w:before="0" w:after="30" w:line="247" w:lineRule="auto"/>
+        <w:ind w:left="227" w:hanging="227"/>
       </w:pPr>
       <w:r>
         <w:rPr>
@@ -1005,44 +1259,26 @@
           <w:b/>
           <w:i w:val="0"/>
           <w:color w:val="1A1A1A"/>
-          <w:sz w:val="20"/>
+          <w:sz w:val="19"/>
         </w:rPr>
-        <w:t>Diplomado en Bienestar Organizacional y Estrategias de Diversidad e Inclusión</w:t>
+        <w:t>Certificación Gatekeepers</w:t>
       </w:r>
       <w:r>
         <w:rPr>
           <w:rFonts w:ascii="Calibri" w:hAnsi="Calibri" w:eastAsia="Calibri"/>
-          <w:b/>
+          <w:b w:val="0"/>
           <w:i w:val="0"/>
-          <w:color w:val="5A5A5A"/>
+          <w:color w:val="1A1A1A"/>
           <w:sz w:val="19"/>
         </w:rPr>
-        <w:tab/>
-        <w:t>2026</w:t>
+        <w:t xml:space="preserve"> — agentes comunitarios en prevención del suicidio (2026).</w:t>
       </w:r>
     </w:p>
     <w:p>
       <w:pPr>
-        <w:spacing w:before="10" w:after="0" w:line="252" w:lineRule="auto"/>
-      </w:pPr>
-      <w:r>
-        <w:rPr>
-          <w:rFonts w:ascii="Calibri" w:hAnsi="Calibri" w:eastAsia="Calibri"/>
-          <w:b w:val="0"/>
-          <w:i/>
-          <w:color w:val="444444"/>
-          <w:sz w:val="19"/>
-        </w:rPr>
-        <w:t>Universidad de Santiago de Chile</w:t>
-      </w:r>
-    </w:p>
-    <w:p>
-      <w:pPr>
-        <w:keepNext/>
-        <w:tabs>
-          <w:tab w:pos="10312" w:val="right"/>
-        </w:tabs>
-        <w:spacing w:before="70" w:after="0" w:line="252" w:lineRule="auto"/>
+        <w:pStyle w:val="ListBullet"/>
+        <w:spacing w:before="0" w:after="30" w:line="247" w:lineRule="auto"/>
+        <w:ind w:left="227" w:hanging="227"/>
       </w:pPr>
       <w:r>
         <w:rPr>
@@ -1050,44 +1286,26 @@
           <w:b/>
           <w:i w:val="0"/>
           <w:color w:val="1A1A1A"/>
-          <w:sz w:val="20"/>
+          <w:sz w:val="19"/>
         </w:rPr>
-        <w:t>Postítulo en Trabajo Social en Niñez, Adolescencia y Familia en el Contexto Judicial</w:t>
+        <w:t>Interpretación auditor interno</w:t>
       </w:r>
       <w:r>
         <w:rPr>
           <w:rFonts w:ascii="Calibri" w:hAnsi="Calibri" w:eastAsia="Calibri"/>
-          <w:b/>
+          <w:b w:val="0"/>
           <w:i w:val="0"/>
-          <w:color w:val="5A5A5A"/>
+          <w:color w:val="1A1A1A"/>
           <w:sz w:val="19"/>
         </w:rPr>
-        <w:tab/>
-        <w:t>2016</w:t>
+        <w:t xml:space="preserve"> — TÜV Rheinland (2019). Respalda la auditoría del Sistema de Gestión Integrado ISO 9001 / 14001 / 45001.</w:t>
       </w:r>
     </w:p>
     <w:p>
       <w:pPr>
-        <w:spacing w:before="10" w:after="0" w:line="252" w:lineRule="auto"/>
-      </w:pPr>
-      <w:r>
-        <w:rPr>
-          <w:rFonts w:ascii="Calibri" w:hAnsi="Calibri" w:eastAsia="Calibri"/>
-          <w:b w:val="0"/>
-          <w:i/>
-          <w:color w:val="444444"/>
-          <w:sz w:val="19"/>
-        </w:rPr>
-        <w:t>Universidad Andrés Bello</w:t>
-      </w:r>
-    </w:p>
-    <w:p>
-      <w:pPr>
-        <w:keepNext/>
-        <w:tabs>
-          <w:tab w:pos="10312" w:val="right"/>
-        </w:tabs>
-        <w:spacing w:before="70" w:after="0" w:line="252" w:lineRule="auto"/>
+        <w:pStyle w:val="ListBullet"/>
+        <w:spacing w:before="0" w:after="30" w:line="247" w:lineRule="auto"/>
+        <w:ind w:left="227" w:hanging="227"/>
       </w:pPr>
       <w:r>
         <w:rPr>
@@ -1095,41 +1313,52 @@
           <w:b/>
           <w:i w:val="0"/>
           <w:color w:val="1A1A1A"/>
-          <w:sz w:val="20"/>
+          <w:sz w:val="19"/>
         </w:rPr>
-        <w:t>Trabajadora Social · Título profesional con distinción</w:t>
+        <w:t>Ley 21.327, Modernización de la Dirección del Trabajo</w:t>
       </w:r>
+      <w:r>
+        <w:rPr>
+          <w:rFonts w:ascii="Calibri" w:hAnsi="Calibri" w:eastAsia="Calibri"/>
+          <w:b w:val="0"/>
+          <w:i w:val="0"/>
+          <w:color w:val="1A1A1A"/>
+          <w:sz w:val="19"/>
+        </w:rPr>
+        <w:t xml:space="preserve"> — Bicentenario OTEC (2021).</w:t>
+      </w:r>
+    </w:p>
+    <w:p>
+      <w:pPr>
+        <w:pStyle w:val="ListBullet"/>
+        <w:spacing w:before="0" w:after="30" w:line="247" w:lineRule="auto"/>
+        <w:ind w:left="227" w:hanging="227"/>
+      </w:pPr>
       <w:r>
         <w:rPr>
           <w:rFonts w:ascii="Calibri" w:hAnsi="Calibri" w:eastAsia="Calibri"/>
           <w:b/>
           <w:i w:val="0"/>
-          <w:color w:val="5A5A5A"/>
+          <w:color w:val="1A1A1A"/>
           <w:sz w:val="19"/>
         </w:rPr>
-        <w:tab/>
-        <w:t>2012</w:t>
+        <w:t>Cálculo de finiquito</w:t>
       </w:r>
-    </w:p>
-    <w:p>
-      <w:pPr>
-        <w:spacing w:before="10" w:after="0" w:line="252" w:lineRule="auto"/>
-      </w:pPr>
       <w:r>
         <w:rPr>
           <w:rFonts w:ascii="Calibri" w:hAnsi="Calibri" w:eastAsia="Calibri"/>
           <w:b w:val="0"/>
-          <w:i/>
-          <w:color w:val="444444"/>
+          <w:i w:val="0"/>
+          <w:color w:val="1A1A1A"/>
           <w:sz w:val="19"/>
         </w:rPr>
-        <w:t>Instituto Profesional AIEP</w:t>
+        <w:t xml:space="preserve"> — Consultores y Asesores en Capacitación Chile Ltda. (2022).</w:t>
       </w:r>
     </w:p>
     <w:p>
       <w:pPr>
         <w:keepNext/>
-        <w:spacing w:before="200" w:after="90" w:line="252" w:lineRule="auto"/>
+        <w:spacing w:before="180" w:after="80" w:line="247" w:lineRule="auto"/>
         <w:pBdr>
           <w:bottom w:val="single" w:sz="6" w:space="2" w:color="1F355E"/>
         </w:pBdr>
@@ -1140,17 +1369,32 @@
           <w:b/>
           <w:i w:val="0"/>
           <w:color w:val="1F355E"/>
-          <w:sz w:val="21"/>
+          <w:sz w:val="20"/>
           <w:spacing w:val="30"/>
         </w:rPr>
-        <w:t>CURSOS Y CERTIFICACIONES</w:t>
+        <w:t>COMPETENCIAS Y HERRAMIENTAS</w:t>
+      </w:r>
+    </w:p>
+    <w:p>
+      <w:pPr>
+        <w:spacing w:before="0" w:after="50" w:line="257" w:lineRule="auto"/>
+      </w:pPr>
+      <w:r>
+        <w:rPr>
+          <w:rFonts w:ascii="Calibri" w:hAnsi="Calibri" w:eastAsia="Calibri"/>
+          <w:b w:val="0"/>
+          <w:i w:val="0"/>
+          <w:color w:val="1A1A1A"/>
+          <w:sz w:val="18"/>
+        </w:rPr>
+        <w:t>Vocación y orientación al servicio  ·  Excelente trato al usuario y altos estándares de calidad de atención  ·  Comunicación efectiva  ·  Trabajo en equipo y coordinación transversal con múltiples unidades  ·  Autonomía y resolución de situaciones  ·  Flexibilidad y adaptación al cambio  ·  Manejo de conflictos  ·  Proactividad y aporte al clima laboral  ·  Rigurosidad administrativa y normativa</w:t>
       </w:r>
     </w:p>
     <w:p>
       <w:pPr>
         <w:pStyle w:val="ListBullet"/>
-        <w:spacing w:before="0" w:after="40" w:line="252" w:lineRule="auto"/>
-        <w:ind w:left="238" w:hanging="238"/>
+        <w:spacing w:before="0" w:after="30" w:line="247" w:lineRule="auto"/>
+        <w:ind w:left="227" w:hanging="227"/>
       </w:pPr>
       <w:r>
         <w:rPr>
@@ -1158,150 +1402,7 @@
           <w:b/>
           <w:i w:val="0"/>
           <w:color w:val="1A1A1A"/>
-          <w:sz w:val="20"/>
-        </w:rPr>
-        <w:t>Certificación Gatekeepers</w:t>
-      </w:r>
-      <w:r>
-        <w:rPr>
-          <w:rFonts w:ascii="Calibri" w:hAnsi="Calibri" w:eastAsia="Calibri"/>
-          <w:b w:val="0"/>
-          <w:i w:val="0"/>
-          <w:color w:val="1A1A1A"/>
-          <w:sz w:val="20"/>
-        </w:rPr>
-        <w:t xml:space="preserve"> — agentes comunitarios en prevención del suicidio (2026).</w:t>
-      </w:r>
-    </w:p>
-    <w:p>
-      <w:pPr>
-        <w:pStyle w:val="ListBullet"/>
-        <w:spacing w:before="0" w:after="40" w:line="252" w:lineRule="auto"/>
-        <w:ind w:left="238" w:hanging="238"/>
-      </w:pPr>
-      <w:r>
-        <w:rPr>
-          <w:rFonts w:ascii="Calibri" w:hAnsi="Calibri" w:eastAsia="Calibri"/>
-          <w:b/>
-          <w:i w:val="0"/>
-          <w:color w:val="1A1A1A"/>
-          <w:sz w:val="20"/>
-        </w:rPr>
-        <w:t>Interpretación auditor interno</w:t>
-      </w:r>
-      <w:r>
-        <w:rPr>
-          <w:rFonts w:ascii="Calibri" w:hAnsi="Calibri" w:eastAsia="Calibri"/>
-          <w:b w:val="0"/>
-          <w:i w:val="0"/>
-          <w:color w:val="1A1A1A"/>
-          <w:sz w:val="20"/>
-        </w:rPr>
-        <w:t xml:space="preserve"> — TÜV Rheinland (2019). Respalda la auditoría del Sistema de Gestión Integrado ISO 9001 / 14001 / 45001.</w:t>
-      </w:r>
-    </w:p>
-    <w:p>
-      <w:pPr>
-        <w:pStyle w:val="ListBullet"/>
-        <w:spacing w:before="0" w:after="40" w:line="252" w:lineRule="auto"/>
-        <w:ind w:left="238" w:hanging="238"/>
-      </w:pPr>
-      <w:r>
-        <w:rPr>
-          <w:rFonts w:ascii="Calibri" w:hAnsi="Calibri" w:eastAsia="Calibri"/>
-          <w:b/>
-          <w:i w:val="0"/>
-          <w:color w:val="1A1A1A"/>
-          <w:sz w:val="20"/>
-        </w:rPr>
-        <w:t>Ley 21.327, Modernización de la Dirección del Trabajo</w:t>
-      </w:r>
-      <w:r>
-        <w:rPr>
-          <w:rFonts w:ascii="Calibri" w:hAnsi="Calibri" w:eastAsia="Calibri"/>
-          <w:b w:val="0"/>
-          <w:i w:val="0"/>
-          <w:color w:val="1A1A1A"/>
-          <w:sz w:val="20"/>
-        </w:rPr>
-        <w:t xml:space="preserve"> — Bicentenario OTEC (2021).</w:t>
-      </w:r>
-    </w:p>
-    <w:p>
-      <w:pPr>
-        <w:pStyle w:val="ListBullet"/>
-        <w:spacing w:before="0" w:after="40" w:line="252" w:lineRule="auto"/>
-        <w:ind w:left="238" w:hanging="238"/>
-      </w:pPr>
-      <w:r>
-        <w:rPr>
-          <w:rFonts w:ascii="Calibri" w:hAnsi="Calibri" w:eastAsia="Calibri"/>
-          <w:b/>
-          <w:i w:val="0"/>
-          <w:color w:val="1A1A1A"/>
-          <w:sz w:val="20"/>
-        </w:rPr>
-        <w:t>Cálculo de finiquito</w:t>
-      </w:r>
-      <w:r>
-        <w:rPr>
-          <w:rFonts w:ascii="Calibri" w:hAnsi="Calibri" w:eastAsia="Calibri"/>
-          <w:b w:val="0"/>
-          <w:i w:val="0"/>
-          <w:color w:val="1A1A1A"/>
-          <w:sz w:val="20"/>
-        </w:rPr>
-        <w:t xml:space="preserve"> — Consultores y Asesores en Capacitación Chile Ltda. (2022).</w:t>
-      </w:r>
-    </w:p>
-    <w:p>
-      <w:pPr>
-        <w:keepNext/>
-        <w:spacing w:before="200" w:after="90" w:line="252" w:lineRule="auto"/>
-        <w:pBdr>
-          <w:bottom w:val="single" w:sz="6" w:space="2" w:color="1F355E"/>
-        </w:pBdr>
-      </w:pPr>
-      <w:r>
-        <w:rPr>
-          <w:rFonts w:ascii="Calibri" w:hAnsi="Calibri" w:eastAsia="Calibri"/>
-          <w:b/>
-          <w:i w:val="0"/>
-          <w:color w:val="1F355E"/>
-          <w:sz w:val="21"/>
-          <w:spacing w:val="30"/>
-        </w:rPr>
-        <w:t>COMPETENCIAS Y HERRAMIENTAS</w:t>
-      </w:r>
-    </w:p>
-    <w:p>
-      <w:pPr>
-        <w:spacing w:before="0" w:after="60" w:line="262" w:lineRule="auto"/>
-      </w:pPr>
-      <w:r>
-        <w:rPr>
-          <w:rFonts w:ascii="Calibri" w:hAnsi="Calibri" w:eastAsia="Calibri"/>
-          <w:b w:val="0"/>
-          <w:i w:val="0"/>
-          <w:color w:val="1A1A1A"/>
           <w:sz w:val="19"/>
-        </w:rPr>
-        <w:t>Vocación y orientación al servicio  ·  Excelente trato al usuario y altos estándares de calidad de atención  ·  Comunicación efectiva  ·  Trabajo en equipo y coordinación transversal con múltiples unidades  ·  Autonomía y resolución de situaciones  ·  Flexibilidad y adaptación al cambio  ·  Manejo de conflictos  ·  Proactividad y aporte al clima laboral  ·  Rigurosidad administrativa y normativa</w:t>
-      </w:r>
-    </w:p>
-    <w:p>
-      <w:pPr>
-        <w:pStyle w:val="ListBullet"/>
-        <w:spacing w:before="0" w:after="40" w:line="252" w:lineRule="auto"/>
-        <w:ind w:left="238" w:hanging="238"/>
-      </w:pPr>
-      <w:r>
-        <w:rPr>
-          <w:rFonts w:ascii="Calibri" w:hAnsi="Calibri" w:eastAsia="Calibri"/>
-          <w:b/>
-          <w:i w:val="0"/>
-          <w:color w:val="1A1A1A"/>
-          <w:sz w:val="20"/>
         </w:rPr>
         <w:t xml:space="preserve">Herramientas: </w:t>
       </w:r>
@@ -1311,16 +1412,16 @@
           <w:b w:val="0"/>
           <w:i w:val="0"/>
           <w:color w:val="1A1A1A"/>
-          <w:sz w:val="20"/>
+          <w:sz w:val="19"/>
         </w:rPr>
-        <w:t>Microsoft Office (Word, Excel y PowerPoint) nivel intermedio; plataformas institucionales de registro y gestión documental.</w:t>
+        <w:t>Microsoft Office (Word, Excel y PowerPoint) nivel intermedio; conocimiento básico de BUK, SAP y Talana; plataformas institucionales del Ministerio de Educación y gestión documental.</w:t>
       </w:r>
     </w:p>
     <w:p>
       <w:pPr>
         <w:pStyle w:val="ListBullet"/>
-        <w:spacing w:before="0" w:after="40" w:line="252" w:lineRule="auto"/>
-        <w:ind w:left="238" w:hanging="238"/>
+        <w:spacing w:before="0" w:after="30" w:line="247" w:lineRule="auto"/>
+        <w:ind w:left="227" w:hanging="227"/>
       </w:pPr>
       <w:r>
         <w:rPr>
@@ -1328,7 +1429,7 @@
           <w:b/>
           <w:i w:val="0"/>
           <w:color w:val="1A1A1A"/>
-          <w:sz w:val="20"/>
+          <w:sz w:val="19"/>
         </w:rPr>
         <w:t xml:space="preserve">Disponibilidad: </w:t>
       </w:r>
@@ -1338,14 +1439,14 @@
           <w:b w:val="0"/>
           <w:i w:val="0"/>
           <w:color w:val="1A1A1A"/>
-          <w:sz w:val="20"/>
+          <w:sz w:val="19"/>
         </w:rPr>
-        <w:t>para desempeñarse en Campus San Joaquín y en otros campus de la Región Metropolitana.</w:t>
+        <w:t>movilización propia y licencia clase B; disponibilidad para desempeñarse en Campus San Joaquín y en otros campus de la Región Metropolitana.</w:t>
       </w:r>
     </w:p>
     <w:sectPr>
       <w:pgSz w:w="12240" w:h="15840"/>
-      <w:pgMar w:top="737" w:right="964" w:bottom="680" w:left="964" w:header="720" w:footer="720" w:gutter="0"/>
+      <w:pgMar w:top="652" w:right="907" w:bottom="624" w:left="907" w:header="720" w:footer="720" w:gutter="0"/>
       <w:cols w:space="720"/>
       <w:docGrid w:linePitch="360"/>
     </w:sectPr>
@@ -1717,12 +1818,12 @@
     <w:qFormat/>
     <w:rsid w:val="00FC693F"/>
     <w:pPr>
-      <w:spacing w:before="0" w:after="0" w:line="252" w:lineRule="auto"/>
+      <w:spacing w:before="0" w:after="0" w:line="247" w:lineRule="auto"/>
     </w:pPr>
     <w:rPr>
       <w:rFonts w:ascii="Calibri" w:hAnsi="Calibri" w:eastAsia="Calibri"/>
       <w:color w:val="1A1A1A"/>
-      <w:sz w:val="20"/>
+      <w:sz w:val="19"/>
     </w:rPr>
   </w:style>
   <w:style w:type="paragraph" w:styleId="Header">

</xml_diff>

<commit_message>
Diseno: menor densidad, justificado con particion y ajuste a 2 paginas
- Justificado completo con particion de palabras es-CL (autoHyphenation,
  limite de 2 lineas consecutivas, zona de 0,9 cm). Borde derecho limpio.
- Bandas de palabras clave sin justificar ni partir: son etiquetas.
- Perfil dividido en tres parrafos: tres puntos de entrada en vez de un
  bloque de once lineas.
- Mas aire entre vinietas, cargos y secciones; raíl reducido a 2,9 cm
  para ganar medida de linea.
- Corte de pagina limpio entre cargos, sin vinietas huerfanas.
- Recorte del 11% del texto, priorizando lo menos relevante para el aviso.
- Corrige un error propio: se habia invertido el orden de Fondo Esperanza
  y Ferreteria, rompiendo la cronologia inversa.

Co-Authored-By: Claude Opus 5 <noreply@anthropic.com>
Claude-Session: https://claude.ai/code/session_01FQzQFNEQJbZhUnuA1Gqnqx
</commit_message>
<xml_diff>
--- a/cv-trabajador-social-uc/CV_Jeniffer_Mieres_Contreras_Trabajadora_Social_UC.docx
+++ b/cv-trabajador-social-uc/CV_Jeniffer_Mieres_Contreras_Trabajadora_Social_UC.docx
@@ -4,13 +4,12 @@
   <w:body>
     <w:p>
       <w:pPr>
-        <w:spacing w:before="0" w:after="50" w:line="278" w:lineRule="auto"/>
+        <w:spacing w:before="0" w:after="60" w:line="278" w:lineRule="auto"/>
       </w:pPr>
       <w:r>
         <w:rPr>
           <w:rFonts w:ascii="Cambria" w:hAnsi="Cambria" w:eastAsia="Cambria" w:cs="Cambria"/>
           <w:b w:val="0"/>
-          <w:i w:val="0"/>
           <w:color w:val="16181A"/>
           <w:sz w:val="42"/>
           <w:spacing w:val="40"/>
@@ -20,13 +19,12 @@
     </w:p>
     <w:p>
       <w:pPr>
-        <w:spacing w:before="0" w:after="70" w:line="278" w:lineRule="auto"/>
+        <w:spacing w:before="0" w:after="80" w:line="278" w:lineRule="auto"/>
       </w:pPr>
       <w:r>
         <w:rPr>
           <w:rFonts w:ascii="Calibri" w:hAnsi="Calibri" w:eastAsia="Calibri" w:cs="Calibri"/>
           <w:b w:val="0"/>
-          <w:i w:val="0"/>
           <w:color w:val="4A4F54"/>
           <w:sz w:val="21"/>
           <w:spacing w:val="16"/>
@@ -37,7 +35,6 @@
         <w:rPr>
           <w:rFonts w:ascii="Calibri" w:hAnsi="Calibri" w:eastAsia="Calibri" w:cs="Calibri"/>
           <w:b w:val="0"/>
-          <w:i w:val="0"/>
           <w:color w:val="6E2130"/>
           <w:sz w:val="21"/>
         </w:rPr>
@@ -47,7 +44,6 @@
         <w:rPr>
           <w:rFonts w:ascii="Calibri" w:hAnsi="Calibri" w:eastAsia="Calibri" w:cs="Calibri"/>
           <w:b w:val="0"/>
-          <w:i w:val="0"/>
           <w:color w:val="4A4F54"/>
           <w:sz w:val="21"/>
           <w:spacing w:val="16"/>
@@ -66,7 +62,6 @@
         <w:rPr>
           <w:rFonts w:ascii="Calibri" w:hAnsi="Calibri" w:eastAsia="Calibri" w:cs="Calibri"/>
           <w:b w:val="0"/>
-          <w:i w:val="0"/>
           <w:color w:val="6C7176"/>
           <w:sz w:val="17"/>
           <w:spacing w:val="12"/>
@@ -77,7 +72,6 @@
         <w:rPr>
           <w:rFonts w:ascii="Calibri" w:hAnsi="Calibri" w:eastAsia="Calibri" w:cs="Calibri"/>
           <w:b w:val="0"/>
-          <w:i w:val="0"/>
           <w:color w:val="A8ADB2"/>
           <w:sz w:val="17"/>
         </w:rPr>
@@ -87,7 +81,6 @@
         <w:rPr>
           <w:rFonts w:ascii="Calibri" w:hAnsi="Calibri" w:eastAsia="Calibri" w:cs="Calibri"/>
           <w:b w:val="0"/>
-          <w:i w:val="0"/>
           <w:color w:val="6C7176"/>
           <w:sz w:val="17"/>
           <w:spacing w:val="12"/>
@@ -98,7 +91,6 @@
         <w:rPr>
           <w:rFonts w:ascii="Calibri" w:hAnsi="Calibri" w:eastAsia="Calibri" w:cs="Calibri"/>
           <w:b w:val="0"/>
-          <w:i w:val="0"/>
           <w:color w:val="A8ADB2"/>
           <w:sz w:val="17"/>
         </w:rPr>
@@ -108,7 +100,6 @@
         <w:rPr>
           <w:rFonts w:ascii="Calibri" w:hAnsi="Calibri" w:eastAsia="Calibri" w:cs="Calibri"/>
           <w:b w:val="0"/>
-          <w:i w:val="0"/>
           <w:color w:val="6C7176"/>
           <w:sz w:val="17"/>
           <w:spacing w:val="12"/>
@@ -120,20 +111,20 @@
       <w:pPr>
         <w:keepNext/>
         <w:tabs>
-          <w:tab w:pos="1814" w:val="left"/>
+          <w:tab w:pos="1644" w:val="left"/>
         </w:tabs>
-        <w:spacing w:before="320" w:after="0" w:line="269" w:lineRule="auto"/>
-        <w:ind w:left="1814" w:hanging="1814"/>
+        <w:spacing w:before="280" w:after="0" w:line="283" w:lineRule="auto"/>
+        <w:ind w:left="1644" w:hanging="1644"/>
+        <w:jc w:val="both"/>
       </w:pPr>
       <w:r>
         <w:rPr>
           <w:rFonts w:ascii="Calibri" w:hAnsi="Calibri" w:eastAsia="Calibri" w:cs="Calibri"/>
           <w:b/>
-          <w:i w:val="0"/>
           <w:color w:val="6E2130"/>
-          <w:sz w:val="16"/>
+          <w:sz w:val="15"/>
           <w:caps w:val="1"/>
-          <w:spacing w:val="28"/>
+          <w:spacing w:val="20"/>
         </w:rPr>
         <w:t>Perfil</w:t>
       </w:r>
@@ -144,31 +135,63 @@
         <w:rPr>
           <w:rFonts w:ascii="Cambria" w:hAnsi="Cambria" w:eastAsia="Cambria" w:cs="Cambria"/>
           <w:b w:val="0"/>
-          <w:i w:val="0"/>
           <w:color w:val="33373B"/>
-          <w:sz w:val="18"/>
+          <w:sz w:val="19"/>
         </w:rPr>
-        <w:t>Trabajadora Social titulada con distinción y más de 9 años de experiencia en bienestar laboral, gestión de beneficios y atención social directa, desarrollada en instituciones de educación superior y en empresa privada. Creé desde cero el Departamento de Bienestar Social de una organización con más de 200 colaboradores, administrando el Seguro Complementario de Salud, las licencias médicas y las cargas familiares de la dotación. Luego lideré la gestión de personas y bienestar en la consultora minera Bmining, a cargo de los programas de bienestar, convenios, plan anual de capacitación, clima laboral y de la matriz de riesgo y salud en el trabajo con seguimiento por KPI. Hoy me desempeño en la Universidad de Santiago de Chile, donde realizo evaluaciones socioeconómicas en los sistemas del Ministerio de Educación, gestiono beneficios ministeriales e internos y acompaño casos que requieren articular áreas internas con redes de apoyo. A la atención directa sumo una mirada de proceso: fui auditora interna del Sistema de Gestión Integrado (ISO 9001, 14001 y 45001). Cursando el Diplomado en Bienestar Organizacional y Estrategias de Diversidad e Inclusión (USACH) y certificada como agente Gatekeeper en prevención del suicidio.</w:t>
+        <w:t>Trabajadora Social titulada con distinción y más de 9 años de experiencia en bienestar laboral, gestión de beneficios y atención social directa, desarrollada en instituciones de educación superior y en empresa privada.</w:t>
+      </w:r>
+    </w:p>
+    <w:p>
+      <w:pPr>
+        <w:spacing w:before="100" w:after="0" w:line="283" w:lineRule="auto"/>
+        <w:ind w:left="1644"/>
+        <w:jc w:val="both"/>
+      </w:pPr>
+      <w:r>
+        <w:rPr>
+          <w:rFonts w:ascii="Cambria" w:hAnsi="Cambria" w:eastAsia="Cambria" w:cs="Cambria"/>
+          <w:b w:val="0"/>
+          <w:color w:val="33373B"/>
+          <w:sz w:val="19"/>
+        </w:rPr>
+        <w:t>Creé desde cero el Departamento de Bienestar Social de una organización con más de 200 colaboradores, administrando el Seguro Complementario de Salud, las licencias médicas y las cargas familiares de la dotación. Luego lideré la gestión de personas y bienestar en la consultora minera Bmining, a cargo de los programas de bienestar, convenios, plan anual de capacitación, clima laboral y de la matriz de riesgo y salud en el trabajo con seguimiento por KPI.</w:t>
+      </w:r>
+    </w:p>
+    <w:p>
+      <w:pPr>
+        <w:spacing w:before="100" w:after="0" w:line="283" w:lineRule="auto"/>
+        <w:ind w:left="1644"/>
+        <w:jc w:val="both"/>
+      </w:pPr>
+      <w:r>
+        <w:rPr>
+          <w:rFonts w:ascii="Cambria" w:hAnsi="Cambria" w:eastAsia="Cambria" w:cs="Cambria"/>
+          <w:b w:val="0"/>
+          <w:color w:val="33373B"/>
+          <w:sz w:val="19"/>
+        </w:rPr>
+        <w:t>Hoy me desempeño en la Universidad de Santiago de Chile, donde realizo evaluaciones socioeconómicas en los sistemas del Ministerio de Educación, gestiono beneficios ministeriales e internos y acompaño casos que requieren articular áreas internas con redes de apoyo. A la atención directa sumo una mirada de proceso: fui auditora interna del Sistema de Gestión Integrado (ISO 9001, 14001 y 45001). Cursando el Diplomado en Bienestar Organizacional y Estrategias de Diversidad e Inclusión (USACH) y certificada como agente Gatekeeper en prevención del suicidio.</w:t>
       </w:r>
     </w:p>
     <w:p>
       <w:pPr>
         <w:keepNext/>
         <w:tabs>
-          <w:tab w:pos="1814" w:val="left"/>
+          <w:tab w:pos="1644" w:val="left"/>
         </w:tabs>
-        <w:spacing w:before="260" w:after="0" w:line="288" w:lineRule="auto"/>
-        <w:ind w:left="1814" w:hanging="1814"/>
+        <w:spacing w:before="260" w:after="0" w:line="317" w:lineRule="auto"/>
+        <w:ind w:left="1644" w:hanging="1644"/>
+        <w:jc w:val="left"/>
+        <w:suppressAutoHyphens w:val="1"/>
       </w:pPr>
       <w:r>
         <w:rPr>
           <w:rFonts w:ascii="Calibri" w:hAnsi="Calibri" w:eastAsia="Calibri" w:cs="Calibri"/>
           <w:b/>
-          <w:i w:val="0"/>
           <w:color w:val="6E2130"/>
-          <w:sz w:val="16"/>
+          <w:sz w:val="15"/>
           <w:caps w:val="1"/>
-          <w:spacing w:val="28"/>
+          <w:spacing w:val="20"/>
         </w:rPr>
         <w:t>Expertise</w:t>
       </w:r>
@@ -179,7 +202,6 @@
         <w:rPr>
           <w:rFonts w:ascii="Cambria" w:hAnsi="Cambria" w:eastAsia="Cambria" w:cs="Cambria"/>
           <w:b w:val="0"/>
-          <w:i w:val="0"/>
           <w:color w:val="33373B"/>
           <w:sz w:val="17"/>
         </w:rPr>
@@ -189,7 +211,6 @@
         <w:rPr>
           <w:rFonts w:ascii="Cambria" w:hAnsi="Cambria" w:eastAsia="Cambria" w:cs="Cambria"/>
           <w:b w:val="0"/>
-          <w:i w:val="0"/>
           <w:color w:val="A8ADB2"/>
           <w:sz w:val="17"/>
         </w:rPr>
@@ -199,7 +220,6 @@
         <w:rPr>
           <w:rFonts w:ascii="Cambria" w:hAnsi="Cambria" w:eastAsia="Cambria" w:cs="Cambria"/>
           <w:b w:val="0"/>
-          <w:i w:val="0"/>
           <w:color w:val="33373B"/>
           <w:sz w:val="17"/>
         </w:rPr>
@@ -209,7 +229,6 @@
         <w:rPr>
           <w:rFonts w:ascii="Cambria" w:hAnsi="Cambria" w:eastAsia="Cambria" w:cs="Cambria"/>
           <w:b w:val="0"/>
-          <w:i w:val="0"/>
           <w:color w:val="A8ADB2"/>
           <w:sz w:val="17"/>
         </w:rPr>
@@ -219,7 +238,6 @@
         <w:rPr>
           <w:rFonts w:ascii="Cambria" w:hAnsi="Cambria" w:eastAsia="Cambria" w:cs="Cambria"/>
           <w:b w:val="0"/>
-          <w:i w:val="0"/>
           <w:color w:val="33373B"/>
           <w:sz w:val="17"/>
         </w:rPr>
@@ -229,7 +247,6 @@
         <w:rPr>
           <w:rFonts w:ascii="Cambria" w:hAnsi="Cambria" w:eastAsia="Cambria" w:cs="Cambria"/>
           <w:b w:val="0"/>
-          <w:i w:val="0"/>
           <w:color w:val="A8ADB2"/>
           <w:sz w:val="17"/>
         </w:rPr>
@@ -239,7 +256,6 @@
         <w:rPr>
           <w:rFonts w:ascii="Cambria" w:hAnsi="Cambria" w:eastAsia="Cambria" w:cs="Cambria"/>
           <w:b w:val="0"/>
-          <w:i w:val="0"/>
           <w:color w:val="33373B"/>
           <w:sz w:val="17"/>
         </w:rPr>
@@ -249,7 +265,6 @@
         <w:rPr>
           <w:rFonts w:ascii="Cambria" w:hAnsi="Cambria" w:eastAsia="Cambria" w:cs="Cambria"/>
           <w:b w:val="0"/>
-          <w:i w:val="0"/>
           <w:color w:val="A8ADB2"/>
           <w:sz w:val="17"/>
         </w:rPr>
@@ -259,7 +274,6 @@
         <w:rPr>
           <w:rFonts w:ascii="Cambria" w:hAnsi="Cambria" w:eastAsia="Cambria" w:cs="Cambria"/>
           <w:b w:val="0"/>
-          <w:i w:val="0"/>
           <w:color w:val="33373B"/>
           <w:sz w:val="17"/>
         </w:rPr>
@@ -269,7 +283,6 @@
         <w:rPr>
           <w:rFonts w:ascii="Cambria" w:hAnsi="Cambria" w:eastAsia="Cambria" w:cs="Cambria"/>
           <w:b w:val="0"/>
-          <w:i w:val="0"/>
           <w:color w:val="A8ADB2"/>
           <w:sz w:val="17"/>
         </w:rPr>
@@ -279,7 +292,6 @@
         <w:rPr>
           <w:rFonts w:ascii="Cambria" w:hAnsi="Cambria" w:eastAsia="Cambria" w:cs="Cambria"/>
           <w:b w:val="0"/>
-          <w:i w:val="0"/>
           <w:color w:val="33373B"/>
           <w:sz w:val="17"/>
         </w:rPr>
@@ -289,7 +301,6 @@
         <w:rPr>
           <w:rFonts w:ascii="Cambria" w:hAnsi="Cambria" w:eastAsia="Cambria" w:cs="Cambria"/>
           <w:b w:val="0"/>
-          <w:i w:val="0"/>
           <w:color w:val="A8ADB2"/>
           <w:sz w:val="17"/>
         </w:rPr>
@@ -299,7 +310,6 @@
         <w:rPr>
           <w:rFonts w:ascii="Cambria" w:hAnsi="Cambria" w:eastAsia="Cambria" w:cs="Cambria"/>
           <w:b w:val="0"/>
-          <w:i w:val="0"/>
           <w:color w:val="33373B"/>
           <w:sz w:val="17"/>
         </w:rPr>
@@ -309,7 +319,6 @@
         <w:rPr>
           <w:rFonts w:ascii="Cambria" w:hAnsi="Cambria" w:eastAsia="Cambria" w:cs="Cambria"/>
           <w:b w:val="0"/>
-          <w:i w:val="0"/>
           <w:color w:val="A8ADB2"/>
           <w:sz w:val="17"/>
         </w:rPr>
@@ -319,7 +328,6 @@
         <w:rPr>
           <w:rFonts w:ascii="Cambria" w:hAnsi="Cambria" w:eastAsia="Cambria" w:cs="Cambria"/>
           <w:b w:val="0"/>
-          <w:i w:val="0"/>
           <w:color w:val="33373B"/>
           <w:sz w:val="17"/>
         </w:rPr>
@@ -329,7 +337,6 @@
         <w:rPr>
           <w:rFonts w:ascii="Cambria" w:hAnsi="Cambria" w:eastAsia="Cambria" w:cs="Cambria"/>
           <w:b w:val="0"/>
-          <w:i w:val="0"/>
           <w:color w:val="A8ADB2"/>
           <w:sz w:val="17"/>
         </w:rPr>
@@ -339,7 +346,6 @@
         <w:rPr>
           <w:rFonts w:ascii="Cambria" w:hAnsi="Cambria" w:eastAsia="Cambria" w:cs="Cambria"/>
           <w:b w:val="0"/>
-          <w:i w:val="0"/>
           <w:color w:val="33373B"/>
           <w:sz w:val="17"/>
         </w:rPr>
@@ -349,7 +355,6 @@
         <w:rPr>
           <w:rFonts w:ascii="Cambria" w:hAnsi="Cambria" w:eastAsia="Cambria" w:cs="Cambria"/>
           <w:b w:val="0"/>
-          <w:i w:val="0"/>
           <w:color w:val="A8ADB2"/>
           <w:sz w:val="17"/>
         </w:rPr>
@@ -359,7 +364,6 @@
         <w:rPr>
           <w:rFonts w:ascii="Cambria" w:hAnsi="Cambria" w:eastAsia="Cambria" w:cs="Cambria"/>
           <w:b w:val="0"/>
-          <w:i w:val="0"/>
           <w:color w:val="33373B"/>
           <w:sz w:val="17"/>
         </w:rPr>
@@ -369,7 +373,6 @@
         <w:rPr>
           <w:rFonts w:ascii="Cambria" w:hAnsi="Cambria" w:eastAsia="Cambria" w:cs="Cambria"/>
           <w:b w:val="0"/>
-          <w:i w:val="0"/>
           <w:color w:val="A8ADB2"/>
           <w:sz w:val="17"/>
         </w:rPr>
@@ -379,7 +382,6 @@
         <w:rPr>
           <w:rFonts w:ascii="Cambria" w:hAnsi="Cambria" w:eastAsia="Cambria" w:cs="Cambria"/>
           <w:b w:val="0"/>
-          <w:i w:val="0"/>
           <w:color w:val="33373B"/>
           <w:sz w:val="17"/>
         </w:rPr>
@@ -389,7 +391,6 @@
         <w:rPr>
           <w:rFonts w:ascii="Cambria" w:hAnsi="Cambria" w:eastAsia="Cambria" w:cs="Cambria"/>
           <w:b w:val="0"/>
-          <w:i w:val="0"/>
           <w:color w:val="A8ADB2"/>
           <w:sz w:val="17"/>
         </w:rPr>
@@ -399,7 +400,6 @@
         <w:rPr>
           <w:rFonts w:ascii="Cambria" w:hAnsi="Cambria" w:eastAsia="Cambria" w:cs="Cambria"/>
           <w:b w:val="0"/>
-          <w:i w:val="0"/>
           <w:color w:val="33373B"/>
           <w:sz w:val="17"/>
         </w:rPr>
@@ -409,7 +409,6 @@
         <w:rPr>
           <w:rFonts w:ascii="Cambria" w:hAnsi="Cambria" w:eastAsia="Cambria" w:cs="Cambria"/>
           <w:b w:val="0"/>
-          <w:i w:val="0"/>
           <w:color w:val="A8ADB2"/>
           <w:sz w:val="17"/>
         </w:rPr>
@@ -419,52 +418,30 @@
         <w:rPr>
           <w:rFonts w:ascii="Cambria" w:hAnsi="Cambria" w:eastAsia="Cambria" w:cs="Cambria"/>
           <w:b w:val="0"/>
-          <w:i w:val="0"/>
           <w:color w:val="33373B"/>
           <w:sz w:val="17"/>
         </w:rPr>
         <w:t>Calidad de servicio</w:t>
-      </w:r>
-      <w:r>
-        <w:rPr>
-          <w:rFonts w:ascii="Cambria" w:hAnsi="Cambria" w:eastAsia="Cambria" w:cs="Cambria"/>
-          <w:b w:val="0"/>
-          <w:i w:val="0"/>
-          <w:color w:val="A8ADB2"/>
-          <w:sz w:val="17"/>
-        </w:rPr>
-        <w:t xml:space="preserve">  ·  </w:t>
-      </w:r>
-      <w:r>
-        <w:rPr>
-          <w:rFonts w:ascii="Cambria" w:hAnsi="Cambria" w:eastAsia="Cambria" w:cs="Cambria"/>
-          <w:b w:val="0"/>
-          <w:i w:val="0"/>
-          <w:color w:val="33373B"/>
-          <w:sz w:val="17"/>
-        </w:rPr>
-        <w:t>Normativa laboral y gestión documental</w:t>
       </w:r>
     </w:p>
     <w:p>
       <w:pPr>
         <w:keepNext/>
         <w:tabs>
-          <w:tab w:pos="1814" w:val="left"/>
+          <w:tab w:pos="1644" w:val="left"/>
           <w:tab w:pos="10313" w:val="right"/>
         </w:tabs>
-        <w:spacing w:before="300" w:after="0" w:line="278" w:lineRule="auto"/>
-        <w:ind w:left="1814" w:hanging="1814"/>
+        <w:spacing w:before="320" w:after="0" w:line="278" w:lineRule="auto"/>
+        <w:ind w:left="1644" w:hanging="1644"/>
       </w:pPr>
       <w:r>
         <w:rPr>
           <w:rFonts w:ascii="Calibri" w:hAnsi="Calibri" w:eastAsia="Calibri" w:cs="Calibri"/>
           <w:b/>
-          <w:i w:val="0"/>
           <w:color w:val="6E2130"/>
-          <w:sz w:val="16"/>
+          <w:sz w:val="15"/>
           <w:caps w:val="1"/>
-          <w:spacing w:val="28"/>
+          <w:spacing w:val="20"/>
         </w:rPr>
         <w:t>Experiencia</w:t>
       </w:r>
@@ -475,7 +452,6 @@
         <w:rPr>
           <w:rFonts w:ascii="Cambria" w:hAnsi="Cambria" w:eastAsia="Cambria" w:cs="Cambria"/>
           <w:b/>
-          <w:i w:val="0"/>
           <w:color w:val="16181A"/>
           <w:sz w:val="21"/>
         </w:rPr>
@@ -488,7 +464,6 @@
         <w:rPr>
           <w:rFonts w:ascii="Calibri" w:hAnsi="Calibri" w:eastAsia="Calibri" w:cs="Calibri"/>
           <w:b w:val="0"/>
-          <w:i w:val="0"/>
           <w:color w:val="6C7176"/>
           <w:sz w:val="17"/>
           <w:spacing w:val="14"/>
@@ -499,14 +474,13 @@
     <w:p>
       <w:pPr>
         <w:keepNext/>
-        <w:spacing w:before="40" w:after="90" w:line="278" w:lineRule="auto"/>
-        <w:ind w:left="1814"/>
+        <w:spacing w:before="40" w:after="80" w:line="278" w:lineRule="auto"/>
+        <w:ind w:left="1644"/>
       </w:pPr>
       <w:r>
         <w:rPr>
           <w:rFonts w:ascii="Calibri" w:hAnsi="Calibri" w:eastAsia="Calibri" w:cs="Calibri"/>
           <w:b w:val="0"/>
-          <w:i w:val="0"/>
           <w:color w:val="6C7176"/>
           <w:sz w:val="18"/>
           <w:spacing w:val="8"/>
@@ -516,14 +490,14 @@
     </w:p>
     <w:p>
       <w:pPr>
-        <w:spacing w:before="0" w:after="54" w:line="278" w:lineRule="auto"/>
-        <w:ind w:left="2007" w:hanging="193"/>
+        <w:spacing w:before="0" w:after="88" w:line="278" w:lineRule="auto"/>
+        <w:ind w:left="1837" w:hanging="193"/>
+        <w:jc w:val="both"/>
       </w:pPr>
       <w:r>
         <w:rPr>
           <w:rFonts w:ascii="Cambria" w:hAnsi="Cambria" w:eastAsia="Cambria" w:cs="Cambria"/>
           <w:b w:val="0"/>
-          <w:i w:val="0"/>
           <w:color w:val="6E2130"/>
           <w:sz w:val="17"/>
         </w:rPr>
@@ -536,7 +510,6 @@
         <w:rPr>
           <w:rFonts w:ascii="Cambria" w:hAnsi="Cambria" w:eastAsia="Cambria" w:cs="Cambria"/>
           <w:b w:val="0"/>
-          <w:i w:val="0"/>
           <w:color w:val="33373B"/>
           <w:sz w:val="19"/>
         </w:rPr>
@@ -546,7 +519,6 @@
         <w:rPr>
           <w:rFonts w:ascii="Cambria" w:hAnsi="Cambria" w:eastAsia="Cambria" w:cs="Cambria"/>
           <w:b/>
-          <w:i w:val="0"/>
           <w:color w:val="16181A"/>
           <w:sz w:val="19"/>
         </w:rPr>
@@ -556,7 +528,6 @@
         <w:rPr>
           <w:rFonts w:ascii="Cambria" w:hAnsi="Cambria" w:eastAsia="Cambria" w:cs="Cambria"/>
           <w:b w:val="0"/>
-          <w:i w:val="0"/>
           <w:color w:val="33373B"/>
           <w:sz w:val="19"/>
         </w:rPr>
@@ -565,14 +536,14 @@
     </w:p>
     <w:p>
       <w:pPr>
-        <w:spacing w:before="0" w:after="54" w:line="278" w:lineRule="auto"/>
-        <w:ind w:left="2007" w:hanging="193"/>
+        <w:spacing w:before="0" w:after="88" w:line="278" w:lineRule="auto"/>
+        <w:ind w:left="1837" w:hanging="193"/>
+        <w:jc w:val="both"/>
       </w:pPr>
       <w:r>
         <w:rPr>
           <w:rFonts w:ascii="Cambria" w:hAnsi="Cambria" w:eastAsia="Cambria" w:cs="Cambria"/>
           <w:b w:val="0"/>
-          <w:i w:val="0"/>
           <w:color w:val="6E2130"/>
           <w:sz w:val="17"/>
         </w:rPr>
@@ -585,7 +556,6 @@
         <w:rPr>
           <w:rFonts w:ascii="Cambria" w:hAnsi="Cambria" w:eastAsia="Cambria" w:cs="Cambria"/>
           <w:b w:val="0"/>
-          <w:i w:val="0"/>
           <w:color w:val="33373B"/>
           <w:sz w:val="19"/>
         </w:rPr>
@@ -595,7 +565,6 @@
         <w:rPr>
           <w:rFonts w:ascii="Cambria" w:hAnsi="Cambria" w:eastAsia="Cambria" w:cs="Cambria"/>
           <w:b/>
-          <w:i w:val="0"/>
           <w:color w:val="16181A"/>
           <w:sz w:val="19"/>
         </w:rPr>
@@ -605,7 +574,6 @@
         <w:rPr>
           <w:rFonts w:ascii="Cambria" w:hAnsi="Cambria" w:eastAsia="Cambria" w:cs="Cambria"/>
           <w:b w:val="0"/>
-          <w:i w:val="0"/>
           <w:color w:val="33373B"/>
           <w:sz w:val="19"/>
         </w:rPr>
@@ -614,14 +582,14 @@
     </w:p>
     <w:p>
       <w:pPr>
-        <w:spacing w:before="0" w:after="54" w:line="278" w:lineRule="auto"/>
-        <w:ind w:left="2007" w:hanging="193"/>
+        <w:spacing w:before="0" w:after="88" w:line="278" w:lineRule="auto"/>
+        <w:ind w:left="1837" w:hanging="193"/>
+        <w:jc w:val="both"/>
       </w:pPr>
       <w:r>
         <w:rPr>
           <w:rFonts w:ascii="Cambria" w:hAnsi="Cambria" w:eastAsia="Cambria" w:cs="Cambria"/>
           <w:b w:val="0"/>
-          <w:i w:val="0"/>
           <w:color w:val="6E2130"/>
           <w:sz w:val="17"/>
         </w:rPr>
@@ -634,7 +602,6 @@
         <w:rPr>
           <w:rFonts w:ascii="Cambria" w:hAnsi="Cambria" w:eastAsia="Cambria" w:cs="Cambria"/>
           <w:b w:val="0"/>
-          <w:i w:val="0"/>
           <w:color w:val="33373B"/>
           <w:sz w:val="19"/>
         </w:rPr>
@@ -644,7 +611,6 @@
         <w:rPr>
           <w:rFonts w:ascii="Cambria" w:hAnsi="Cambria" w:eastAsia="Cambria" w:cs="Cambria"/>
           <w:b/>
-          <w:i w:val="0"/>
           <w:color w:val="16181A"/>
           <w:sz w:val="19"/>
         </w:rPr>
@@ -654,7 +620,6 @@
         <w:rPr>
           <w:rFonts w:ascii="Cambria" w:hAnsi="Cambria" w:eastAsia="Cambria" w:cs="Cambria"/>
           <w:b w:val="0"/>
-          <w:i w:val="0"/>
           <w:color w:val="33373B"/>
           <w:sz w:val="19"/>
         </w:rPr>
@@ -663,14 +628,14 @@
     </w:p>
     <w:p>
       <w:pPr>
-        <w:spacing w:before="0" w:after="54" w:line="278" w:lineRule="auto"/>
-        <w:ind w:left="2007" w:hanging="193"/>
+        <w:spacing w:before="0" w:after="88" w:line="278" w:lineRule="auto"/>
+        <w:ind w:left="1837" w:hanging="193"/>
+        <w:jc w:val="both"/>
       </w:pPr>
       <w:r>
         <w:rPr>
           <w:rFonts w:ascii="Cambria" w:hAnsi="Cambria" w:eastAsia="Cambria" w:cs="Cambria"/>
           <w:b w:val="0"/>
-          <w:i w:val="0"/>
           <w:color w:val="6E2130"/>
           <w:sz w:val="17"/>
         </w:rPr>
@@ -683,7 +648,6 @@
         <w:rPr>
           <w:rFonts w:ascii="Cambria" w:hAnsi="Cambria" w:eastAsia="Cambria" w:cs="Cambria"/>
           <w:b/>
-          <w:i w:val="0"/>
           <w:color w:val="16181A"/>
           <w:sz w:val="19"/>
         </w:rPr>
@@ -693,7 +657,6 @@
         <w:rPr>
           <w:rFonts w:ascii="Cambria" w:hAnsi="Cambria" w:eastAsia="Cambria" w:cs="Cambria"/>
           <w:b w:val="0"/>
-          <w:i w:val="0"/>
           <w:color w:val="33373B"/>
           <w:sz w:val="19"/>
         </w:rPr>
@@ -702,14 +665,14 @@
     </w:p>
     <w:p>
       <w:pPr>
-        <w:spacing w:before="0" w:after="54" w:line="278" w:lineRule="auto"/>
-        <w:ind w:left="2007" w:hanging="193"/>
+        <w:spacing w:before="0" w:after="88" w:line="278" w:lineRule="auto"/>
+        <w:ind w:left="1837" w:hanging="193"/>
+        <w:jc w:val="both"/>
       </w:pPr>
       <w:r>
         <w:rPr>
           <w:rFonts w:ascii="Cambria" w:hAnsi="Cambria" w:eastAsia="Cambria" w:cs="Cambria"/>
           <w:b w:val="0"/>
-          <w:i w:val="0"/>
           <w:color w:val="6E2130"/>
           <w:sz w:val="17"/>
         </w:rPr>
@@ -722,7 +685,6 @@
         <w:rPr>
           <w:rFonts w:ascii="Cambria" w:hAnsi="Cambria" w:eastAsia="Cambria" w:cs="Cambria"/>
           <w:b w:val="0"/>
-          <w:i w:val="0"/>
           <w:color w:val="33373B"/>
           <w:sz w:val="19"/>
         </w:rPr>
@@ -732,7 +694,6 @@
         <w:rPr>
           <w:rFonts w:ascii="Cambria" w:hAnsi="Cambria" w:eastAsia="Cambria" w:cs="Cambria"/>
           <w:b/>
-          <w:i w:val="0"/>
           <w:color w:val="16181A"/>
           <w:sz w:val="19"/>
         </w:rPr>
@@ -742,7 +703,6 @@
         <w:rPr>
           <w:rFonts w:ascii="Cambria" w:hAnsi="Cambria" w:eastAsia="Cambria" w:cs="Cambria"/>
           <w:b w:val="0"/>
-          <w:i w:val="0"/>
           <w:color w:val="33373B"/>
           <w:sz w:val="19"/>
         </w:rPr>
@@ -755,14 +715,13 @@
         <w:tabs>
           <w:tab w:pos="10313" w:val="right"/>
         </w:tabs>
-        <w:spacing w:before="180" w:after="0" w:line="278" w:lineRule="auto"/>
-        <w:ind w:left="1814"/>
+        <w:spacing w:before="210" w:after="0" w:line="278" w:lineRule="auto"/>
+        <w:ind w:left="1644"/>
       </w:pPr>
       <w:r>
         <w:rPr>
           <w:rFonts w:ascii="Cambria" w:hAnsi="Cambria" w:eastAsia="Cambria" w:cs="Cambria"/>
           <w:b/>
-          <w:i w:val="0"/>
           <w:color w:val="16181A"/>
           <w:sz w:val="21"/>
         </w:rPr>
@@ -775,7 +734,6 @@
         <w:rPr>
           <w:rFonts w:ascii="Calibri" w:hAnsi="Calibri" w:eastAsia="Calibri" w:cs="Calibri"/>
           <w:b w:val="0"/>
-          <w:i w:val="0"/>
           <w:color w:val="6C7176"/>
           <w:sz w:val="17"/>
           <w:spacing w:val="14"/>
@@ -786,14 +744,13 @@
     <w:p>
       <w:pPr>
         <w:keepNext/>
-        <w:spacing w:before="40" w:after="90" w:line="278" w:lineRule="auto"/>
-        <w:ind w:left="1814"/>
+        <w:spacing w:before="40" w:after="80" w:line="278" w:lineRule="auto"/>
+        <w:ind w:left="1644"/>
       </w:pPr>
       <w:r>
         <w:rPr>
           <w:rFonts w:ascii="Calibri" w:hAnsi="Calibri" w:eastAsia="Calibri" w:cs="Calibri"/>
           <w:b w:val="0"/>
-          <w:i w:val="0"/>
           <w:color w:val="6C7176"/>
           <w:sz w:val="18"/>
           <w:spacing w:val="8"/>
@@ -803,14 +760,14 @@
     </w:p>
     <w:p>
       <w:pPr>
-        <w:spacing w:before="0" w:after="54" w:line="278" w:lineRule="auto"/>
-        <w:ind w:left="2007" w:hanging="193"/>
+        <w:spacing w:before="0" w:after="88" w:line="278" w:lineRule="auto"/>
+        <w:ind w:left="1837" w:hanging="193"/>
+        <w:jc w:val="both"/>
       </w:pPr>
       <w:r>
         <w:rPr>
           <w:rFonts w:ascii="Cambria" w:hAnsi="Cambria" w:eastAsia="Cambria" w:cs="Cambria"/>
           <w:b w:val="0"/>
-          <w:i w:val="0"/>
           <w:color w:val="6E2130"/>
           <w:sz w:val="17"/>
         </w:rPr>
@@ -823,7 +780,6 @@
         <w:rPr>
           <w:rFonts w:ascii="Cambria" w:hAnsi="Cambria" w:eastAsia="Cambria" w:cs="Cambria"/>
           <w:b w:val="0"/>
-          <w:i w:val="0"/>
           <w:color w:val="33373B"/>
           <w:sz w:val="19"/>
         </w:rPr>
@@ -833,7 +789,6 @@
         <w:rPr>
           <w:rFonts w:ascii="Cambria" w:hAnsi="Cambria" w:eastAsia="Cambria" w:cs="Cambria"/>
           <w:b/>
-          <w:i w:val="0"/>
           <w:color w:val="16181A"/>
           <w:sz w:val="19"/>
         </w:rPr>
@@ -843,7 +798,6 @@
         <w:rPr>
           <w:rFonts w:ascii="Cambria" w:hAnsi="Cambria" w:eastAsia="Cambria" w:cs="Cambria"/>
           <w:b w:val="0"/>
-          <w:i w:val="0"/>
           <w:color w:val="33373B"/>
           <w:sz w:val="19"/>
         </w:rPr>
@@ -852,14 +806,14 @@
     </w:p>
     <w:p>
       <w:pPr>
-        <w:spacing w:before="0" w:after="54" w:line="278" w:lineRule="auto"/>
-        <w:ind w:left="2007" w:hanging="193"/>
+        <w:spacing w:before="0" w:after="88" w:line="278" w:lineRule="auto"/>
+        <w:ind w:left="1837" w:hanging="193"/>
+        <w:jc w:val="both"/>
       </w:pPr>
       <w:r>
         <w:rPr>
           <w:rFonts w:ascii="Cambria" w:hAnsi="Cambria" w:eastAsia="Cambria" w:cs="Cambria"/>
           <w:b w:val="0"/>
-          <w:i w:val="0"/>
           <w:color w:val="6E2130"/>
           <w:sz w:val="17"/>
         </w:rPr>
@@ -872,7 +826,6 @@
         <w:rPr>
           <w:rFonts w:ascii="Cambria" w:hAnsi="Cambria" w:eastAsia="Cambria" w:cs="Cambria"/>
           <w:b w:val="0"/>
-          <w:i w:val="0"/>
           <w:color w:val="33373B"/>
           <w:sz w:val="19"/>
         </w:rPr>
@@ -882,7 +835,6 @@
         <w:rPr>
           <w:rFonts w:ascii="Cambria" w:hAnsi="Cambria" w:eastAsia="Cambria" w:cs="Cambria"/>
           <w:b/>
-          <w:i w:val="0"/>
           <w:color w:val="16181A"/>
           <w:sz w:val="19"/>
         </w:rPr>
@@ -892,7 +844,6 @@
         <w:rPr>
           <w:rFonts w:ascii="Cambria" w:hAnsi="Cambria" w:eastAsia="Cambria" w:cs="Cambria"/>
           <w:b w:val="0"/>
-          <w:i w:val="0"/>
           <w:color w:val="33373B"/>
           <w:sz w:val="19"/>
         </w:rPr>
@@ -901,14 +852,14 @@
     </w:p>
     <w:p>
       <w:pPr>
-        <w:spacing w:before="0" w:after="54" w:line="278" w:lineRule="auto"/>
-        <w:ind w:left="2007" w:hanging="193"/>
+        <w:spacing w:before="0" w:after="88" w:line="278" w:lineRule="auto"/>
+        <w:ind w:left="1837" w:hanging="193"/>
+        <w:jc w:val="both"/>
       </w:pPr>
       <w:r>
         <w:rPr>
           <w:rFonts w:ascii="Cambria" w:hAnsi="Cambria" w:eastAsia="Cambria" w:cs="Cambria"/>
           <w:b w:val="0"/>
-          <w:i w:val="0"/>
           <w:color w:val="6E2130"/>
           <w:sz w:val="17"/>
         </w:rPr>
@@ -921,43 +872,40 @@
         <w:rPr>
           <w:rFonts w:ascii="Cambria" w:hAnsi="Cambria" w:eastAsia="Cambria" w:cs="Cambria"/>
           <w:b w:val="0"/>
-          <w:i w:val="0"/>
           <w:color w:val="33373B"/>
           <w:sz w:val="19"/>
         </w:rPr>
-        <w:t xml:space="preserve">Estuve a cargo del área de Recursos Humanos en </w:t>
+        <w:t xml:space="preserve">Organicé </w:t>
       </w:r>
       <w:r>
         <w:rPr>
           <w:rFonts w:ascii="Cambria" w:hAnsi="Cambria" w:eastAsia="Cambria" w:cs="Cambria"/>
           <w:b/>
-          <w:i w:val="0"/>
           <w:color w:val="16181A"/>
           <w:sz w:val="19"/>
         </w:rPr>
-        <w:t>selección e inducción</w:t>
+        <w:t>actividades corporativas de bienestar e integración</w:t>
       </w:r>
       <w:r>
         <w:rPr>
           <w:rFonts w:ascii="Cambria" w:hAnsi="Cambria" w:eastAsia="Cambria" w:cs="Cambria"/>
           <w:b w:val="0"/>
-          <w:i w:val="0"/>
           <w:color w:val="33373B"/>
           <w:sz w:val="19"/>
         </w:rPr>
-        <w:t>, y lideré el plan anual de capacitaciones internas.</w:t>
+        <w:t>, articulando a las distintas áreas para asegurar convocatoria y buena ejecución.</w:t>
       </w:r>
     </w:p>
     <w:p>
       <w:pPr>
-        <w:spacing w:before="0" w:after="54" w:line="278" w:lineRule="auto"/>
-        <w:ind w:left="2007" w:hanging="193"/>
+        <w:spacing w:before="0" w:after="88" w:line="278" w:lineRule="auto"/>
+        <w:ind w:left="1837" w:hanging="193"/>
+        <w:jc w:val="both"/>
       </w:pPr>
       <w:r>
         <w:rPr>
           <w:rFonts w:ascii="Cambria" w:hAnsi="Cambria" w:eastAsia="Cambria" w:cs="Cambria"/>
           <w:b w:val="0"/>
-          <w:i w:val="0"/>
           <w:color w:val="6E2130"/>
           <w:sz w:val="17"/>
         </w:rPr>
@@ -970,7 +918,6 @@
         <w:rPr>
           <w:rFonts w:ascii="Cambria" w:hAnsi="Cambria" w:eastAsia="Cambria" w:cs="Cambria"/>
           <w:b w:val="0"/>
-          <w:i w:val="0"/>
           <w:color w:val="33373B"/>
           <w:sz w:val="19"/>
         </w:rPr>
@@ -980,7 +927,6 @@
         <w:rPr>
           <w:rFonts w:ascii="Cambria" w:hAnsi="Cambria" w:eastAsia="Cambria" w:cs="Cambria"/>
           <w:b/>
-          <w:i w:val="0"/>
           <w:color w:val="16181A"/>
           <w:sz w:val="19"/>
         </w:rPr>
@@ -990,7 +936,6 @@
         <w:rPr>
           <w:rFonts w:ascii="Cambria" w:hAnsi="Cambria" w:eastAsia="Cambria" w:cs="Cambria"/>
           <w:b w:val="0"/>
-          <w:i w:val="0"/>
           <w:color w:val="33373B"/>
           <w:sz w:val="19"/>
         </w:rPr>
@@ -999,14 +944,14 @@
     </w:p>
     <w:p>
       <w:pPr>
-        <w:spacing w:before="0" w:after="54" w:line="278" w:lineRule="auto"/>
-        <w:ind w:left="2007" w:hanging="193"/>
+        <w:spacing w:before="0" w:after="88" w:line="278" w:lineRule="auto"/>
+        <w:ind w:left="1837" w:hanging="193"/>
+        <w:jc w:val="both"/>
       </w:pPr>
       <w:r>
         <w:rPr>
           <w:rFonts w:ascii="Cambria" w:hAnsi="Cambria" w:eastAsia="Cambria" w:cs="Cambria"/>
           <w:b w:val="0"/>
-          <w:i w:val="0"/>
           <w:color w:val="6E2130"/>
           <w:sz w:val="17"/>
         </w:rPr>
@@ -1019,43 +964,40 @@
         <w:rPr>
           <w:rFonts w:ascii="Cambria" w:hAnsi="Cambria" w:eastAsia="Cambria" w:cs="Cambria"/>
           <w:b w:val="0"/>
-          <w:i w:val="0"/>
           <w:color w:val="33373B"/>
           <w:sz w:val="19"/>
         </w:rPr>
-        <w:t xml:space="preserve">Impulsé el </w:t>
+        <w:t xml:space="preserve">Lideré el </w:t>
       </w:r>
       <w:r>
         <w:rPr>
           <w:rFonts w:ascii="Cambria" w:hAnsi="Cambria" w:eastAsia="Cambria" w:cs="Cambria"/>
           <w:b/>
-          <w:i w:val="0"/>
           <w:color w:val="16181A"/>
           <w:sz w:val="19"/>
         </w:rPr>
-        <w:t>programa de cuidado del medio ambiente</w:t>
+        <w:t>plan anual de capacitaciones internas</w:t>
       </w:r>
       <w:r>
         <w:rPr>
           <w:rFonts w:ascii="Cambria" w:hAnsi="Cambria" w:eastAsia="Cambria" w:cs="Cambria"/>
           <w:b w:val="0"/>
-          <w:i w:val="0"/>
           <w:color w:val="33373B"/>
           <w:sz w:val="19"/>
         </w:rPr>
-        <w:t xml:space="preserve"> con actividades semanales y seguimiento, con participación de toda la organización desde la gerencia general en adelante.</w:t>
+        <w:t xml:space="preserve"> de la compañía.</w:t>
       </w:r>
     </w:p>
     <w:p>
       <w:pPr>
-        <w:spacing w:before="0" w:after="54" w:line="278" w:lineRule="auto"/>
-        <w:ind w:left="2007" w:hanging="193"/>
+        <w:spacing w:before="0" w:after="88" w:line="278" w:lineRule="auto"/>
+        <w:ind w:left="1837" w:hanging="193"/>
+        <w:jc w:val="both"/>
       </w:pPr>
       <w:r>
         <w:rPr>
           <w:rFonts w:ascii="Cambria" w:hAnsi="Cambria" w:eastAsia="Cambria" w:cs="Cambria"/>
           <w:b w:val="0"/>
-          <w:i w:val="0"/>
           <w:color w:val="6E2130"/>
           <w:sz w:val="17"/>
         </w:rPr>
@@ -1068,43 +1010,89 @@
         <w:rPr>
           <w:rFonts w:ascii="Cambria" w:hAnsi="Cambria" w:eastAsia="Cambria" w:cs="Cambria"/>
           <w:b w:val="0"/>
-          <w:i w:val="0"/>
           <w:color w:val="33373B"/>
           <w:sz w:val="19"/>
         </w:rPr>
-        <w:t xml:space="preserve">Organicé </w:t>
+        <w:t xml:space="preserve">Asumí durante un año el </w:t>
       </w:r>
       <w:r>
         <w:rPr>
           <w:rFonts w:ascii="Cambria" w:hAnsi="Cambria" w:eastAsia="Cambria" w:cs="Cambria"/>
           <w:b/>
-          <w:i w:val="0"/>
           <w:color w:val="16181A"/>
           <w:sz w:val="19"/>
         </w:rPr>
-        <w:t>actividades corporativas de bienestar e integración</w:t>
+        <w:t>Sistema de Gestión Integrado como auditora interna</w:t>
       </w:r>
       <w:r>
         <w:rPr>
           <w:rFonts w:ascii="Cambria" w:hAnsi="Cambria" w:eastAsia="Cambria" w:cs="Cambria"/>
           <w:b w:val="0"/>
-          <w:i w:val="0"/>
           <w:color w:val="33373B"/>
           <w:sz w:val="19"/>
         </w:rPr>
-        <w:t>, articulando a las distintas áreas para asegurar convocatoria y buena ejecución.</w:t>
+        <w:t xml:space="preserve"> en las certificaciones ISO 9001:2015, ISO 14001:2015 e ISO 45001:2018 (Seguridad y Salud en el Trabajo).</w:t>
       </w:r>
     </w:p>
     <w:p>
       <w:pPr>
-        <w:spacing w:before="0" w:after="54" w:line="278" w:lineRule="auto"/>
-        <w:ind w:left="2007" w:hanging="193"/>
+        <w:keepNext/>
+        <w:tabs>
+          <w:tab w:pos="10313" w:val="right"/>
+        </w:tabs>
+        <w:spacing w:before="320" w:after="0" w:line="278" w:lineRule="auto"/>
+        <w:ind w:left="1644"/>
+      </w:pPr>
+      <w:r>
+        <w:rPr>
+          <w:rFonts w:ascii="Cambria" w:hAnsi="Cambria" w:eastAsia="Cambria" w:cs="Cambria"/>
+          <w:b/>
+          <w:color w:val="16181A"/>
+          <w:sz w:val="21"/>
+        </w:rPr>
+        <w:t>Fundación Fondo Esperanza</w:t>
+      </w:r>
+      <w:r>
+        <w:tab/>
+      </w:r>
+      <w:r>
+        <w:rPr>
+          <w:rFonts w:ascii="Calibri" w:hAnsi="Calibri" w:eastAsia="Calibri" w:cs="Calibri"/>
+          <w:b w:val="0"/>
+          <w:color w:val="6C7176"/>
+          <w:sz w:val="17"/>
+          <w:spacing w:val="14"/>
+        </w:rPr>
+        <w:t>Octubre 2017 – Septiembre 2018</w:t>
+      </w:r>
+    </w:p>
+    <w:p>
+      <w:pPr>
+        <w:keepNext/>
+        <w:spacing w:before="40" w:after="80" w:line="278" w:lineRule="auto"/>
+        <w:ind w:left="1644"/>
+      </w:pPr>
+      <w:r>
+        <w:rPr>
+          <w:rFonts w:ascii="Calibri" w:hAnsi="Calibri" w:eastAsia="Calibri" w:cs="Calibri"/>
+          <w:b w:val="0"/>
+          <w:color w:val="6C7176"/>
+          <w:sz w:val="18"/>
+          <w:spacing w:val="8"/>
+        </w:rPr>
+        <w:t>Monitora · Grupo Emprendedores</w:t>
+      </w:r>
+    </w:p>
+    <w:p>
+      <w:pPr>
+        <w:spacing w:before="0" w:after="88" w:line="278" w:lineRule="auto"/>
+        <w:ind w:left="1837" w:hanging="193"/>
+        <w:jc w:val="both"/>
       </w:pPr>
       <w:r>
         <w:rPr>
           <w:rFonts w:ascii="Cambria" w:hAnsi="Cambria" w:eastAsia="Cambria" w:cs="Cambria"/>
           <w:b w:val="0"/>
-          <w:i w:val="0"/>
           <w:color w:val="6E2130"/>
           <w:sz w:val="17"/>
         </w:rPr>
@@ -1117,95 +1105,40 @@
         <w:rPr>
           <w:rFonts w:ascii="Cambria" w:hAnsi="Cambria" w:eastAsia="Cambria" w:cs="Cambria"/>
           <w:b w:val="0"/>
-          <w:i w:val="0"/>
           <w:color w:val="33373B"/>
           <w:sz w:val="19"/>
         </w:rPr>
-        <w:t xml:space="preserve">Asumí durante un año el </w:t>
+        <w:t xml:space="preserve">Diseñé y dicté </w:t>
       </w:r>
       <w:r>
         <w:rPr>
           <w:rFonts w:ascii="Cambria" w:hAnsi="Cambria" w:eastAsia="Cambria" w:cs="Cambria"/>
           <w:b/>
-          <w:i w:val="0"/>
           <w:color w:val="16181A"/>
           <w:sz w:val="19"/>
         </w:rPr>
-        <w:t>Sistema de Gestión Integrado como auditora interna</w:t>
+        <w:t>capacitaciones</w:t>
       </w:r>
       <w:r>
         <w:rPr>
           <w:rFonts w:ascii="Cambria" w:hAnsi="Cambria" w:eastAsia="Cambria" w:cs="Cambria"/>
           <w:b w:val="0"/>
-          <w:i w:val="0"/>
           <w:color w:val="33373B"/>
           <w:sz w:val="19"/>
         </w:rPr>
-        <w:t xml:space="preserve"> en las certificaciones ISO 9001:2015 (Calidad), ISO 14001:2015 (Medio Ambiente) e ISO 45001:2018 (Seguridad y Salud en el Trabajo).</w:t>
+        <w:t xml:space="preserve"> para emprendedores, con metodologías prácticas y grupales, y acompañé la gestión de sus proyectos revisando con cada participante qué reforzar.</w:t>
       </w:r>
     </w:p>
     <w:p>
       <w:pPr>
-        <w:keepNext/>
-        <w:tabs>
-          <w:tab w:pos="10313" w:val="right"/>
-        </w:tabs>
-        <w:spacing w:before="180" w:after="0" w:line="278" w:lineRule="auto"/>
-        <w:ind w:left="1814"/>
-      </w:pPr>
-      <w:r>
-        <w:rPr>
-          <w:rFonts w:ascii="Cambria" w:hAnsi="Cambria" w:eastAsia="Cambria" w:cs="Cambria"/>
-          <w:b/>
-          <w:i w:val="0"/>
-          <w:color w:val="16181A"/>
-          <w:sz w:val="21"/>
-        </w:rPr>
-        <w:t>Fundación Fondo Esperanza</w:t>
-      </w:r>
-      <w:r>
-        <w:tab/>
-      </w:r>
-      <w:r>
-        <w:rPr>
-          <w:rFonts w:ascii="Calibri" w:hAnsi="Calibri" w:eastAsia="Calibri" w:cs="Calibri"/>
-          <w:b w:val="0"/>
-          <w:i w:val="0"/>
-          <w:color w:val="6C7176"/>
-          <w:sz w:val="17"/>
-          <w:spacing w:val="14"/>
-        </w:rPr>
-        <w:t>Octubre 2017 – Septiembre 2018</w:t>
-      </w:r>
-    </w:p>
-    <w:p>
-      <w:pPr>
-        <w:keepNext/>
-        <w:spacing w:before="40" w:after="90" w:line="278" w:lineRule="auto"/>
-        <w:ind w:left="1814"/>
-      </w:pPr>
-      <w:r>
-        <w:rPr>
-          <w:rFonts w:ascii="Calibri" w:hAnsi="Calibri" w:eastAsia="Calibri" w:cs="Calibri"/>
-          <w:b w:val="0"/>
-          <w:i w:val="0"/>
-          <w:color w:val="6C7176"/>
-          <w:sz w:val="18"/>
-          <w:spacing w:val="8"/>
-        </w:rPr>
-        <w:t>Monitora · Grupo Emprendedores</w:t>
-      </w:r>
-    </w:p>
-    <w:p>
-      <w:pPr>
-        <w:spacing w:before="0" w:after="54" w:line="278" w:lineRule="auto"/>
-        <w:ind w:left="2007" w:hanging="193"/>
+        <w:spacing w:before="0" w:after="88" w:line="278" w:lineRule="auto"/>
+        <w:ind w:left="1837" w:hanging="193"/>
+        <w:jc w:val="both"/>
       </w:pPr>
       <w:r>
         <w:rPr>
           <w:rFonts w:ascii="Cambria" w:hAnsi="Cambria" w:eastAsia="Cambria" w:cs="Cambria"/>
           <w:b w:val="0"/>
-          <w:i w:val="0"/>
           <w:color w:val="6E2130"/>
           <w:sz w:val="17"/>
         </w:rPr>
@@ -1218,43 +1151,89 @@
         <w:rPr>
           <w:rFonts w:ascii="Cambria" w:hAnsi="Cambria" w:eastAsia="Cambria" w:cs="Cambria"/>
           <w:b w:val="0"/>
-          <w:i w:val="0"/>
           <w:color w:val="33373B"/>
           <w:sz w:val="19"/>
         </w:rPr>
-        <w:t xml:space="preserve">Diseñé y dicté </w:t>
+        <w:t xml:space="preserve">Orienté a los emprendedores en materia de </w:t>
       </w:r>
       <w:r>
         <w:rPr>
           <w:rFonts w:ascii="Cambria" w:hAnsi="Cambria" w:eastAsia="Cambria" w:cs="Cambria"/>
           <w:b/>
-          <w:i w:val="0"/>
           <w:color w:val="16181A"/>
           <w:sz w:val="19"/>
         </w:rPr>
-        <w:t>capacitaciones</w:t>
+        <w:t>vivienda</w:t>
       </w:r>
       <w:r>
         <w:rPr>
           <w:rFonts w:ascii="Cambria" w:hAnsi="Cambria" w:eastAsia="Cambria" w:cs="Cambria"/>
           <w:b w:val="0"/>
-          <w:i w:val="0"/>
           <w:color w:val="33373B"/>
           <w:sz w:val="19"/>
         </w:rPr>
-        <w:t xml:space="preserve"> para emprendedores que estaban partiendo o buscando hacer crecer su negocio, con metodologías prácticas y grupales.</w:t>
+        <w:t>, articulando con las redes de la comuna, y los vinculé con recursos disponibles que muchas veces no sabían que tenían a su alcance.</w:t>
       </w:r>
     </w:p>
     <w:p>
       <w:pPr>
-        <w:spacing w:before="0" w:after="54" w:line="278" w:lineRule="auto"/>
-        <w:ind w:left="2007" w:hanging="193"/>
+        <w:keepNext/>
+        <w:tabs>
+          <w:tab w:pos="10313" w:val="right"/>
+        </w:tabs>
+        <w:spacing w:before="360" w:after="0" w:line="278" w:lineRule="auto"/>
+        <w:ind w:left="1644"/>
+      </w:pPr>
+      <w:r>
+        <w:rPr>
+          <w:rFonts w:ascii="Cambria" w:hAnsi="Cambria" w:eastAsia="Cambria" w:cs="Cambria"/>
+          <w:b/>
+          <w:color w:val="16181A"/>
+          <w:sz w:val="21"/>
+        </w:rPr>
+        <w:t>Ferretería San Francisco</w:t>
+      </w:r>
+      <w:r>
+        <w:tab/>
+      </w:r>
+      <w:r>
+        <w:rPr>
+          <w:rFonts w:ascii="Calibri" w:hAnsi="Calibri" w:eastAsia="Calibri" w:cs="Calibri"/>
+          <w:b w:val="0"/>
+          <w:color w:val="6C7176"/>
+          <w:sz w:val="17"/>
+          <w:spacing w:val="14"/>
+        </w:rPr>
+        <w:t>Diciembre 2016 – Septiembre 2017</w:t>
+      </w:r>
+    </w:p>
+    <w:p>
+      <w:pPr>
+        <w:keepNext/>
+        <w:spacing w:before="40" w:after="80" w:line="278" w:lineRule="auto"/>
+        <w:ind w:left="1644"/>
+      </w:pPr>
+      <w:r>
+        <w:rPr>
+          <w:rFonts w:ascii="Calibri" w:hAnsi="Calibri" w:eastAsia="Calibri" w:cs="Calibri"/>
+          <w:b w:val="0"/>
+          <w:color w:val="6C7176"/>
+          <w:sz w:val="18"/>
+          <w:spacing w:val="8"/>
+        </w:rPr>
+        <w:t>Encargada · Departamento de Bienestar Social</w:t>
+      </w:r>
+    </w:p>
+    <w:p>
+      <w:pPr>
+        <w:spacing w:before="0" w:after="88" w:line="278" w:lineRule="auto"/>
+        <w:ind w:left="1837" w:hanging="193"/>
+        <w:jc w:val="both"/>
       </w:pPr>
       <w:r>
         <w:rPr>
           <w:rFonts w:ascii="Cambria" w:hAnsi="Cambria" w:eastAsia="Cambria" w:cs="Cambria"/>
           <w:b w:val="0"/>
-          <w:i w:val="0"/>
           <w:color w:val="6E2130"/>
           <w:sz w:val="17"/>
         </w:rPr>
@@ -1267,33 +1246,31 @@
         <w:rPr>
           <w:rFonts w:ascii="Cambria" w:hAnsi="Cambria" w:eastAsia="Cambria" w:cs="Cambria"/>
           <w:b/>
-          <w:i w:val="0"/>
           <w:color w:val="16181A"/>
           <w:sz w:val="19"/>
         </w:rPr>
-        <w:t>Acompañé la gestión de sus proyectos</w:t>
+        <w:t>Creé desde cero el área de Bienestar Social</w:t>
       </w:r>
       <w:r>
         <w:rPr>
           <w:rFonts w:ascii="Cambria" w:hAnsi="Cambria" w:eastAsia="Cambria" w:cs="Cambria"/>
           <w:b w:val="0"/>
-          <w:i w:val="0"/>
           <w:color w:val="33373B"/>
           <w:sz w:val="19"/>
         </w:rPr>
-        <w:t>, revisando con cada participante qué reforzar para alcanzar sus objetivos.</w:t>
+        <w:t xml:space="preserve"> para una dotación de más de 200 colaboradores, definiendo la planificación de actividades y beneficios.</w:t>
       </w:r>
     </w:p>
     <w:p>
       <w:pPr>
-        <w:spacing w:before="0" w:after="54" w:line="278" w:lineRule="auto"/>
-        <w:ind w:left="2007" w:hanging="193"/>
+        <w:spacing w:before="0" w:after="88" w:line="278" w:lineRule="auto"/>
+        <w:ind w:left="1837" w:hanging="193"/>
+        <w:jc w:val="both"/>
       </w:pPr>
       <w:r>
         <w:rPr>
           <w:rFonts w:ascii="Cambria" w:hAnsi="Cambria" w:eastAsia="Cambria" w:cs="Cambria"/>
           <w:b w:val="0"/>
-          <w:i w:val="0"/>
           <w:color w:val="6E2130"/>
           <w:sz w:val="17"/>
         </w:rPr>
@@ -1306,134 +1283,40 @@
         <w:rPr>
           <w:rFonts w:ascii="Cambria" w:hAnsi="Cambria" w:eastAsia="Cambria" w:cs="Cambria"/>
           <w:b w:val="0"/>
-          <w:i w:val="0"/>
           <w:color w:val="33373B"/>
           <w:sz w:val="19"/>
         </w:rPr>
-        <w:t xml:space="preserve">Orienté a los emprendedores en materia de </w:t>
+        <w:t xml:space="preserve">Administré el </w:t>
       </w:r>
       <w:r>
         <w:rPr>
           <w:rFonts w:ascii="Cambria" w:hAnsi="Cambria" w:eastAsia="Cambria" w:cs="Cambria"/>
           <w:b/>
-          <w:i w:val="0"/>
           <w:color w:val="16181A"/>
           <w:sz w:val="19"/>
         </w:rPr>
-        <w:t>vivienda</w:t>
+        <w:t>Seguro Complementario de Salud</w:t>
       </w:r>
       <w:r>
         <w:rPr>
           <w:rFonts w:ascii="Cambria" w:hAnsi="Cambria" w:eastAsia="Cambria" w:cs="Cambria"/>
           <w:b w:val="0"/>
-          <w:i w:val="0"/>
           <w:color w:val="33373B"/>
           <w:sz w:val="19"/>
         </w:rPr>
-        <w:t>, articulando con las redes de la comuna, y los vinculé con recursos disponibles que muchas veces no sabían que tenían a su alcance.</w:t>
+        <w:t xml:space="preserve"> de la dotación, apoyando a los trabajadores en el acceso, uso y tramitación de reembolsos.</w:t>
       </w:r>
     </w:p>
     <w:p>
       <w:pPr>
-        <w:keepNext/>
-        <w:tabs>
-          <w:tab w:pos="10313" w:val="right"/>
-        </w:tabs>
-        <w:spacing w:before="180" w:after="0" w:line="278" w:lineRule="auto"/>
-        <w:ind w:left="1814"/>
-      </w:pPr>
-      <w:r>
-        <w:rPr>
-          <w:rFonts w:ascii="Cambria" w:hAnsi="Cambria" w:eastAsia="Cambria" w:cs="Cambria"/>
-          <w:b/>
-          <w:i w:val="0"/>
-          <w:color w:val="16181A"/>
-          <w:sz w:val="21"/>
-        </w:rPr>
-        <w:t>Ferretería San Francisco</w:t>
-      </w:r>
-      <w:r>
-        <w:tab/>
-      </w:r>
-      <w:r>
-        <w:rPr>
-          <w:rFonts w:ascii="Calibri" w:hAnsi="Calibri" w:eastAsia="Calibri" w:cs="Calibri"/>
-          <w:b w:val="0"/>
-          <w:i w:val="0"/>
-          <w:color w:val="6C7176"/>
-          <w:sz w:val="17"/>
-          <w:spacing w:val="14"/>
-        </w:rPr>
-        <w:t>Diciembre 2016 – Septiembre 2017</w:t>
-      </w:r>
-    </w:p>
-    <w:p>
-      <w:pPr>
-        <w:keepNext/>
-        <w:spacing w:before="40" w:after="90" w:line="278" w:lineRule="auto"/>
-        <w:ind w:left="1814"/>
-      </w:pPr>
-      <w:r>
-        <w:rPr>
-          <w:rFonts w:ascii="Calibri" w:hAnsi="Calibri" w:eastAsia="Calibri" w:cs="Calibri"/>
-          <w:b w:val="0"/>
-          <w:i w:val="0"/>
-          <w:color w:val="6C7176"/>
-          <w:sz w:val="18"/>
-          <w:spacing w:val="8"/>
-        </w:rPr>
-        <w:t>Encargada · Departamento de Bienestar Social</w:t>
-      </w:r>
-    </w:p>
-    <w:p>
-      <w:pPr>
-        <w:spacing w:before="0" w:after="54" w:line="278" w:lineRule="auto"/>
-        <w:ind w:left="2007" w:hanging="193"/>
+        <w:spacing w:before="0" w:after="88" w:line="278" w:lineRule="auto"/>
+        <w:ind w:left="1837" w:hanging="193"/>
+        <w:jc w:val="both"/>
       </w:pPr>
       <w:r>
         <w:rPr>
           <w:rFonts w:ascii="Cambria" w:hAnsi="Cambria" w:eastAsia="Cambria" w:cs="Cambria"/>
           <w:b w:val="0"/>
-          <w:i w:val="0"/>
-          <w:color w:val="6E2130"/>
-          <w:sz w:val="17"/>
-        </w:rPr>
-        <w:t>•</w:t>
-      </w:r>
-      <w:r>
-        <w:tab/>
-      </w:r>
-      <w:r>
-        <w:rPr>
-          <w:rFonts w:ascii="Cambria" w:hAnsi="Cambria" w:eastAsia="Cambria" w:cs="Cambria"/>
-          <w:b/>
-          <w:i w:val="0"/>
-          <w:color w:val="16181A"/>
-          <w:sz w:val="19"/>
-        </w:rPr>
-        <w:t>Creé desde cero el área de Bienestar Social</w:t>
-      </w:r>
-      <w:r>
-        <w:rPr>
-          <w:rFonts w:ascii="Cambria" w:hAnsi="Cambria" w:eastAsia="Cambria" w:cs="Cambria"/>
-          <w:b w:val="0"/>
-          <w:i w:val="0"/>
-          <w:color w:val="33373B"/>
-          <w:sz w:val="19"/>
-        </w:rPr>
-        <w:t xml:space="preserve"> para una dotación de más de 200 colaboradores, definiendo la planificación de actividades y beneficios.</w:t>
-      </w:r>
-    </w:p>
-    <w:p>
-      <w:pPr>
-        <w:spacing w:before="0" w:after="54" w:line="278" w:lineRule="auto"/>
-        <w:ind w:left="2007" w:hanging="193"/>
-      </w:pPr>
-      <w:r>
-        <w:rPr>
-          <w:rFonts w:ascii="Cambria" w:hAnsi="Cambria" w:eastAsia="Cambria" w:cs="Cambria"/>
-          <w:b w:val="0"/>
-          <w:i w:val="0"/>
           <w:color w:val="6E2130"/>
           <w:sz w:val="17"/>
         </w:rPr>
@@ -1446,43 +1329,40 @@
         <w:rPr>
           <w:rFonts w:ascii="Cambria" w:hAnsi="Cambria" w:eastAsia="Cambria" w:cs="Cambria"/>
           <w:b w:val="0"/>
-          <w:i w:val="0"/>
           <w:color w:val="33373B"/>
           <w:sz w:val="19"/>
         </w:rPr>
-        <w:t xml:space="preserve">Administré el </w:t>
+        <w:t xml:space="preserve">Gestioné </w:t>
       </w:r>
       <w:r>
         <w:rPr>
           <w:rFonts w:ascii="Cambria" w:hAnsi="Cambria" w:eastAsia="Cambria" w:cs="Cambria"/>
           <w:b/>
-          <w:i w:val="0"/>
           <w:color w:val="16181A"/>
           <w:sz w:val="19"/>
         </w:rPr>
-        <w:t>Seguro Complementario de Salud</w:t>
+        <w:t>licencias médicas ante la Caja de Compensación Los Andes</w:t>
       </w:r>
       <w:r>
         <w:rPr>
           <w:rFonts w:ascii="Cambria" w:hAnsi="Cambria" w:eastAsia="Cambria" w:cs="Cambria"/>
           <w:b w:val="0"/>
-          <w:i w:val="0"/>
           <w:color w:val="33373B"/>
           <w:sz w:val="19"/>
         </w:rPr>
-        <w:t xml:space="preserve"> de la dotación, apoyando a los trabajadores en el acceso, uso y tramitación de reembolsos.</w:t>
+        <w:t xml:space="preserve"> y la incorporación de cargas familiares de los trabajadores.</w:t>
       </w:r>
     </w:p>
     <w:p>
       <w:pPr>
-        <w:spacing w:before="0" w:after="54" w:line="278" w:lineRule="auto"/>
-        <w:ind w:left="2007" w:hanging="193"/>
+        <w:spacing w:before="0" w:after="88" w:line="278" w:lineRule="auto"/>
+        <w:ind w:left="1837" w:hanging="193"/>
+        <w:jc w:val="both"/>
       </w:pPr>
       <w:r>
         <w:rPr>
           <w:rFonts w:ascii="Cambria" w:hAnsi="Cambria" w:eastAsia="Cambria" w:cs="Cambria"/>
           <w:b w:val="0"/>
-          <w:i w:val="0"/>
           <w:color w:val="6E2130"/>
           <w:sz w:val="17"/>
         </w:rPr>
@@ -1495,43 +1375,40 @@
         <w:rPr>
           <w:rFonts w:ascii="Cambria" w:hAnsi="Cambria" w:eastAsia="Cambria" w:cs="Cambria"/>
           <w:b w:val="0"/>
-          <w:i w:val="0"/>
           <w:color w:val="33373B"/>
           <w:sz w:val="19"/>
         </w:rPr>
-        <w:t xml:space="preserve">Gestioné </w:t>
+        <w:t xml:space="preserve">Realicé </w:t>
       </w:r>
       <w:r>
         <w:rPr>
           <w:rFonts w:ascii="Cambria" w:hAnsi="Cambria" w:eastAsia="Cambria" w:cs="Cambria"/>
           <w:b/>
-          <w:i w:val="0"/>
           <w:color w:val="16181A"/>
           <w:sz w:val="19"/>
         </w:rPr>
-        <w:t>licencias médicas ante la Caja de Compensación Los Andes</w:t>
+        <w:t>visitas semanales a la segunda sucursal</w:t>
       </w:r>
       <w:r>
         <w:rPr>
           <w:rFonts w:ascii="Cambria" w:hAnsi="Cambria" w:eastAsia="Cambria" w:cs="Cambria"/>
           <w:b w:val="0"/>
-          <w:i w:val="0"/>
           <w:color w:val="33373B"/>
           <w:sz w:val="19"/>
         </w:rPr>
-        <w:t xml:space="preserve"> y la incorporación de cargas familiares de los trabajadores.</w:t>
+        <w:t>, atendiendo en terreno las necesidades de beneficios internos y externos, principalmente en vivienda y salud.</w:t>
       </w:r>
     </w:p>
     <w:p>
       <w:pPr>
-        <w:spacing w:before="0" w:after="54" w:line="278" w:lineRule="auto"/>
-        <w:ind w:left="2007" w:hanging="193"/>
+        <w:spacing w:before="0" w:after="88" w:line="278" w:lineRule="auto"/>
+        <w:ind w:left="1837" w:hanging="193"/>
+        <w:jc w:val="both"/>
       </w:pPr>
       <w:r>
         <w:rPr>
           <w:rFonts w:ascii="Cambria" w:hAnsi="Cambria" w:eastAsia="Cambria" w:cs="Cambria"/>
           <w:b w:val="0"/>
-          <w:i w:val="0"/>
           <w:color w:val="6E2130"/>
           <w:sz w:val="17"/>
         </w:rPr>
@@ -1544,56 +1421,6 @@
         <w:rPr>
           <w:rFonts w:ascii="Cambria" w:hAnsi="Cambria" w:eastAsia="Cambria" w:cs="Cambria"/>
           <w:b w:val="0"/>
-          <w:i w:val="0"/>
-          <w:color w:val="33373B"/>
-          <w:sz w:val="19"/>
-        </w:rPr>
-        <w:t xml:space="preserve">Realicé </w:t>
-      </w:r>
-      <w:r>
-        <w:rPr>
-          <w:rFonts w:ascii="Cambria" w:hAnsi="Cambria" w:eastAsia="Cambria" w:cs="Cambria"/>
-          <w:b/>
-          <w:i w:val="0"/>
-          <w:color w:val="16181A"/>
-          <w:sz w:val="19"/>
-        </w:rPr>
-        <w:t>visitas semanales a la segunda sucursal</w:t>
-      </w:r>
-      <w:r>
-        <w:rPr>
-          <w:rFonts w:ascii="Cambria" w:hAnsi="Cambria" w:eastAsia="Cambria" w:cs="Cambria"/>
-          <w:b w:val="0"/>
-          <w:i w:val="0"/>
-          <w:color w:val="33373B"/>
-          <w:sz w:val="19"/>
-        </w:rPr>
-        <w:t>, atendiendo en terreno las necesidades de beneficios internos y externos, principalmente en vivienda y salud.</w:t>
-      </w:r>
-    </w:p>
-    <w:p>
-      <w:pPr>
-        <w:spacing w:before="0" w:after="54" w:line="278" w:lineRule="auto"/>
-        <w:ind w:left="2007" w:hanging="193"/>
-      </w:pPr>
-      <w:r>
-        <w:rPr>
-          <w:rFonts w:ascii="Cambria" w:hAnsi="Cambria" w:eastAsia="Cambria" w:cs="Cambria"/>
-          <w:b w:val="0"/>
-          <w:i w:val="0"/>
-          <w:color w:val="6E2130"/>
-          <w:sz w:val="17"/>
-        </w:rPr>
-        <w:t>•</w:t>
-      </w:r>
-      <w:r>
-        <w:tab/>
-      </w:r>
-      <w:r>
-        <w:rPr>
-          <w:rFonts w:ascii="Cambria" w:hAnsi="Cambria" w:eastAsia="Cambria" w:cs="Cambria"/>
-          <w:b w:val="0"/>
-          <w:i w:val="0"/>
           <w:color w:val="33373B"/>
           <w:sz w:val="19"/>
         </w:rPr>
@@ -1603,7 +1430,6 @@
         <w:rPr>
           <w:rFonts w:ascii="Cambria" w:hAnsi="Cambria" w:eastAsia="Cambria" w:cs="Cambria"/>
           <w:b/>
-          <w:i w:val="0"/>
           <w:color w:val="16181A"/>
           <w:sz w:val="19"/>
         </w:rPr>
@@ -1613,7 +1439,6 @@
         <w:rPr>
           <w:rFonts w:ascii="Cambria" w:hAnsi="Cambria" w:eastAsia="Cambria" w:cs="Cambria"/>
           <w:b w:val="0"/>
-          <w:i w:val="0"/>
           <w:color w:val="33373B"/>
           <w:sz w:val="19"/>
         </w:rPr>
@@ -1622,72 +1447,22 @@
     </w:p>
     <w:p>
       <w:pPr>
-        <w:spacing w:before="0" w:after="54" w:line="278" w:lineRule="auto"/>
-        <w:ind w:left="2007" w:hanging="193"/>
-      </w:pPr>
-      <w:r>
-        <w:rPr>
-          <w:rFonts w:ascii="Cambria" w:hAnsi="Cambria" w:eastAsia="Cambria" w:cs="Cambria"/>
-          <w:b w:val="0"/>
-          <w:i w:val="0"/>
-          <w:color w:val="6E2130"/>
-          <w:sz w:val="17"/>
-        </w:rPr>
-        <w:t>•</w:t>
-      </w:r>
-      <w:r>
-        <w:tab/>
-      </w:r>
-      <w:r>
-        <w:rPr>
-          <w:rFonts w:ascii="Cambria" w:hAnsi="Cambria" w:eastAsia="Cambria" w:cs="Cambria"/>
-          <w:b w:val="0"/>
-          <w:i w:val="0"/>
-          <w:color w:val="33373B"/>
-          <w:sz w:val="19"/>
-        </w:rPr>
-        <w:t xml:space="preserve">Administré vacaciones, carpetas personales y documentación laboral, y apoyé los </w:t>
-      </w:r>
-      <w:r>
-        <w:rPr>
-          <w:rFonts w:ascii="Cambria" w:hAnsi="Cambria" w:eastAsia="Cambria" w:cs="Cambria"/>
-          <w:b/>
-          <w:i w:val="0"/>
-          <w:color w:val="16181A"/>
-          <w:sz w:val="19"/>
-        </w:rPr>
-        <w:t>procesos administrativos de Recursos Humanos</w:t>
-      </w:r>
-      <w:r>
-        <w:rPr>
-          <w:rFonts w:ascii="Cambria" w:hAnsi="Cambria" w:eastAsia="Cambria" w:cs="Cambria"/>
-          <w:b w:val="0"/>
-          <w:i w:val="0"/>
-          <w:color w:val="33373B"/>
-          <w:sz w:val="19"/>
-        </w:rPr>
-        <w:t>.</w:t>
-      </w:r>
-    </w:p>
-    <w:p>
-      <w:pPr>
         <w:keepNext/>
         <w:tabs>
-          <w:tab w:pos="1814" w:val="left"/>
+          <w:tab w:pos="1644" w:val="left"/>
           <w:tab w:pos="10313" w:val="right"/>
         </w:tabs>
-        <w:spacing w:before="300" w:after="0" w:line="278" w:lineRule="auto"/>
-        <w:ind w:left="1814" w:hanging="1814"/>
+        <w:spacing w:before="520" w:after="0" w:line="278" w:lineRule="auto"/>
+        <w:ind w:left="1644" w:hanging="1644"/>
       </w:pPr>
       <w:r>
         <w:rPr>
           <w:rFonts w:ascii="Calibri" w:hAnsi="Calibri" w:eastAsia="Calibri" w:cs="Calibri"/>
           <w:b/>
-          <w:i w:val="0"/>
           <w:color w:val="6E2130"/>
-          <w:sz w:val="16"/>
+          <w:sz w:val="15"/>
           <w:caps w:val="1"/>
-          <w:spacing w:val="28"/>
+          <w:spacing w:val="20"/>
         </w:rPr>
         <w:t>Formación</w:t>
       </w:r>
@@ -1698,7 +1473,6 @@
         <w:rPr>
           <w:rFonts w:ascii="Cambria" w:hAnsi="Cambria" w:eastAsia="Cambria" w:cs="Cambria"/>
           <w:b/>
-          <w:i w:val="0"/>
           <w:color w:val="16181A"/>
           <w:sz w:val="19"/>
         </w:rPr>
@@ -1711,7 +1485,6 @@
         <w:rPr>
           <w:rFonts w:ascii="Calibri" w:hAnsi="Calibri" w:eastAsia="Calibri" w:cs="Calibri"/>
           <w:b w:val="0"/>
-          <w:i w:val="0"/>
           <w:color w:val="6C7176"/>
           <w:sz w:val="17"/>
           <w:spacing w:val="14"/>
@@ -1721,14 +1494,13 @@
     </w:p>
     <w:p>
       <w:pPr>
-        <w:spacing w:before="20" w:after="0" w:line="278" w:lineRule="auto"/>
-        <w:ind w:left="1814"/>
+        <w:spacing w:before="30" w:after="0" w:line="278" w:lineRule="auto"/>
+        <w:ind w:left="1644"/>
       </w:pPr>
       <w:r>
         <w:rPr>
           <w:rFonts w:ascii="Calibri" w:hAnsi="Calibri" w:eastAsia="Calibri" w:cs="Calibri"/>
           <w:b w:val="0"/>
-          <w:i w:val="0"/>
           <w:color w:val="6C7176"/>
           <w:sz w:val="17"/>
           <w:spacing w:val="8"/>
@@ -1742,14 +1514,13 @@
         <w:tabs>
           <w:tab w:pos="10313" w:val="right"/>
         </w:tabs>
-        <w:spacing w:before="160" w:after="0" w:line="278" w:lineRule="auto"/>
-        <w:ind w:left="1814"/>
+        <w:spacing w:before="300" w:after="0" w:line="278" w:lineRule="auto"/>
+        <w:ind w:left="1644"/>
       </w:pPr>
       <w:r>
         <w:rPr>
           <w:rFonts w:ascii="Cambria" w:hAnsi="Cambria" w:eastAsia="Cambria" w:cs="Cambria"/>
           <w:b/>
-          <w:i w:val="0"/>
           <w:color w:val="16181A"/>
           <w:sz w:val="19"/>
         </w:rPr>
@@ -1762,7 +1533,6 @@
         <w:rPr>
           <w:rFonts w:ascii="Calibri" w:hAnsi="Calibri" w:eastAsia="Calibri" w:cs="Calibri"/>
           <w:b w:val="0"/>
-          <w:i w:val="0"/>
           <w:color w:val="6C7176"/>
           <w:sz w:val="17"/>
           <w:spacing w:val="14"/>
@@ -1772,14 +1542,13 @@
     </w:p>
     <w:p>
       <w:pPr>
-        <w:spacing w:before="20" w:after="0" w:line="278" w:lineRule="auto"/>
-        <w:ind w:left="1814"/>
+        <w:spacing w:before="30" w:after="0" w:line="278" w:lineRule="auto"/>
+        <w:ind w:left="1644"/>
       </w:pPr>
       <w:r>
         <w:rPr>
           <w:rFonts w:ascii="Calibri" w:hAnsi="Calibri" w:eastAsia="Calibri" w:cs="Calibri"/>
           <w:b w:val="0"/>
-          <w:i w:val="0"/>
           <w:color w:val="6C7176"/>
           <w:sz w:val="17"/>
           <w:spacing w:val="8"/>
@@ -1793,14 +1562,13 @@
         <w:tabs>
           <w:tab w:pos="10313" w:val="right"/>
         </w:tabs>
-        <w:spacing w:before="160" w:after="0" w:line="278" w:lineRule="auto"/>
-        <w:ind w:left="1814"/>
+        <w:spacing w:before="300" w:after="0" w:line="278" w:lineRule="auto"/>
+        <w:ind w:left="1644"/>
       </w:pPr>
       <w:r>
         <w:rPr>
           <w:rFonts w:ascii="Cambria" w:hAnsi="Cambria" w:eastAsia="Cambria" w:cs="Cambria"/>
           <w:b/>
-          <w:i w:val="0"/>
           <w:color w:val="16181A"/>
           <w:sz w:val="19"/>
         </w:rPr>
@@ -1813,7 +1581,6 @@
         <w:rPr>
           <w:rFonts w:ascii="Calibri" w:hAnsi="Calibri" w:eastAsia="Calibri" w:cs="Calibri"/>
           <w:b w:val="0"/>
-          <w:i w:val="0"/>
           <w:color w:val="6C7176"/>
           <w:sz w:val="17"/>
           <w:spacing w:val="14"/>
@@ -1823,14 +1590,13 @@
     </w:p>
     <w:p>
       <w:pPr>
-        <w:spacing w:before="20" w:after="0" w:line="278" w:lineRule="auto"/>
-        <w:ind w:left="1814"/>
+        <w:spacing w:before="30" w:after="0" w:line="278" w:lineRule="auto"/>
+        <w:ind w:left="1644"/>
       </w:pPr>
       <w:r>
         <w:rPr>
           <w:rFonts w:ascii="Calibri" w:hAnsi="Calibri" w:eastAsia="Calibri" w:cs="Calibri"/>
           <w:b w:val="0"/>
-          <w:i w:val="0"/>
           <w:color w:val="6C7176"/>
           <w:sz w:val="17"/>
           <w:spacing w:val="8"/>
@@ -1841,21 +1607,21 @@
     <w:p>
       <w:pPr>
         <w:tabs>
-          <w:tab w:pos="1814" w:val="left"/>
-          <w:tab w:pos="2007" w:val="left"/>
+          <w:tab w:pos="1644" w:val="left"/>
+          <w:tab w:pos="1837" w:val="left"/>
         </w:tabs>
-        <w:spacing w:before="300" w:after="0" w:line="278" w:lineRule="auto"/>
-        <w:ind w:left="2007" w:hanging="2007"/>
+        <w:spacing w:before="520" w:after="88" w:line="278" w:lineRule="auto"/>
+        <w:ind w:left="1837" w:hanging="1837"/>
+        <w:jc w:val="both"/>
       </w:pPr>
       <w:r>
         <w:rPr>
           <w:rFonts w:ascii="Calibri" w:hAnsi="Calibri" w:eastAsia="Calibri" w:cs="Calibri"/>
           <w:b/>
-          <w:i w:val="0"/>
           <w:color w:val="6E2130"/>
-          <w:sz w:val="16"/>
+          <w:sz w:val="15"/>
           <w:caps w:val="1"/>
-          <w:spacing w:val="28"/>
+          <w:spacing w:val="20"/>
         </w:rPr>
         <w:t>Certificaciones</w:t>
       </w:r>
@@ -1866,7 +1632,6 @@
         <w:rPr>
           <w:rFonts w:ascii="Cambria" w:hAnsi="Cambria" w:eastAsia="Cambria" w:cs="Cambria"/>
           <w:b w:val="0"/>
-          <w:i w:val="0"/>
           <w:color w:val="6E2130"/>
           <w:sz w:val="17"/>
         </w:rPr>
@@ -1879,7 +1644,6 @@
         <w:rPr>
           <w:rFonts w:ascii="Cambria" w:hAnsi="Cambria" w:eastAsia="Cambria" w:cs="Cambria"/>
           <w:b/>
-          <w:i w:val="0"/>
           <w:color w:val="16181A"/>
           <w:sz w:val="19"/>
         </w:rPr>
@@ -1889,7 +1653,6 @@
         <w:rPr>
           <w:rFonts w:ascii="Cambria" w:hAnsi="Cambria" w:eastAsia="Cambria" w:cs="Cambria"/>
           <w:b w:val="0"/>
-          <w:i w:val="0"/>
           <w:color w:val="33373B"/>
           <w:sz w:val="19"/>
         </w:rPr>
@@ -1898,14 +1661,14 @@
     </w:p>
     <w:p>
       <w:pPr>
-        <w:spacing w:before="0" w:after="54" w:line="278" w:lineRule="auto"/>
-        <w:ind w:left="2007" w:hanging="193"/>
+        <w:spacing w:before="0" w:after="88" w:line="278" w:lineRule="auto"/>
+        <w:ind w:left="1837" w:hanging="193"/>
+        <w:jc w:val="both"/>
       </w:pPr>
       <w:r>
         <w:rPr>
           <w:rFonts w:ascii="Cambria" w:hAnsi="Cambria" w:eastAsia="Cambria" w:cs="Cambria"/>
           <w:b w:val="0"/>
-          <w:i w:val="0"/>
           <w:color w:val="6E2130"/>
           <w:sz w:val="17"/>
         </w:rPr>
@@ -1918,7 +1681,6 @@
         <w:rPr>
           <w:rFonts w:ascii="Cambria" w:hAnsi="Cambria" w:eastAsia="Cambria" w:cs="Cambria"/>
           <w:b/>
-          <w:i w:val="0"/>
           <w:color w:val="16181A"/>
           <w:sz w:val="19"/>
         </w:rPr>
@@ -1928,23 +1690,22 @@
         <w:rPr>
           <w:rFonts w:ascii="Cambria" w:hAnsi="Cambria" w:eastAsia="Cambria" w:cs="Cambria"/>
           <w:b w:val="0"/>
-          <w:i w:val="0"/>
           <w:color w:val="33373B"/>
           <w:sz w:val="19"/>
         </w:rPr>
-        <w:t xml:space="preserve"> — TÜV Rheinland (2019). Respalda la auditoría del Sistema de Gestión Integrado ISO 9001 / 14001 / 45001.</w:t>
+        <w:t xml:space="preserve"> — TÜV Rheinland (2019).</w:t>
       </w:r>
     </w:p>
     <w:p>
       <w:pPr>
-        <w:spacing w:before="0" w:after="54" w:line="278" w:lineRule="auto"/>
-        <w:ind w:left="2007" w:hanging="193"/>
+        <w:spacing w:before="0" w:after="88" w:line="278" w:lineRule="auto"/>
+        <w:ind w:left="1837" w:hanging="193"/>
+        <w:jc w:val="both"/>
       </w:pPr>
       <w:r>
         <w:rPr>
           <w:rFonts w:ascii="Cambria" w:hAnsi="Cambria" w:eastAsia="Cambria" w:cs="Cambria"/>
           <w:b w:val="0"/>
-          <w:i w:val="0"/>
           <w:color w:val="6E2130"/>
           <w:sz w:val="17"/>
         </w:rPr>
@@ -1957,7 +1718,6 @@
         <w:rPr>
           <w:rFonts w:ascii="Cambria" w:hAnsi="Cambria" w:eastAsia="Cambria" w:cs="Cambria"/>
           <w:b/>
-          <w:i w:val="0"/>
           <w:color w:val="16181A"/>
           <w:sz w:val="19"/>
         </w:rPr>
@@ -1967,7 +1727,6 @@
         <w:rPr>
           <w:rFonts w:ascii="Cambria" w:hAnsi="Cambria" w:eastAsia="Cambria" w:cs="Cambria"/>
           <w:b w:val="0"/>
-          <w:i w:val="0"/>
           <w:color w:val="33373B"/>
           <w:sz w:val="19"/>
         </w:rPr>
@@ -1976,14 +1735,14 @@
     </w:p>
     <w:p>
       <w:pPr>
-        <w:spacing w:before="0" w:after="54" w:line="278" w:lineRule="auto"/>
-        <w:ind w:left="2007" w:hanging="193"/>
+        <w:spacing w:before="0" w:after="88" w:line="278" w:lineRule="auto"/>
+        <w:ind w:left="1837" w:hanging="193"/>
+        <w:jc w:val="both"/>
       </w:pPr>
       <w:r>
         <w:rPr>
           <w:rFonts w:ascii="Cambria" w:hAnsi="Cambria" w:eastAsia="Cambria" w:cs="Cambria"/>
           <w:b w:val="0"/>
-          <w:i w:val="0"/>
           <w:color w:val="6E2130"/>
           <w:sz w:val="17"/>
         </w:rPr>
@@ -1996,7 +1755,6 @@
         <w:rPr>
           <w:rFonts w:ascii="Cambria" w:hAnsi="Cambria" w:eastAsia="Cambria" w:cs="Cambria"/>
           <w:b/>
-          <w:i w:val="0"/>
           <w:color w:val="16181A"/>
           <w:sz w:val="19"/>
         </w:rPr>
@@ -2006,7 +1764,6 @@
         <w:rPr>
           <w:rFonts w:ascii="Cambria" w:hAnsi="Cambria" w:eastAsia="Cambria" w:cs="Cambria"/>
           <w:b w:val="0"/>
-          <w:i w:val="0"/>
           <w:color w:val="33373B"/>
           <w:sz w:val="19"/>
         </w:rPr>
@@ -2017,20 +1774,21 @@
       <w:pPr>
         <w:keepNext/>
         <w:tabs>
-          <w:tab w:pos="1814" w:val="left"/>
+          <w:tab w:pos="1644" w:val="left"/>
         </w:tabs>
-        <w:spacing w:before="300" w:after="0" w:line="288" w:lineRule="auto"/>
-        <w:ind w:left="1814" w:hanging="1814"/>
+        <w:spacing w:before="520" w:after="0" w:line="317" w:lineRule="auto"/>
+        <w:ind w:left="1644" w:hanging="1644"/>
+        <w:jc w:val="left"/>
+        <w:suppressAutoHyphens w:val="1"/>
       </w:pPr>
       <w:r>
         <w:rPr>
           <w:rFonts w:ascii="Calibri" w:hAnsi="Calibri" w:eastAsia="Calibri" w:cs="Calibri"/>
           <w:b/>
-          <w:i w:val="0"/>
           <w:color w:val="6E2130"/>
-          <w:sz w:val="16"/>
+          <w:sz w:val="15"/>
           <w:caps w:val="1"/>
-          <w:spacing w:val="28"/>
+          <w:spacing w:val="20"/>
         </w:rPr>
         <w:t>Competencias</w:t>
       </w:r>
@@ -2041,7 +1799,6 @@
         <w:rPr>
           <w:rFonts w:ascii="Cambria" w:hAnsi="Cambria" w:eastAsia="Cambria" w:cs="Cambria"/>
           <w:b w:val="0"/>
-          <w:i w:val="0"/>
           <w:color w:val="33373B"/>
           <w:sz w:val="17"/>
         </w:rPr>
@@ -2051,7 +1808,6 @@
         <w:rPr>
           <w:rFonts w:ascii="Cambria" w:hAnsi="Cambria" w:eastAsia="Cambria" w:cs="Cambria"/>
           <w:b w:val="0"/>
-          <w:i w:val="0"/>
           <w:color w:val="A8ADB2"/>
           <w:sz w:val="17"/>
         </w:rPr>
@@ -2061,7 +1817,6 @@
         <w:rPr>
           <w:rFonts w:ascii="Cambria" w:hAnsi="Cambria" w:eastAsia="Cambria" w:cs="Cambria"/>
           <w:b w:val="0"/>
-          <w:i w:val="0"/>
           <w:color w:val="33373B"/>
           <w:sz w:val="17"/>
         </w:rPr>
@@ -2071,7 +1826,6 @@
         <w:rPr>
           <w:rFonts w:ascii="Cambria" w:hAnsi="Cambria" w:eastAsia="Cambria" w:cs="Cambria"/>
           <w:b w:val="0"/>
-          <w:i w:val="0"/>
           <w:color w:val="A8ADB2"/>
           <w:sz w:val="17"/>
         </w:rPr>
@@ -2081,7 +1835,6 @@
         <w:rPr>
           <w:rFonts w:ascii="Cambria" w:hAnsi="Cambria" w:eastAsia="Cambria" w:cs="Cambria"/>
           <w:b w:val="0"/>
-          <w:i w:val="0"/>
           <w:color w:val="33373B"/>
           <w:sz w:val="17"/>
         </w:rPr>
@@ -2091,7 +1844,6 @@
         <w:rPr>
           <w:rFonts w:ascii="Cambria" w:hAnsi="Cambria" w:eastAsia="Cambria" w:cs="Cambria"/>
           <w:b w:val="0"/>
-          <w:i w:val="0"/>
           <w:color w:val="A8ADB2"/>
           <w:sz w:val="17"/>
         </w:rPr>
@@ -2101,7 +1853,6 @@
         <w:rPr>
           <w:rFonts w:ascii="Cambria" w:hAnsi="Cambria" w:eastAsia="Cambria" w:cs="Cambria"/>
           <w:b w:val="0"/>
-          <w:i w:val="0"/>
           <w:color w:val="33373B"/>
           <w:sz w:val="17"/>
         </w:rPr>
@@ -2111,7 +1862,6 @@
         <w:rPr>
           <w:rFonts w:ascii="Cambria" w:hAnsi="Cambria" w:eastAsia="Cambria" w:cs="Cambria"/>
           <w:b w:val="0"/>
-          <w:i w:val="0"/>
           <w:color w:val="A8ADB2"/>
           <w:sz w:val="17"/>
         </w:rPr>
@@ -2121,7 +1871,6 @@
         <w:rPr>
           <w:rFonts w:ascii="Cambria" w:hAnsi="Cambria" w:eastAsia="Cambria" w:cs="Cambria"/>
           <w:b w:val="0"/>
-          <w:i w:val="0"/>
           <w:color w:val="33373B"/>
           <w:sz w:val="17"/>
         </w:rPr>
@@ -2131,7 +1880,6 @@
         <w:rPr>
           <w:rFonts w:ascii="Cambria" w:hAnsi="Cambria" w:eastAsia="Cambria" w:cs="Cambria"/>
           <w:b w:val="0"/>
-          <w:i w:val="0"/>
           <w:color w:val="A8ADB2"/>
           <w:sz w:val="17"/>
         </w:rPr>
@@ -2141,7 +1889,6 @@
         <w:rPr>
           <w:rFonts w:ascii="Cambria" w:hAnsi="Cambria" w:eastAsia="Cambria" w:cs="Cambria"/>
           <w:b w:val="0"/>
-          <w:i w:val="0"/>
           <w:color w:val="33373B"/>
           <w:sz w:val="17"/>
         </w:rPr>
@@ -2151,7 +1898,6 @@
         <w:rPr>
           <w:rFonts w:ascii="Cambria" w:hAnsi="Cambria" w:eastAsia="Cambria" w:cs="Cambria"/>
           <w:b w:val="0"/>
-          <w:i w:val="0"/>
           <w:color w:val="A8ADB2"/>
           <w:sz w:val="17"/>
         </w:rPr>
@@ -2161,71 +1907,30 @@
         <w:rPr>
           <w:rFonts w:ascii="Cambria" w:hAnsi="Cambria" w:eastAsia="Cambria" w:cs="Cambria"/>
           <w:b w:val="0"/>
-          <w:i w:val="0"/>
-          <w:color w:val="33373B"/>
-          <w:sz w:val="17"/>
-        </w:rPr>
-        <w:t>Manejo de conflictos</w:t>
-      </w:r>
-      <w:r>
-        <w:rPr>
-          <w:rFonts w:ascii="Cambria" w:hAnsi="Cambria" w:eastAsia="Cambria" w:cs="Cambria"/>
-          <w:b w:val="0"/>
-          <w:i w:val="0"/>
-          <w:color w:val="A8ADB2"/>
-          <w:sz w:val="17"/>
-        </w:rPr>
-        <w:t xml:space="preserve">  ·  </w:t>
-      </w:r>
-      <w:r>
-        <w:rPr>
-          <w:rFonts w:ascii="Cambria" w:hAnsi="Cambria" w:eastAsia="Cambria" w:cs="Cambria"/>
-          <w:b w:val="0"/>
-          <w:i w:val="0"/>
           <w:color w:val="33373B"/>
           <w:sz w:val="17"/>
         </w:rPr>
         <w:t>Proactividad y aporte al clima laboral</w:t>
-      </w:r>
-      <w:r>
-        <w:rPr>
-          <w:rFonts w:ascii="Cambria" w:hAnsi="Cambria" w:eastAsia="Cambria" w:cs="Cambria"/>
-          <w:b w:val="0"/>
-          <w:i w:val="0"/>
-          <w:color w:val="A8ADB2"/>
-          <w:sz w:val="17"/>
-        </w:rPr>
-        <w:t xml:space="preserve">  ·  </w:t>
-      </w:r>
-      <w:r>
-        <w:rPr>
-          <w:rFonts w:ascii="Cambria" w:hAnsi="Cambria" w:eastAsia="Cambria" w:cs="Cambria"/>
-          <w:b w:val="0"/>
-          <w:i w:val="0"/>
-          <w:color w:val="33373B"/>
-          <w:sz w:val="17"/>
-        </w:rPr>
-        <w:t>Rigurosidad administrativa y normativa</w:t>
       </w:r>
     </w:p>
     <w:p>
       <w:pPr>
         <w:keepNext/>
         <w:tabs>
-          <w:tab w:pos="1814" w:val="left"/>
+          <w:tab w:pos="1644" w:val="left"/>
         </w:tabs>
-        <w:spacing w:before="300" w:after="0" w:line="278" w:lineRule="auto"/>
-        <w:ind w:left="1814" w:hanging="1814"/>
+        <w:spacing w:before="440" w:after="0" w:line="278" w:lineRule="auto"/>
+        <w:ind w:left="1644" w:hanging="1644"/>
+        <w:jc w:val="both"/>
       </w:pPr>
       <w:r>
         <w:rPr>
           <w:rFonts w:ascii="Calibri" w:hAnsi="Calibri" w:eastAsia="Calibri" w:cs="Calibri"/>
           <w:b/>
-          <w:i w:val="0"/>
           <w:color w:val="6E2130"/>
-          <w:sz w:val="16"/>
+          <w:sz w:val="15"/>
           <w:caps w:val="1"/>
-          <w:spacing w:val="28"/>
+          <w:spacing w:val="20"/>
         </w:rPr>
         <w:t>Herramientas</w:t>
       </w:r>
@@ -2236,7 +1941,6 @@
         <w:rPr>
           <w:rFonts w:ascii="Cambria" w:hAnsi="Cambria" w:eastAsia="Cambria" w:cs="Cambria"/>
           <w:b w:val="0"/>
-          <w:i w:val="0"/>
           <w:color w:val="33373B"/>
           <w:sz w:val="19"/>
         </w:rPr>
@@ -2247,20 +1951,20 @@
       <w:pPr>
         <w:keepNext/>
         <w:tabs>
-          <w:tab w:pos="1814" w:val="left"/>
+          <w:tab w:pos="1644" w:val="left"/>
         </w:tabs>
-        <w:spacing w:before="200" w:after="0" w:line="278" w:lineRule="auto"/>
-        <w:ind w:left="1814" w:hanging="1814"/>
+        <w:spacing w:before="360" w:after="0" w:line="278" w:lineRule="auto"/>
+        <w:ind w:left="1644" w:hanging="1644"/>
+        <w:jc w:val="both"/>
       </w:pPr>
       <w:r>
         <w:rPr>
           <w:rFonts w:ascii="Calibri" w:hAnsi="Calibri" w:eastAsia="Calibri" w:cs="Calibri"/>
           <w:b/>
-          <w:i w:val="0"/>
           <w:color w:val="6E2130"/>
-          <w:sz w:val="16"/>
+          <w:sz w:val="15"/>
           <w:caps w:val="1"/>
-          <w:spacing w:val="28"/>
+          <w:spacing w:val="20"/>
         </w:rPr>
         <w:t>Disponibilidad</w:t>
       </w:r>
@@ -2271,7 +1975,6 @@
         <w:rPr>
           <w:rFonts w:ascii="Cambria" w:hAnsi="Cambria" w:eastAsia="Cambria" w:cs="Cambria"/>
           <w:b w:val="0"/>
-          <w:i w:val="0"/>
           <w:color w:val="33373B"/>
           <w:sz w:val="19"/>
         </w:rPr>
@@ -2280,7 +1983,7 @@
     </w:p>
     <w:sectPr>
       <w:pgSz w:w="12240" w:h="15840"/>
-      <w:pgMar w:top="850" w:right="907" w:bottom="765" w:left="1020" w:header="720" w:footer="720" w:gutter="0"/>
+      <w:pgMar w:top="709" w:right="907" w:bottom="652" w:left="1020" w:header="720" w:footer="720" w:gutter="0"/>
       <w:cols w:space="720"/>
       <w:docGrid w:linePitch="360"/>
     </w:sectPr>
@@ -2658,6 +2361,7 @@
       <w:rFonts w:ascii="Cambria" w:hAnsi="Cambria" w:eastAsia="Cambria"/>
       <w:color w:val="33373B"/>
       <w:sz w:val="19"/>
+      <w:lang w:val="es-CL"/>
     </w:rPr>
   </w:style>
   <w:style w:type="paragraph" w:styleId="Header">

</xml_diff>

<commit_message>
Unifica el nombre del departamento y elimina la frase repetida
- Ferreteria San Francisco: "Cree desde cero el area de Bienestar Social"
  pasa a "Cree el departamento desde cero". Evita repetir la misma frase
  del perfil y unifica la nomenclatura con el cargo declarado
  (Encargada - Departamento de Bienestar Social).
- Se mantiene la primera persona en todo el CV: presente para el cargo
  actual, preterito para los anteriores.

La version editorial recibe ademas el blindaje de paginacion de las tres
variantes: salto explicito antes de Fondo Esperanza y holgura al pie de
la pagina 1 por sobre el minimo de 2,4 cm.

Holgura pagina 1: editorial 2,44 | Minimal 2,43 | Banda 2,62 | Sidebar 2,46

Co-Authored-By: Claude Opus 5 <noreply@anthropic.com>
Claude-Session: https://claude.ai/code/session_01FQzQFNEQJbZhUnuA1Gqnqx
</commit_message>
<xml_diff>
--- a/cv-trabajador-social-uc/CV_Jeniffer_Mieres_Contreras_Trabajadora_Social_UC.docx
+++ b/cv-trabajador-social-uc/CV_Jeniffer_Mieres_Contreras_Trabajadora_Social_UC.docx
@@ -4,7 +4,7 @@
   <w:body>
     <w:p>
       <w:pPr>
-        <w:spacing w:before="0" w:after="60" w:line="278" w:lineRule="auto"/>
+        <w:spacing w:before="0" w:after="60" w:line="271" w:lineRule="auto"/>
       </w:pPr>
       <w:r>
         <w:rPr>
@@ -19,7 +19,7 @@
     </w:p>
     <w:p>
       <w:pPr>
-        <w:spacing w:before="0" w:after="80" w:line="278" w:lineRule="auto"/>
+        <w:spacing w:before="0" w:after="80" w:line="271" w:lineRule="auto"/>
       </w:pPr>
       <w:r>
         <w:rPr>
@@ -53,7 +53,7 @@
     </w:p>
     <w:p>
       <w:pPr>
-        <w:spacing w:before="0" w:after="0" w:line="278" w:lineRule="auto"/>
+        <w:spacing w:before="0" w:after="0" w:line="271" w:lineRule="auto"/>
         <w:pBdr>
           <w:bottom w:val="single" w:sz="4" w:space="7" w:color="6E2130"/>
         </w:pBdr>
@@ -113,7 +113,7 @@
         <w:tabs>
           <w:tab w:pos="1644" w:val="left"/>
         </w:tabs>
-        <w:spacing w:before="280" w:after="0" w:line="283" w:lineRule="auto"/>
+        <w:spacing w:before="280" w:after="0" w:line="278" w:lineRule="auto"/>
         <w:ind w:left="1644" w:hanging="1644"/>
         <w:jc w:val="both"/>
       </w:pPr>
@@ -143,7 +143,7 @@
     </w:p>
     <w:p>
       <w:pPr>
-        <w:spacing w:before="100" w:after="0" w:line="283" w:lineRule="auto"/>
+        <w:spacing w:before="80" w:after="0" w:line="278" w:lineRule="auto"/>
         <w:ind w:left="1644"/>
         <w:jc w:val="both"/>
       </w:pPr>
@@ -159,7 +159,7 @@
     </w:p>
     <w:p>
       <w:pPr>
-        <w:spacing w:before="100" w:after="0" w:line="283" w:lineRule="auto"/>
+        <w:spacing w:before="80" w:after="0" w:line="278" w:lineRule="auto"/>
         <w:ind w:left="1644"/>
         <w:jc w:val="both"/>
       </w:pPr>
@@ -179,7 +179,7 @@
         <w:tabs>
           <w:tab w:pos="1644" w:val="left"/>
         </w:tabs>
-        <w:spacing w:before="260" w:after="0" w:line="317" w:lineRule="auto"/>
+        <w:spacing w:before="260" w:after="0" w:line="298" w:lineRule="auto"/>
         <w:ind w:left="1644" w:hanging="1644"/>
         <w:jc w:val="left"/>
         <w:suppressAutoHyphens w:val="1"/>
@@ -431,7 +431,7 @@
           <w:tab w:pos="1644" w:val="left"/>
           <w:tab w:pos="10313" w:val="right"/>
         </w:tabs>
-        <w:spacing w:before="320" w:after="0" w:line="278" w:lineRule="auto"/>
+        <w:spacing w:before="320" w:after="0" w:line="271" w:lineRule="auto"/>
         <w:ind w:left="1644" w:hanging="1644"/>
       </w:pPr>
       <w:r>
@@ -474,7 +474,7 @@
     <w:p>
       <w:pPr>
         <w:keepNext/>
-        <w:spacing w:before="40" w:after="80" w:line="278" w:lineRule="auto"/>
+        <w:spacing w:before="40" w:after="80" w:line="271" w:lineRule="auto"/>
         <w:ind w:left="1644"/>
       </w:pPr>
       <w:r>
@@ -490,7 +490,7 @@
     </w:p>
     <w:p>
       <w:pPr>
-        <w:spacing w:before="0" w:after="88" w:line="278" w:lineRule="auto"/>
+        <w:spacing w:before="0" w:after="54" w:line="271" w:lineRule="auto"/>
         <w:ind w:left="1837" w:hanging="193"/>
         <w:jc w:val="both"/>
       </w:pPr>
@@ -536,7 +536,7 @@
     </w:p>
     <w:p>
       <w:pPr>
-        <w:spacing w:before="0" w:after="88" w:line="278" w:lineRule="auto"/>
+        <w:spacing w:before="0" w:after="54" w:line="271" w:lineRule="auto"/>
         <w:ind w:left="1837" w:hanging="193"/>
         <w:jc w:val="both"/>
       </w:pPr>
@@ -582,7 +582,7 @@
     </w:p>
     <w:p>
       <w:pPr>
-        <w:spacing w:before="0" w:after="88" w:line="278" w:lineRule="auto"/>
+        <w:spacing w:before="0" w:after="54" w:line="271" w:lineRule="auto"/>
         <w:ind w:left="1837" w:hanging="193"/>
         <w:jc w:val="both"/>
       </w:pPr>
@@ -628,7 +628,7 @@
     </w:p>
     <w:p>
       <w:pPr>
-        <w:spacing w:before="0" w:after="88" w:line="278" w:lineRule="auto"/>
+        <w:spacing w:before="0" w:after="54" w:line="271" w:lineRule="auto"/>
         <w:ind w:left="1837" w:hanging="193"/>
         <w:jc w:val="both"/>
       </w:pPr>
@@ -665,7 +665,7 @@
     </w:p>
     <w:p>
       <w:pPr>
-        <w:spacing w:before="0" w:after="88" w:line="278" w:lineRule="auto"/>
+        <w:spacing w:before="0" w:after="54" w:line="271" w:lineRule="auto"/>
         <w:ind w:left="1837" w:hanging="193"/>
         <w:jc w:val="both"/>
       </w:pPr>
@@ -715,7 +715,7 @@
         <w:tabs>
           <w:tab w:pos="10313" w:val="right"/>
         </w:tabs>
-        <w:spacing w:before="210" w:after="0" w:line="278" w:lineRule="auto"/>
+        <w:spacing w:before="210" w:after="0" w:line="271" w:lineRule="auto"/>
         <w:ind w:left="1644"/>
       </w:pPr>
       <w:r>
@@ -744,7 +744,7 @@
     <w:p>
       <w:pPr>
         <w:keepNext/>
-        <w:spacing w:before="40" w:after="80" w:line="278" w:lineRule="auto"/>
+        <w:spacing w:before="40" w:after="80" w:line="271" w:lineRule="auto"/>
         <w:ind w:left="1644"/>
       </w:pPr>
       <w:r>
@@ -760,7 +760,7 @@
     </w:p>
     <w:p>
       <w:pPr>
-        <w:spacing w:before="0" w:after="88" w:line="278" w:lineRule="auto"/>
+        <w:spacing w:before="0" w:after="54" w:line="271" w:lineRule="auto"/>
         <w:ind w:left="1837" w:hanging="193"/>
         <w:jc w:val="both"/>
       </w:pPr>
@@ -806,7 +806,7 @@
     </w:p>
     <w:p>
       <w:pPr>
-        <w:spacing w:before="0" w:after="88" w:line="278" w:lineRule="auto"/>
+        <w:spacing w:before="0" w:after="54" w:line="271" w:lineRule="auto"/>
         <w:ind w:left="1837" w:hanging="193"/>
         <w:jc w:val="both"/>
       </w:pPr>
@@ -852,7 +852,7 @@
     </w:p>
     <w:p>
       <w:pPr>
-        <w:spacing w:before="0" w:after="88" w:line="278" w:lineRule="auto"/>
+        <w:spacing w:before="0" w:after="54" w:line="271" w:lineRule="auto"/>
         <w:ind w:left="1837" w:hanging="193"/>
         <w:jc w:val="both"/>
       </w:pPr>
@@ -898,7 +898,7 @@
     </w:p>
     <w:p>
       <w:pPr>
-        <w:spacing w:before="0" w:after="88" w:line="278" w:lineRule="auto"/>
+        <w:spacing w:before="0" w:after="54" w:line="271" w:lineRule="auto"/>
         <w:ind w:left="1837" w:hanging="193"/>
         <w:jc w:val="both"/>
       </w:pPr>
@@ -944,7 +944,7 @@
     </w:p>
     <w:p>
       <w:pPr>
-        <w:spacing w:before="0" w:after="88" w:line="278" w:lineRule="auto"/>
+        <w:spacing w:before="0" w:after="54" w:line="271" w:lineRule="auto"/>
         <w:ind w:left="1837" w:hanging="193"/>
         <w:jc w:val="both"/>
       </w:pPr>
@@ -990,7 +990,7 @@
     </w:p>
     <w:p>
       <w:pPr>
-        <w:spacing w:before="0" w:after="88" w:line="278" w:lineRule="auto"/>
+        <w:spacing w:before="0" w:after="54" w:line="271" w:lineRule="auto"/>
         <w:ind w:left="1837" w:hanging="193"/>
         <w:jc w:val="both"/>
       </w:pPr>
@@ -1037,10 +1037,11 @@
     <w:p>
       <w:pPr>
         <w:keepNext/>
+        <w:pageBreakBefore/>
         <w:tabs>
           <w:tab w:pos="10313" w:val="right"/>
         </w:tabs>
-        <w:spacing w:before="320" w:after="0" w:line="278" w:lineRule="auto"/>
+        <w:spacing w:before="320" w:after="0" w:line="271" w:lineRule="auto"/>
         <w:ind w:left="1644"/>
       </w:pPr>
       <w:r>
@@ -1069,7 +1070,7 @@
     <w:p>
       <w:pPr>
         <w:keepNext/>
-        <w:spacing w:before="40" w:after="80" w:line="278" w:lineRule="auto"/>
+        <w:spacing w:before="40" w:after="80" w:line="271" w:lineRule="auto"/>
         <w:ind w:left="1644"/>
       </w:pPr>
       <w:r>
@@ -1085,7 +1086,7 @@
     </w:p>
     <w:p>
       <w:pPr>
-        <w:spacing w:before="0" w:after="88" w:line="278" w:lineRule="auto"/>
+        <w:spacing w:before="0" w:after="54" w:line="271" w:lineRule="auto"/>
         <w:ind w:left="1837" w:hanging="193"/>
         <w:jc w:val="both"/>
       </w:pPr>
@@ -1131,7 +1132,7 @@
     </w:p>
     <w:p>
       <w:pPr>
-        <w:spacing w:before="0" w:after="88" w:line="278" w:lineRule="auto"/>
+        <w:spacing w:before="0" w:after="54" w:line="271" w:lineRule="auto"/>
         <w:ind w:left="1837" w:hanging="193"/>
         <w:jc w:val="both"/>
       </w:pPr>
@@ -1181,7 +1182,7 @@
         <w:tabs>
           <w:tab w:pos="10313" w:val="right"/>
         </w:tabs>
-        <w:spacing w:before="360" w:after="0" w:line="278" w:lineRule="auto"/>
+        <w:spacing w:before="360" w:after="0" w:line="271" w:lineRule="auto"/>
         <w:ind w:left="1644"/>
       </w:pPr>
       <w:r>
@@ -1210,7 +1211,7 @@
     <w:p>
       <w:pPr>
         <w:keepNext/>
-        <w:spacing w:before="40" w:after="80" w:line="278" w:lineRule="auto"/>
+        <w:spacing w:before="40" w:after="80" w:line="271" w:lineRule="auto"/>
         <w:ind w:left="1644"/>
       </w:pPr>
       <w:r>
@@ -1226,7 +1227,7 @@
     </w:p>
     <w:p>
       <w:pPr>
-        <w:spacing w:before="0" w:after="88" w:line="278" w:lineRule="auto"/>
+        <w:spacing w:before="0" w:after="54" w:line="271" w:lineRule="auto"/>
         <w:ind w:left="1837" w:hanging="193"/>
         <w:jc w:val="both"/>
       </w:pPr>
@@ -1249,7 +1250,7 @@
           <w:color w:val="16181A"/>
           <w:sz w:val="19"/>
         </w:rPr>
-        <w:t>Creé desde cero el área de Bienestar Social</w:t>
+        <w:t>Creé el departamento desde cero</w:t>
       </w:r>
       <w:r>
         <w:rPr>
@@ -1263,7 +1264,7 @@
     </w:p>
     <w:p>
       <w:pPr>
-        <w:spacing w:before="0" w:after="88" w:line="278" w:lineRule="auto"/>
+        <w:spacing w:before="0" w:after="54" w:line="271" w:lineRule="auto"/>
         <w:ind w:left="1837" w:hanging="193"/>
         <w:jc w:val="both"/>
       </w:pPr>
@@ -1309,7 +1310,7 @@
     </w:p>
     <w:p>
       <w:pPr>
-        <w:spacing w:before="0" w:after="88" w:line="278" w:lineRule="auto"/>
+        <w:spacing w:before="0" w:after="54" w:line="271" w:lineRule="auto"/>
         <w:ind w:left="1837" w:hanging="193"/>
         <w:jc w:val="both"/>
       </w:pPr>
@@ -1355,7 +1356,7 @@
     </w:p>
     <w:p>
       <w:pPr>
-        <w:spacing w:before="0" w:after="88" w:line="278" w:lineRule="auto"/>
+        <w:spacing w:before="0" w:after="54" w:line="271" w:lineRule="auto"/>
         <w:ind w:left="1837" w:hanging="193"/>
         <w:jc w:val="both"/>
       </w:pPr>
@@ -1401,7 +1402,7 @@
     </w:p>
     <w:p>
       <w:pPr>
-        <w:spacing w:before="0" w:after="88" w:line="278" w:lineRule="auto"/>
+        <w:spacing w:before="0" w:after="54" w:line="271" w:lineRule="auto"/>
         <w:ind w:left="1837" w:hanging="193"/>
         <w:jc w:val="both"/>
       </w:pPr>
@@ -1452,7 +1453,7 @@
           <w:tab w:pos="1644" w:val="left"/>
           <w:tab w:pos="10313" w:val="right"/>
         </w:tabs>
-        <w:spacing w:before="520" w:after="0" w:line="278" w:lineRule="auto"/>
+        <w:spacing w:before="520" w:after="0" w:line="271" w:lineRule="auto"/>
         <w:ind w:left="1644" w:hanging="1644"/>
       </w:pPr>
       <w:r>
@@ -1494,7 +1495,7 @@
     </w:p>
     <w:p>
       <w:pPr>
-        <w:spacing w:before="30" w:after="0" w:line="278" w:lineRule="auto"/>
+        <w:spacing w:before="30" w:after="0" w:line="271" w:lineRule="auto"/>
         <w:ind w:left="1644"/>
       </w:pPr>
       <w:r>
@@ -1514,7 +1515,7 @@
         <w:tabs>
           <w:tab w:pos="10313" w:val="right"/>
         </w:tabs>
-        <w:spacing w:before="300" w:after="0" w:line="278" w:lineRule="auto"/>
+        <w:spacing w:before="300" w:after="0" w:line="271" w:lineRule="auto"/>
         <w:ind w:left="1644"/>
       </w:pPr>
       <w:r>
@@ -1542,7 +1543,7 @@
     </w:p>
     <w:p>
       <w:pPr>
-        <w:spacing w:before="30" w:after="0" w:line="278" w:lineRule="auto"/>
+        <w:spacing w:before="30" w:after="0" w:line="271" w:lineRule="auto"/>
         <w:ind w:left="1644"/>
       </w:pPr>
       <w:r>
@@ -1562,7 +1563,7 @@
         <w:tabs>
           <w:tab w:pos="10313" w:val="right"/>
         </w:tabs>
-        <w:spacing w:before="300" w:after="0" w:line="278" w:lineRule="auto"/>
+        <w:spacing w:before="300" w:after="0" w:line="271" w:lineRule="auto"/>
         <w:ind w:left="1644"/>
       </w:pPr>
       <w:r>
@@ -1590,7 +1591,7 @@
     </w:p>
     <w:p>
       <w:pPr>
-        <w:spacing w:before="30" w:after="0" w:line="278" w:lineRule="auto"/>
+        <w:spacing w:before="30" w:after="0" w:line="271" w:lineRule="auto"/>
         <w:ind w:left="1644"/>
       </w:pPr>
       <w:r>
@@ -1610,7 +1611,7 @@
           <w:tab w:pos="1644" w:val="left"/>
           <w:tab w:pos="1837" w:val="left"/>
         </w:tabs>
-        <w:spacing w:before="520" w:after="88" w:line="278" w:lineRule="auto"/>
+        <w:spacing w:before="520" w:after="54" w:line="271" w:lineRule="auto"/>
         <w:ind w:left="1837" w:hanging="1837"/>
         <w:jc w:val="both"/>
       </w:pPr>
@@ -1661,7 +1662,7 @@
     </w:p>
     <w:p>
       <w:pPr>
-        <w:spacing w:before="0" w:after="88" w:line="278" w:lineRule="auto"/>
+        <w:spacing w:before="0" w:after="54" w:line="271" w:lineRule="auto"/>
         <w:ind w:left="1837" w:hanging="193"/>
         <w:jc w:val="both"/>
       </w:pPr>
@@ -1698,7 +1699,7 @@
     </w:p>
     <w:p>
       <w:pPr>
-        <w:spacing w:before="0" w:after="88" w:line="278" w:lineRule="auto"/>
+        <w:spacing w:before="0" w:after="54" w:line="271" w:lineRule="auto"/>
         <w:ind w:left="1837" w:hanging="193"/>
         <w:jc w:val="both"/>
       </w:pPr>
@@ -1735,7 +1736,7 @@
     </w:p>
     <w:p>
       <w:pPr>
-        <w:spacing w:before="0" w:after="88" w:line="278" w:lineRule="auto"/>
+        <w:spacing w:before="0" w:after="54" w:line="271" w:lineRule="auto"/>
         <w:ind w:left="1837" w:hanging="193"/>
         <w:jc w:val="both"/>
       </w:pPr>
@@ -1776,7 +1777,7 @@
         <w:tabs>
           <w:tab w:pos="1644" w:val="left"/>
         </w:tabs>
-        <w:spacing w:before="520" w:after="0" w:line="317" w:lineRule="auto"/>
+        <w:spacing w:before="520" w:after="0" w:line="298" w:lineRule="auto"/>
         <w:ind w:left="1644" w:hanging="1644"/>
         <w:jc w:val="left"/>
         <w:suppressAutoHyphens w:val="1"/>
@@ -1919,7 +1920,7 @@
         <w:tabs>
           <w:tab w:pos="1644" w:val="left"/>
         </w:tabs>
-        <w:spacing w:before="440" w:after="0" w:line="278" w:lineRule="auto"/>
+        <w:spacing w:before="440" w:after="0" w:line="271" w:lineRule="auto"/>
         <w:ind w:left="1644" w:hanging="1644"/>
         <w:jc w:val="both"/>
       </w:pPr>
@@ -1953,7 +1954,7 @@
         <w:tabs>
           <w:tab w:pos="1644" w:val="left"/>
         </w:tabs>
-        <w:spacing w:before="360" w:after="0" w:line="278" w:lineRule="auto"/>
+        <w:spacing w:before="360" w:after="0" w:line="271" w:lineRule="auto"/>
         <w:ind w:left="1644" w:hanging="1644"/>
         <w:jc w:val="both"/>
       </w:pPr>
@@ -2355,7 +2356,7 @@
     <w:qFormat/>
     <w:rsid w:val="00FC693F"/>
     <w:pPr>
-      <w:spacing w:before="0" w:after="0" w:line="278" w:lineRule="auto"/>
+      <w:spacing w:before="0" w:after="0" w:line="271" w:lineRule="auto"/>
     </w:pPr>
     <w:rPr>
       <w:rFonts w:ascii="Cambria" w:hAnsi="Cambria" w:eastAsia="Cambria"/>

</xml_diff>